<commit_message>
docs: perbarui PRD, ERD, Use Case, Flowchart, dan Activity Diagram sesuai arsitektur Node.js & Gemini AI
</commit_message>
<xml_diff>
--- a/PRD_AgriBuddy_Capstone.docx
+++ b/PRD_AgriBuddy_Capstone.docx
@@ -395,55 +395,25 @@
         <w:t>Visi Produk:</w:t>
       </w:r>
       <w:r>
-        <w:t xml:space="preserve"> Menghadirkan ekosistem digital pertanian terpadu yang memberdayakan seluruh pelaku usahatani (pemilik sawah, penggarap, penyedia traktor, pengairan pompa, buruh tani, kios saprotan, hingga penggilingan padi) melalui perencanaan usahatani berbasis AI, kemitraan bagi hasil kolaboratif, marketplace layanan dengan in-app checkout, pelacakan transaksi real-time, dan ruang diskusi interaktif.</w:t>
-      </w:r>
-    </w:p>
-    <w:p>
-      <w:pPr>
-        <w:pStyle w:val="ListBullet"/>
-        <w:spacing w:before="20" w:after="40" w:line="276" w:lineRule="auto"/>
-      </w:pPr>
-      <w:r>
-        <w:rPr>
-          <w:i/>
-        </w:rPr>
+        <w:t xml:space="preserve"> Menghadirkan platform </w:t>
       </w:r>
       <w:r>
         <w:rPr>
           <w:i/>
         </w:rPr>
-        <w:t>Paradigma Pengguna Baru (</w:t>
+        <w:t>Smart Farming Decision Support System (DSS)</w:t>
       </w:r>
       <w:r>
-        <w:t>Ecosystem-First</w:t>
-      </w:r>
-      <w:r>
-        <w:rPr>
-          <w:i/>
-        </w:rPr>
-        <w:t>):</w:t>
-      </w:r>
-      <w:r>
-        <w:rPr>
-          <w:i/>
-        </w:rPr>
-      </w:r>
-    </w:p>
-    <w:p>
-      <w:pPr>
-        <w:spacing w:before="20" w:after="80" w:line="276" w:lineRule="auto"/>
-      </w:pPr>
-      <w:r>
-        <w:t xml:space="preserve">Aplikasi tidak lagi mengelompokkan pengguna secara kaku menjadi petani, agen, atau distributor. Semua pengguna diposisikan setara sebagai </w:t>
+        <w:t xml:space="preserve"> terpadu pendamping petani padi untuk manajemen petak lahan geospasial, perencanaan anggaran biaya dan jadwal tanam berbasis AI (Smart Farm Planner), deteksi dini fitopatologi daun padi berbasis Computer Vision (</w:t>
       </w:r>
       <w:r>
         <w:rPr>
           <w:b/>
         </w:rPr>
-        <w:t>Warga Ekosistem AgriBuddy</w:t>
+        <w:t>Google Gemini 2.5 Flash Multimodal Vision</w:t>
       </w:r>
       <w:r>
-        <w:t xml:space="preserve"> dengan peran dan spesialisasi masing-masing (jasa cangkul, sewa traktor, irigasi pompa, penggilingan gabah, saprotan, dll.) yang dapat saling bertransaksi, berdiskusi, dan berkolaborasi.</w:t>
+        <w:t>), pencatatan inventaris sarana produksi dan hasil panen di lumbung (Buku Tani), serta direktori kemitraan layanan mekanisasi dan kios saprotan desa.</w:t>
       </w:r>
     </w:p>
     <w:p>
@@ -455,7 +425,45 @@
         <w:rPr>
           <w:b/>
         </w:rPr>
-        <w:t>Tech Stack:</w:t>
+        <w:t>Fokus Riset Tugas Akhir / Capstone (STSI4440):</w:t>
+      </w:r>
+    </w:p>
+    <w:p>
+      <w:pPr>
+        <w:spacing w:before="20" w:after="80" w:line="276" w:lineRule="auto"/>
+      </w:pPr>
+      <w:r>
+        <w:t xml:space="preserve">Aplikasi difokuskan murni pada keunggulan ilmiah </w:t>
+      </w:r>
+      <w:r>
+        <w:rPr>
+          <w:i/>
+        </w:rPr>
+        <w:t>Decision Support System (DSS)</w:t>
+      </w:r>
+      <w:r>
+        <w:t xml:space="preserve"> dan </w:t>
+      </w:r>
+      <w:r>
+        <w:rPr>
+          <w:i/>
+        </w:rPr>
+        <w:t>Artificial Intelligence (AI)</w:t>
+      </w:r>
+      <w:r>
+        <w:t xml:space="preserve"> dalam membantu pengambilan keputusan budidaya padi oleh petani, menghilangkan fitur sekunder yang redundan (seperti media sosial umum dan bursa lelang bidding) demi menjaga ketajaman ruang lingkup penelitian dan keandalan sistem saat sidang pengujian.</w:t>
+      </w:r>
+    </w:p>
+    <w:p>
+      <w:pPr>
+        <w:pStyle w:val="ListBullet"/>
+        <w:spacing w:before="20" w:after="40" w:line="276" w:lineRule="auto"/>
+      </w:pPr>
+      <w:r>
+        <w:rPr>
+          <w:b/>
+        </w:rPr>
+        <w:t>Tech Stack Terkini:</w:t>
       </w:r>
     </w:p>
     <w:p>
@@ -487,7 +495,7 @@
         <w:t>Backend API:</w:t>
       </w:r>
       <w:r>
-        <w:t xml:space="preserve"> FastAPI (Python 3.10+), Pydantic v2, Uvicorn.</w:t>
+        <w:t xml:space="preserve"> Node.js (v24+), Express.js, TypeScript.</w:t>
       </w:r>
     </w:p>
     <w:p>
@@ -503,7 +511,18 @@
         <w:t>Database &amp; Persistence:</w:t>
       </w:r>
       <w:r>
-        <w:t xml:space="preserve"> Schemaless Persistence Layer (JSON / MongoDB-ready collections).</w:t>
+        <w:t xml:space="preserve"> File-based JSON Persistence Engine (</w:t>
+      </w:r>
+      <w:r>
+        <w:rPr>
+          <w:rFonts w:ascii="Consolas" w:hAnsi="Consolas"/>
+          <w:color w:val="C7254E"/>
+          <w:sz w:val="19"/>
+        </w:rPr>
+        <w:t>local_db.json</w:t>
+      </w:r>
+      <w:r>
+        <w:t>).</w:t>
       </w:r>
     </w:p>
     <w:p>
@@ -516,10 +535,61 @@
         <w:rPr>
           <w:b/>
         </w:rPr>
-        <w:t>AI &amp; Machine Learning:</w:t>
+        <w:t>AI &amp; Machine Learning Engine:</w:t>
+      </w:r>
+    </w:p>
+    <w:p>
+      <w:pPr>
+        <w:pStyle w:val="ListBullet"/>
+        <w:spacing w:before="20" w:after="40" w:line="276" w:lineRule="auto"/>
+        <w:ind w:left="1080"/>
+      </w:pPr>
+      <w:r>
+        <w:rPr>
+          <w:b/>
+        </w:rPr>
+        <w:t>Google Gemini API</w:t>
       </w:r>
       <w:r>
-        <w:t xml:space="preserve"> Agronomic Decision Engine (Kalkulasi Rencana Anggaran Biaya, Kondisi Tanah, Cuaca, dan Air) &amp; Computer Vision Diagnosis Daun Padi (PyTorch / CNN Classifier).</w:t>
+        <w:t xml:space="preserve"> (</w:t>
+      </w:r>
+      <w:r>
+        <w:rPr>
+          <w:rFonts w:ascii="Consolas" w:hAnsi="Consolas"/>
+          <w:color w:val="C7254E"/>
+          <w:sz w:val="19"/>
+        </w:rPr>
+        <w:t>@google/genai</w:t>
+      </w:r>
+      <w:r>
+        <w:t xml:space="preserve"> model </w:t>
+      </w:r>
+      <w:r>
+        <w:rPr>
+          <w:rFonts w:ascii="Consolas" w:hAnsi="Consolas"/>
+          <w:color w:val="C7254E"/>
+          <w:sz w:val="19"/>
+        </w:rPr>
+        <w:t>gemini-2.5-flash</w:t>
+      </w:r>
+      <w:r>
+        <w:t xml:space="preserve"> multimodal vision) untuk analisis penyakit daun padi.</w:t>
+      </w:r>
+    </w:p>
+    <w:p>
+      <w:pPr>
+        <w:pStyle w:val="ListBullet"/>
+        <w:spacing w:before="20" w:after="40" w:line="276" w:lineRule="auto"/>
+        <w:ind w:left="1080"/>
+      </w:pPr>
+      <w:r>
+        <w:rPr>
+          <w:b/>
+        </w:rPr>
+        <w:t>Smart Agronomic Planner Engine</w:t>
+      </w:r>
+      <w:r>
+        <w:t xml:space="preserve"> untuk kalkulasi Rencana Anggaran Biaya (RAB), tahapan budidaya (HST), prakiraan cuaca, dan rekomendasi irigasi.</w:t>
       </w:r>
     </w:p>
     <w:p>
@@ -534,7 +604,7 @@
           <w:color w:val="1B5E20"/>
           <w:sz w:val="30"/>
         </w:rPr>
-        <w:t>2. Analisis Pengguna &amp; Skenario Ekosistem</w:t>
+        <w:t>2. Analisis Pengguna &amp; Skenario Usahatani</w:t>
       </w:r>
     </w:p>
     <w:p>
@@ -549,19 +619,19 @@
           <w:color w:val="2E7D32"/>
           <w:sz w:val="25"/>
         </w:rPr>
-        <w:t>A. Persona Ekosistem Tani</w:t>
+        <w:t>A. Persona Pengguna Utama</w:t>
       </w:r>
     </w:p>
     <w:p>
       <w:pPr>
-        <w:pStyle w:val="ListNumber"/>
-        <w:spacing w:before="40" w:after="60" w:line="276" w:lineRule="auto"/>
+        <w:pStyle w:val="ListBullet"/>
+        <w:spacing w:before="20" w:after="40" w:line="276" w:lineRule="auto"/>
       </w:pPr>
       <w:r>
         <w:rPr>
           <w:b/>
         </w:rPr>
-        <w:t>Pak Joko (Petani Pemilik Sawah):</w:t>
+        <w:t>Pak Joko (Petani Padi Mandiri):</w:t>
       </w:r>
     </w:p>
     <w:p>
@@ -571,7 +641,7 @@
         <w:ind w:left="720"/>
       </w:pPr>
       <w:r>
-        <w:t>Mengelola beberapa petak sawah (misal: Sawah Blok Krajan 0.8 Ha &amp; Sawah Blok Timur 1.2 Ha).</w:t>
+        <w:t>Mengelola petak sawah irigasi teknis di Desa Sukamaju (Sawah Blok Krajan 0.8 Ha &amp; Sawah Blok Timur 1.2 Ha).</w:t>
       </w:r>
     </w:p>
     <w:p>
@@ -581,7 +651,7 @@
         <w:ind w:left="720"/>
       </w:pPr>
       <w:r>
-        <w:t>Membutuhkan kalkulasi otomatis kebutuhan modal tanam, pupuk, dan jadwal kerja berdasarkan luas lahan.</w:t>
+        <w:t>Menghadapi ketidakpastian biaya modal budidaya, risiko serangan hama/penyakit kresek di musim hujan, serta keterbatasan pencatatan stok pupuk dan tonase panen.</w:t>
       </w:r>
     </w:p>
     <w:p>
@@ -591,17 +661,7 @@
         <w:ind w:left="720"/>
       </w:pPr>
       <w:r>
-        <w:t>Bermitra dengan penggarap lokal dan membutuhkan pembagian persentase bagi hasil panen yang transparan.</w:t>
-      </w:r>
-    </w:p>
-    <w:p>
-      <w:pPr>
-        <w:pStyle w:val="ListBullet"/>
-        <w:spacing w:before="20" w:after="40" w:line="276" w:lineRule="auto"/>
-        <w:ind w:left="720"/>
-      </w:pPr>
-      <w:r>
-        <w:t>Membutuhkan kemudahan memesan jasa olah tanah traktor dan buruh tanam langsung dari aplikasi.</w:t>
+        <w:t>Membutuhkan sistem yang dapat:</w:t>
       </w:r>
     </w:p>
     <w:p>
@@ -610,40 +670,7 @@
         <w:spacing w:before="40" w:after="60" w:line="276" w:lineRule="auto"/>
       </w:pPr>
       <w:r>
-        <w:rPr>
-          <w:b/>
-        </w:rPr>
-        <w:t>Mas Bambang (Penyedia Jasa Traktor &amp; Olah Tanah):</w:t>
-      </w:r>
-    </w:p>
-    <w:p>
-      <w:pPr>
-        <w:pStyle w:val="ListBullet"/>
-        <w:spacing w:before="20" w:after="40" w:line="276" w:lineRule="auto"/>
-        <w:ind w:left="720"/>
-      </w:pPr>
-      <w:r>
-        <w:t>Memiliki traktor roda dua (Quick Kubota) dan siap melayani pembajakan sawah di sekitar desa.</w:t>
-      </w:r>
-    </w:p>
-    <w:p>
-      <w:pPr>
-        <w:pStyle w:val="ListBullet"/>
-        <w:spacing w:before="20" w:after="40" w:line="276" w:lineRule="auto"/>
-        <w:ind w:left="720"/>
-      </w:pPr>
-      <w:r>
-        <w:t>Mengiklankan jasanya di katalog marketplace dengan tarif per hektar.</w:t>
-      </w:r>
-    </w:p>
-    <w:p>
-      <w:pPr>
-        <w:pStyle w:val="ListBullet"/>
-        <w:spacing w:before="20" w:after="40" w:line="276" w:lineRule="auto"/>
-        <w:ind w:left="720"/>
-      </w:pPr>
-      <w:r>
-        <w:t>Menerima notifikasi pesanan masuk, mengonfirmasi status keberangkatan armada ke sawah, serta berkoordinasi langsung dengan pemesan melalui chat transaksi.</w:t>
+        <w:t>Mengalkulasi estimasi biaya modal usahatani secara presisi berdasarkan luas lahan dan prakiraan cuaca lokal.</w:t>
       </w:r>
     </w:p>
     <w:p>
@@ -652,30 +679,7 @@
         <w:spacing w:before="40" w:after="60" w:line="276" w:lineRule="auto"/>
       </w:pPr>
       <w:r>
-        <w:rPr>
-          <w:b/>
-        </w:rPr>
-        <w:t>Pak Slamet (Jasa Pengairan &amp; Pompa Irigasi):</w:t>
-      </w:r>
-    </w:p>
-    <w:p>
-      <w:pPr>
-        <w:pStyle w:val="ListBullet"/>
-        <w:spacing w:before="20" w:after="40" w:line="276" w:lineRule="auto"/>
-        <w:ind w:left="720"/>
-      </w:pPr>
-      <w:r>
-        <w:t>Menyediakan pompa alkon diesel dan selang buang untuk sawah tadah hujan.</w:t>
-      </w:r>
-    </w:p>
-    <w:p>
-      <w:pPr>
-        <w:pStyle w:val="ListBullet"/>
-        <w:spacing w:before="20" w:after="40" w:line="276" w:lineRule="auto"/>
-        <w:ind w:left="720"/>
-      </w:pPr>
-      <w:r>
-        <w:t>Menjawab tanya-jawab teknis calon pelanggan di kolom diskusi produk sebelum disewa.</w:t>
+        <w:t>Memberikan diagnosa instan saat daun padi menguning atau berbintik bercak jamur melalui foto kamera smartphone.</w:t>
       </w:r>
     </w:p>
     <w:p>
@@ -684,20 +688,16 @@
         <w:spacing w:before="40" w:after="60" w:line="276" w:lineRule="auto"/>
       </w:pPr>
       <w:r>
-        <w:rPr>
-          <w:b/>
-        </w:rPr>
-        <w:t>Warga Komunitas Tani (Buruh Tanam, Kios KPL, Pengepul):</w:t>
+        <w:t>Mengelola stok pupuk subsidi / benih di gudang dan mencatat hasil panen gabah di lumbung.</w:t>
       </w:r>
     </w:p>
     <w:p>
       <w:pPr>
-        <w:pStyle w:val="ListBullet"/>
-        <w:spacing w:before="20" w:after="40" w:line="276" w:lineRule="auto"/>
-        <w:ind w:left="720"/>
+        <w:pStyle w:val="ListNumber"/>
+        <w:spacing w:before="40" w:after="60" w:line="276" w:lineRule="auto"/>
       </w:pPr>
       <w:r>
-        <w:t>Berbagi kabar perkembangan panen dan foto sawah di linimasa (feed), saling menyukai, berkomentar, dan menjalin kemitraan bagi hasil.</w:t>
+        <w:t>Menghubungi penyedia jasa olah tanah traktor terdekat atau kios saprotan secara mudah via WhatsApp.</w:t>
       </w:r>
     </w:p>
     <w:p>
@@ -712,7 +712,7 @@
           <w:color w:val="1B5E20"/>
           <w:sz w:val="30"/>
         </w:rPr>
-        <w:t>3. Struktur Navigasi &amp; Format Web Responsif</w:t>
+        <w:t>3. Struktur Navigasi &amp; Arsitektur Informasi</w:t>
       </w:r>
     </w:p>
     <w:p>
@@ -720,16 +720,16 @@
         <w:spacing w:before="20" w:after="80" w:line="276" w:lineRule="auto"/>
       </w:pPr>
       <w:r>
-        <w:t xml:space="preserve">Sesuai penyederhanaan arsitektur informasi terbaru, aplikasi mengusung </w:t>
+        <w:t xml:space="preserve">Sesuai penyederhanaan arsitektur informasi terkini, platform mengusung </w:t>
       </w:r>
       <w:r>
         <w:rPr>
           <w:b/>
         </w:rPr>
-        <w:t>4 Menu Utama</w:t>
+        <w:t>5 Modul Utama</w:t>
       </w:r>
       <w:r>
-        <w:t>:</w:t>
+        <w:t xml:space="preserve"> yang terstruktur secara ergonomis:</w:t>
       </w:r>
     </w:p>
     <w:tbl>
@@ -770,65 +770,75 @@
                 <w:color w:val="1E293B"/>
                 <w:sz w:val="17"/>
               </w:rPr>
-              <w:t>[ AgriBuddy Web Application (Max-W 7xl Responsive) ]</w:t>
-              <w:br/>
-              <w:t xml:space="preserve">   ├── Top Desktop Navbar (md:flex) / Bottom Nav Mobile (md:hidden)</w:t>
+              <w:t>[ AgriBuddy Web Application (Desktop Sidebar &amp; Mobile Bottom Nav) ]</w:t>
               <w:br/>
               <w:t xml:space="preserve">   │</w:t>
               <w:br/>
-              <w:t xml:space="preserve">   ├── 1. JEJARING (Komunitas &amp; Media Sosial Tani)</w:t>
+              <w:t xml:space="preserve">   ├── 1. MONITORING SAWAH (Beranda Utama - /)</w:t>
               <w:br/>
-              <w:t xml:space="preserve">   │     ├── Feed Aktivitas Warga (Postingan, Foto, Like, Komentar)</w:t>
+              <w:t xml:space="preserve">   │     ├── Dashboard Cuaca GPS Real-Time (Suhu, Kelembaban, Peluang Hujan)</w:t>
               <w:br/>
-              <w:t xml:space="preserve">   │     ├── Profil Publik Warga &amp; Fitur Follow / Pengikut</w:t>
+              <w:t xml:space="preserve">   │     ├── Rekomendasi Pengairan &amp; Irigasi Cerdas Berbasis Cuaca</w:t>
               <w:br/>
-              <w:t xml:space="preserve">   │     └── Notifikasi Pengikut Baru &amp; Komentar</w:t>
+              <w:t xml:space="preserve">   │     ├── Manajemen Multi-Lahan Sawah (Peta Leaflet GIS &amp; Detail Petak)</w:t>
+              <w:br/>
+              <w:t xml:space="preserve">   │     ├── Buku Modal Lahan (Pencatatan Biaya Riil Usahatani)</w:t>
+              <w:br/>
+              <w:t xml:space="preserve">   │     └── Ringkasan Status Rencana Tani AI Aktif</w:t>
               <w:br/>
               <w:t xml:space="preserve">   │</w:t>
               <w:br/>
-              <w:t xml:space="preserve">   ├── 2. MONITORING (Pusat Kendali Usahatani)</w:t>
+              <w:t xml:space="preserve">   ├── 2. RENCANA TANI AI (Smart Farm Planner - /rencana)</w:t>
               <w:br/>
-              <w:t xml:space="preserve">   │     ├── Sub-tab 1: Sawah &amp; AI</w:t>
+              <w:t xml:space="preserve">   │     ├── Input Parameter Lahan (Luas Ha, Komoditas, Tanah, Sumber Air)</w:t>
               <w:br/>
-              <w:t xml:space="preserve">   │     │     ├── Manajemen Multi-Lahan Sawah (Pilih &amp; Tambah Petak)</w:t>
+              <w:t xml:space="preserve">   │     ├── Kalkulasi Rencana Anggaran Biaya (RAB) 12 Item Riil</w:t>
               <w:br/>
-              <w:t xml:space="preserve">   │     │     ├── Peta Koordinat Interaktif (Leaflet Map &amp; GPS Auto-Locate)</w:t>
+              <w:t xml:space="preserve">   │     ├── Linimasa 5 Fase Budidaya (HST) dengan AI Agronomy Tips</w:t>
               <w:br/>
-              <w:t xml:space="preserve">   │     │     ├── Tim Kolaborator &amp; Pembagian Hasil Panen (%)</w:t>
-              <w:br/>
-              <w:t xml:space="preserve">   │     │     ├── Rencana Tani AI &amp; Kalkulator Modal Produksi (RAB)</w:t>
-              <w:br/>
-              <w:t xml:space="preserve">   │     │     └── Buku Modal Lahan (Pencatatan Biaya Riil Lahan)</w:t>
-              <w:br/>
-              <w:t xml:space="preserve">   │     ├── Sub-tab 2: Stok (Buku Tani Inventaris Saprotan)</w:t>
-              <w:br/>
-              <w:t xml:space="preserve">   │     ├── Sub-tab 3: Lumbung (Stok Panen &amp; Bursa Lelang)</w:t>
-              <w:br/>
-              <w:t xml:space="preserve">   │     └── Sub-tab 4: Transaksi (Live Tracking Pesanan Jasa &amp; Chat Penjual)</w:t>
+              <w:t xml:space="preserve">   │     └── Proyeksi Finansial: HPP/kg, Estimasi Hasil Panen, Laba Bersih, &amp; ROI (%)</w:t>
               <w:br/>
               <w:t xml:space="preserve">   │</w:t>
               <w:br/>
-              <w:t xml:space="preserve">   ├── 3. KATALOG (Marketplace Layanan &amp; Produk Ekosistem)</w:t>
+              <w:t xml:space="preserve">   ├── 3. DOKTER TANI AI (Gemini Multimodal Vision - /dokter)</w:t>
               <w:br/>
-              <w:t xml:space="preserve">   │     ├── Jelajah Layanan: Traktor, Pompa, Buruh Cangkul, Pupuk, Penggilingan</w:t>
+              <w:t xml:space="preserve">   │     ├── Unggah Foto Daun Padi / Pilihan Sampel Uji Cepat</w:t>
               <w:br/>
-              <w:t xml:space="preserve">   │     ├── Fitur Diskusi &amp; Tanya Jawab Publik Produk</w:t>
+              <w:t xml:space="preserve">   │     ├── Inferensi Google Gemini 2.5 Flash Vision Multimodal</w:t>
               <w:br/>
-              <w:t xml:space="preserve">   │     ├── In-App Checkout (COD, YARNEN/Pasca-Panen, Transfer Bank)</w:t>
+              <w:t xml:space="preserve">   │     ├── Output: Nama Penyakit, Akurasi (%), Tingkat Keparahan, Gejala, &amp; Solusi</w:t>
               <w:br/>
-              <w:t xml:space="preserve">   │     ├── Prompt Otomatis Pasca-Checkout: Masukkan ke Buku Modal Lahan</w:t>
-              <w:br/>
-              <w:t xml:space="preserve">   │     └── Tab "Pesanan Masuk" Seller (Konfirmasi Status Armada + Chat Pembeli)</w:t>
+              <w:t xml:space="preserve">   │     └── Riwayat Diagnosa Lab Pertanian</w:t>
               <w:br/>
               <w:t xml:space="preserve">   │</w:t>
               <w:br/>
-              <w:t xml:space="preserve">   └── 4. PROFIL (Identitas Saya &amp; Pasang Layanan)</w:t>
+              <w:t xml:space="preserve">   ├── 4. BUKU TANI (Gudang &amp; Lumbung - /buku-tani)</w:t>
               <w:br/>
-              <w:t xml:space="preserve">         ├── Informasi Identitas Pengguna &amp; Switcher Akun Cepat</w:t>
+              <w:t xml:space="preserve">   │     ├── Tab 1: Gudang Saprotan (Stok Pupuk, Benih, Obat + Quick Adjust + Low Stock Alert)</w:t>
               <w:br/>
-              <w:t xml:space="preserve">         ├── Pasang &amp; Kelola Layanan Saya (CRUD Katalog)</w:t>
+              <w:t xml:space="preserve">   │     └── Tab 2: Lumbung Panen (Catatan Tonase Gabah GKP/GKG &amp; Pantauan Harga Pasar)</w:t>
               <w:br/>
-              <w:t xml:space="preserve">         └── Tombol Keluar (Logout)</w:t>
+              <w:t xml:space="preserve">   │</w:t>
+              <w:br/>
+              <w:t xml:space="preserve">   ├── 5. DIREKTORI LAYANAN EKOSISTEM (/layanan)</w:t>
+              <w:br/>
+              <w:t xml:space="preserve">   │     ├── Direktori Jasa Traktor, Pompa Irigasi, Buruh Tanam, Kios Pupuk, &amp; Penggilingan</w:t>
+              <w:br/>
+              <w:t xml:space="preserve">   │     ├── Filter Kategori Cepat &amp; Pencarian Kata Kunci</w:t>
+              <w:br/>
+              <w:t xml:space="preserve">   │     ├── Kartu Informasi Tarif &amp; Spesifikasi Layanan</w:t>
+              <w:br/>
+              <w:t xml:space="preserve">   │     ├── Tombol Aksi Langsung: "Hubungi via WhatsApp" (Pesan Otomatis)</w:t>
+              <w:br/>
+              <w:t xml:space="preserve">   │     └── Form Pasang Layanan Mandiri</w:t>
+              <w:br/>
+              <w:t xml:space="preserve">   │</w:t>
+              <w:br/>
+              <w:t xml:space="preserve">   └── 6. PROFIL PETANI MANDIRI (/profil)</w:t>
+              <w:br/>
+              <w:t xml:space="preserve">         ├── Informasi Usahatani Pengguna (Pak Joko)</w:t>
+              <w:br/>
+              <w:t xml:space="preserve">         └── Tombol Keluar Akun (Logout)</w:t>
             </w:r>
           </w:p>
         </w:tc>
@@ -866,7 +876,7 @@
           <w:color w:val="2E7D32"/>
           <w:sz w:val="25"/>
         </w:rPr>
-        <w:t>FR-01: Format Web Responsif &amp; Bilah Navigasi Terpadu</w:t>
+        <w:t>FR-01: Monitoring Sawah &amp; Cuaca Lahan Real-Time (Beranda)</w:t>
       </w:r>
     </w:p>
     <w:p>
@@ -881,7 +891,7 @@
         <w:t>Deskripsi:</w:t>
       </w:r>
       <w:r>
-        <w:t xml:space="preserve"> Aplikasi tampil optimal di berbagai dimensi layar tanpa batasan lebar sempit.</w:t>
+        <w:t xml:space="preserve"> Dasbor utama pemantauan iklim mikro sawah dan kondisi lahan geospasial petani.</w:t>
       </w:r>
     </w:p>
     <w:p>
@@ -903,28 +913,7 @@
         <w:ind w:left="720"/>
       </w:pPr>
       <w:r>
-        <w:t>Di layar desktop/laptop (</w:t>
-      </w:r>
-      <w:r>
-        <w:rPr>
-          <w:rFonts w:ascii="Consolas" w:hAnsi="Consolas"/>
-          <w:color w:val="C7254E"/>
-          <w:sz w:val="19"/>
-        </w:rPr>
-        <w:t>md:</w:t>
-      </w:r>
-      <w:r>
-        <w:t xml:space="preserve"> ke atas): bilah navigasi utama bertengger di bagian atas (</w:t>
-      </w:r>
-      <w:r>
-        <w:rPr>
-          <w:color w:val="1B5E20"/>
-          <w:u w:val="single"/>
-        </w:rPr>
-        <w:t>HeaderBar.vue</w:t>
-      </w:r>
-      <w:r>
-        <w:t>), menyajikan tautan langsung ke Jejaring, Monitoring, Katalog, dan Profil. Bottom navigation otomatis disembunyikan.</w:t>
+        <w:t>Pengambilan telemetri cuaca terkini (suhu, kelembaban, probabilitas curah hujan).</w:t>
       </w:r>
     </w:p>
     <w:p>
@@ -934,17 +923,16 @@
         <w:ind w:left="720"/>
       </w:pPr>
       <w:r>
-        <w:t xml:space="preserve">Di layar smartphone: </w:t>
+        <w:t xml:space="preserve">Fitur </w:t>
       </w:r>
       <w:r>
         <w:rPr>
-          <w:color w:val="1B5E20"/>
-          <w:u w:val="single"/>
+          <w:i/>
         </w:rPr>
-        <w:t>BottomNav.vue</w:t>
+        <w:t>Auto-Detect GPS</w:t>
       </w:r>
       <w:r>
-        <w:t xml:space="preserve"> aktif untuk memudahkan sentuhan jempol tangan.</w:t>
+        <w:t xml:space="preserve"> untuk mendeteksi koordinat lintang &amp; bujur sawah pengguna secara instan.</w:t>
       </w:r>
     </w:p>
     <w:p>
@@ -954,18 +942,27 @@
         <w:ind w:left="720"/>
       </w:pPr>
       <w:r>
-        <w:t>Sistem grid adaptif multi-kolom (</w:t>
+        <w:t>Rekomendasi irigasi cerdas: Menganjurkan penyiraman atau penundaan pengairan secara otomatis berdasarkan probabilitas hujan demi menghemat bahan bakar pompa dan tenaga kerja.</w:t>
       </w:r>
+    </w:p>
+    <w:p>
+      <w:pPr>
+        <w:pStyle w:val="ListBullet"/>
+        <w:spacing w:before="20" w:after="40" w:line="276" w:lineRule="auto"/>
+        <w:ind w:left="720"/>
+      </w:pPr>
       <w:r>
-        <w:rPr>
-          <w:rFonts w:ascii="Consolas" w:hAnsi="Consolas"/>
-          <w:color w:val="C7254E"/>
-          <w:sz w:val="19"/>
-        </w:rPr>
-        <w:t>grid-cols-1 md:grid-cols-2 lg:grid-cols-3</w:t>
+        <w:t>Visualisasi peta geospasial sawah interaktif berbasis Leaflet GIS dan OpenStreetMap.</w:t>
       </w:r>
+    </w:p>
+    <w:p>
+      <w:pPr>
+        <w:pStyle w:val="ListBullet"/>
+        <w:spacing w:before="20" w:after="40" w:line="276" w:lineRule="auto"/>
+        <w:ind w:left="720"/>
+      </w:pPr>
       <w:r>
-        <w:t>) pada kartu layanan, pesanan, dan pemantauan.</w:t>
+        <w:t>Buku Modal Pengeluaran Lahan: Pencatatan pengeluaran riil per petak sawah.</w:t>
       </w:r>
     </w:p>
     <w:p>
@@ -980,7 +977,7 @@
           <w:color w:val="2E7D32"/>
           <w:sz w:val="25"/>
         </w:rPr>
-        <w:t>FR-02: Jejaring Sosial &amp; Komunitas Ekosistem</w:t>
+        <w:t>FR-02: Rencana Tani AI &amp; Kalkulator Modal (Smart Farm Planner)</w:t>
       </w:r>
     </w:p>
     <w:p>
@@ -995,7 +992,7 @@
         <w:t>Deskripsi:</w:t>
       </w:r>
       <w:r>
-        <w:t xml:space="preserve"> Ruang interaksi antarwarga ekosistem tani untuk berbagi ilmu, perkembangan tanaman, dan kemitraan.</w:t>
+        <w:t xml:space="preserve"> Sistem pendukung keputusan agronomi cerdas untuk perencanaan musim tanam yang terukur.</w:t>
       </w:r>
     </w:p>
     <w:p>
@@ -1017,7 +1014,7 @@
         <w:ind w:left="720"/>
       </w:pPr>
       <w:r>
-        <w:t>Pembuatan postingan teks dan foto kondisi sawah terkini.</w:t>
+        <w:t>Kalkulasi Rencana Anggaran Biaya (RAB) 12 item kebutuhan riil usahatani (sewa traktor, buruh cangkul, benih bersertifikat, buruh tanam legowo, urea subsidi, NPK majemuk, pupuk organik, biaya air, obat pengendali hama, upah semprot, tenaga panen, karung angkut).</w:t>
       </w:r>
     </w:p>
     <w:p>
@@ -1027,16 +1024,7 @@
         <w:ind w:left="720"/>
       </w:pPr>
       <w:r>
-        <w:t>Reaksi suka (</w:t>
-      </w:r>
-      <w:r>
-        <w:rPr>
-          <w:i/>
-        </w:rPr>
-        <w:t>Like</w:t>
-      </w:r>
-      <w:r>
-        <w:t>) dan utas komentar publik.</w:t>
+        <w:t>Penyesuaian dosis pupuk otomatis terhadap iklim: jika musim hujan tinggi, dosis urea otomatis diturunkan 15% untuk mencegah kerentanan penyakit kresek, dan penguatan pupuk Kalium ditingkatkan.</w:t>
       </w:r>
     </w:p>
     <w:p>
@@ -1046,16 +1034,34 @@
         <w:ind w:left="720"/>
       </w:pPr>
       <w:r>
-        <w:t xml:space="preserve">Tombol </w:t>
+        <w:t>Jadwal budidaya 5 tahapan Hari Setelah Tanam (HST) dengan status pengerjaan (</w:t>
       </w:r>
       <w:r>
         <w:rPr>
           <w:i/>
         </w:rPr>
-        <w:t>Follow / Ikuti</w:t>
+        <w:t>SELESAI</w:t>
       </w:r>
       <w:r>
-        <w:t xml:space="preserve"> pada profil warga tani lain.</w:t>
+        <w:t xml:space="preserve">, </w:t>
+      </w:r>
+      <w:r>
+        <w:rPr>
+          <w:i/>
+        </w:rPr>
+        <w:t>SEDANG_BERJALAN</w:t>
+      </w:r>
+      <w:r>
+        <w:t xml:space="preserve">, </w:t>
+      </w:r>
+      <w:r>
+        <w:rPr>
+          <w:i/>
+        </w:rPr>
+        <w:t>BELUM</w:t>
+      </w:r>
+      <w:r>
+        <w:t>) dan catatan biaya aktual riil.</w:t>
       </w:r>
     </w:p>
     <w:p>
@@ -1065,26 +1071,13 @@
         <w:ind w:left="720"/>
       </w:pPr>
       <w:r>
-        <w:t>Notifikasi in-app instan untuk komentar baru (</w:t>
+        <w:t>Proyeksi finansial komprehensif: Harga Pokok Produksi (HPP) per kg, estimasi tonase hasil panen, proyeksi pendapatan kotor, laba bersih usahatani, dan rasio ROI (</w:t>
       </w:r>
       <w:r>
         <w:rPr>
-          <w:rFonts w:ascii="Consolas" w:hAnsi="Consolas"/>
-          <w:color w:val="C7254E"/>
-          <w:sz w:val="19"/>
+          <w:i/>
         </w:rPr>
-        <w:t>NEW_COMMENT</w:t>
-      </w:r>
-      <w:r>
-        <w:t>) dan pengikut baru (</w:t>
-      </w:r>
-      <w:r>
-        <w:rPr>
-          <w:rFonts w:ascii="Consolas" w:hAnsi="Consolas"/>
-          <w:color w:val="C7254E"/>
-          <w:sz w:val="19"/>
-        </w:rPr>
-        <w:t>NEW_FOLLOWER</w:t>
+        <w:t>Return on Investment</w:t>
       </w:r>
       <w:r>
         <w:t>).</w:t>
@@ -1102,7 +1095,7 @@
           <w:color w:val="2E7D32"/>
           <w:sz w:val="25"/>
         </w:rPr>
-        <w:t>FR-03: Rencana Tani AI &amp; Kalkulator Modal Usahatani</w:t>
+        <w:t>FR-03: Dokter Tani AI — Fitopatologi Daun Padi (Gemini Vision)</w:t>
       </w:r>
     </w:p>
     <w:p>
@@ -1117,7 +1110,211 @@
         <w:t>Deskripsi:</w:t>
       </w:r>
       <w:r>
-        <w:t xml:space="preserve"> Cukup memasukkan luas lahan (atau deteksi via GPS/peta), AI mengalkulasi seluruh proses usahatani dengan mempertimbangkan tanah, cuaca, dan air.</w:t>
+        <w:t xml:space="preserve"> Modul kecerdasan buatan visual untuk deteksi dini penyakit tanaman padi dari citra daun.</w:t>
+      </w:r>
+    </w:p>
+    <w:p>
+      <w:pPr>
+        <w:pStyle w:val="ListBullet"/>
+        <w:spacing w:before="20" w:after="40" w:line="276" w:lineRule="auto"/>
+      </w:pPr>
+      <w:r>
+        <w:rPr>
+          <w:b/>
+        </w:rPr>
+        <w:t>Fitur Utama:</w:t>
+      </w:r>
+    </w:p>
+    <w:p>
+      <w:pPr>
+        <w:pStyle w:val="ListBullet"/>
+        <w:spacing w:before="20" w:after="40" w:line="276" w:lineRule="auto"/>
+        <w:ind w:left="720"/>
+      </w:pPr>
+      <w:r>
+        <w:t xml:space="preserve">Integrasi resmi </w:t>
+      </w:r>
+      <w:r>
+        <w:rPr>
+          <w:b/>
+        </w:rPr>
+        <w:t>Google Gemini API</w:t>
+      </w:r>
+      <w:r>
+        <w:t xml:space="preserve"> (</w:t>
+      </w:r>
+      <w:r>
+        <w:rPr>
+          <w:rFonts w:ascii="Consolas" w:hAnsi="Consolas"/>
+          <w:color w:val="C7254E"/>
+          <w:sz w:val="19"/>
+        </w:rPr>
+        <w:t>@google/genai</w:t>
+      </w:r>
+      <w:r>
+        <w:t xml:space="preserve"> model </w:t>
+      </w:r>
+      <w:r>
+        <w:rPr>
+          <w:rFonts w:ascii="Consolas" w:hAnsi="Consolas"/>
+          <w:color w:val="C7254E"/>
+          <w:sz w:val="19"/>
+        </w:rPr>
+        <w:t>gemini-2.5-flash</w:t>
+      </w:r>
+      <w:r>
+        <w:t>) untuk inferensi multimodal visual.</w:t>
+      </w:r>
+    </w:p>
+    <w:p>
+      <w:pPr>
+        <w:pStyle w:val="ListBullet"/>
+        <w:spacing w:before="20" w:after="40" w:line="276" w:lineRule="auto"/>
+        <w:ind w:left="720"/>
+      </w:pPr>
+      <w:r>
+        <w:t>Klasifikasi kondisi daun padi:</w:t>
+      </w:r>
+    </w:p>
+    <w:p>
+      <w:pPr>
+        <w:pStyle w:val="ListNumber"/>
+        <w:spacing w:before="40" w:after="60" w:line="276" w:lineRule="auto"/>
+      </w:pPr>
+      <w:r>
+        <w:rPr>
+          <w:i/>
+        </w:rPr>
+        <w:t>Hawar Daun Bakteri (Kresek / Xanthomonas oryzae)</w:t>
+      </w:r>
+    </w:p>
+    <w:p>
+      <w:pPr>
+        <w:pStyle w:val="ListNumber"/>
+        <w:spacing w:before="40" w:after="60" w:line="276" w:lineRule="auto"/>
+      </w:pPr>
+      <w:r>
+        <w:rPr>
+          <w:i/>
+        </w:rPr>
+        <w:t>Blas Daun (Pyricularia oryzae)</w:t>
+      </w:r>
+    </w:p>
+    <w:p>
+      <w:pPr>
+        <w:pStyle w:val="ListNumber"/>
+        <w:spacing w:before="40" w:after="60" w:line="276" w:lineRule="auto"/>
+      </w:pPr>
+      <w:r>
+        <w:rPr>
+          <w:i/>
+        </w:rPr>
+        <w:t>Bercak Coklat (Helminthosporium oryzae)</w:t>
+      </w:r>
+    </w:p>
+    <w:p>
+      <w:pPr>
+        <w:pStyle w:val="ListNumber"/>
+        <w:spacing w:before="40" w:after="60" w:line="276" w:lineRule="auto"/>
+      </w:pPr>
+      <w:r>
+        <w:rPr>
+          <w:i/>
+        </w:rPr>
+        <w:t>Daun Padi Sehat</w:t>
+      </w:r>
+    </w:p>
+    <w:p>
+      <w:pPr>
+        <w:pStyle w:val="ListBullet"/>
+        <w:spacing w:before="20" w:after="40" w:line="276" w:lineRule="auto"/>
+        <w:ind w:left="720"/>
+      </w:pPr>
+      <w:r>
+        <w:t>Output terstruktur: Nama penyakit lokal &amp; ilmiah, skor keyakinan (</w:t>
+      </w:r>
+      <w:r>
+        <w:rPr>
+          <w:i/>
+        </w:rPr>
+        <w:t>confidence score</w:t>
+      </w:r>
+      <w:r>
+        <w:t xml:space="preserve"> 0.0 - 1.0), tingkat keparahan (</w:t>
+      </w:r>
+      <w:r>
+        <w:rPr>
+          <w:i/>
+        </w:rPr>
+        <w:t>Aman/Sedang/Tinggi</w:t>
+      </w:r>
+      <w:r>
+        <w:t>), gejala klinis visual, dan langkah penanganan agronomi nyata (pengeringan petak, pengurangan urea, anjuran bakterisida/fungisida tembaga).</w:t>
+      </w:r>
+    </w:p>
+    <w:p>
+      <w:pPr>
+        <w:pStyle w:val="ListBullet"/>
+        <w:spacing w:before="20" w:after="40" w:line="276" w:lineRule="auto"/>
+        <w:ind w:left="720"/>
+      </w:pPr>
+      <w:r>
+        <w:rPr>
+          <w:i/>
+        </w:rPr>
+        <w:t>Graceful Fallback Mechanism</w:t>
+      </w:r>
+      <w:r>
+        <w:t>: Otomatis beralih ke basis pengetahuan lokal Kementan &amp; IRRI jika perangkat offline atau API key belum terpasang (</w:t>
+      </w:r>
+      <w:r>
+        <w:rPr>
+          <w:i/>
+        </w:rPr>
+        <w:t>anti-crash &amp; demo-ready</w:t>
+      </w:r>
+      <w:r>
+        <w:t>).</w:t>
+      </w:r>
+    </w:p>
+    <w:p>
+      <w:pPr>
+        <w:pStyle w:val="ListBullet"/>
+        <w:spacing w:before="20" w:after="40" w:line="276" w:lineRule="auto"/>
+        <w:ind w:left="720"/>
+      </w:pPr>
+      <w:r>
+        <w:t>Tersedia sampel foto daun siap uji untuk kemudahan demonstrasi tanpa harus menyiapkan citra eksternal.</w:t>
+      </w:r>
+    </w:p>
+    <w:p>
+      <w:pPr>
+        <w:keepNext/>
+        <w:spacing w:before="200" w:after="60"/>
+      </w:pPr>
+      <w:r>
+        <w:rPr>
+          <w:rFonts w:ascii="Calibri" w:hAnsi="Calibri"/>
+          <w:b/>
+          <w:color w:val="2E7D32"/>
+          <w:sz w:val="25"/>
+        </w:rPr>
+        <w:t>FR-04: Buku Tani — Gudang Saprotan &amp; Lumbung Panen</w:t>
+      </w:r>
+    </w:p>
+    <w:p>
+      <w:pPr>
+        <w:pStyle w:val="ListBullet"/>
+        <w:spacing w:before="20" w:after="40" w:line="276" w:lineRule="auto"/>
+      </w:pPr>
+      <w:r>
+        <w:rPr>
+          <w:b/>
+        </w:rPr>
+        <w:t>Deskripsi:</w:t>
+      </w:r>
+      <w:r>
+        <w:t xml:space="preserve"> Pengelolaan logistik persediaan sarana produksi dan catatan hasil panen mandiri petani.</w:t>
       </w:r>
     </w:p>
     <w:p>
@@ -1142,10 +1339,29 @@
         <w:rPr>
           <w:b/>
         </w:rPr>
-        <w:t>Integrasi GPS &amp; Leaflet Map Picker:</w:t>
+        <w:t>Gudang Saprotan</w:t>
       </w:r>
       <w:r>
-        <w:t xml:space="preserve"> Mendeteksi posisi pengguna secara otomatis dan menyediakan pin peta untuk mengambil koordinat presisi petak sawah.</w:t>
+        <w:t>: Pencatatan stok pupuk, benih, dan obat dengan tombol penyesuaian cepat (+ / - 1 unit) tanpa perlu form edit rumit.</w:t>
+      </w:r>
+    </w:p>
+    <w:p>
+      <w:pPr>
+        <w:pStyle w:val="ListBullet"/>
+        <w:spacing w:before="20" w:after="40" w:line="276" w:lineRule="auto"/>
+        <w:ind w:left="720"/>
+      </w:pPr>
+      <w:r>
+        <w:t>Indikator peringatan stok menipis (</w:t>
+      </w:r>
+      <w:r>
+        <w:rPr>
+          <w:i/>
+        </w:rPr>
+        <w:t>low-stock warning</w:t>
+      </w:r>
+      <w:r>
+        <w:t>) jika persediaan berada di bawah batas ambang aman.</w:t>
       </w:r>
     </w:p>
     <w:p>
@@ -1158,37 +1374,10 @@
         <w:rPr>
           <w:b/>
         </w:rPr>
-        <w:t>Kalkulasi Agronomis Otomatis:</w:t>
+        <w:t>Lumbung Panen</w:t>
       </w:r>
-    </w:p>
-    <w:p>
-      <w:pPr>
-        <w:pStyle w:val="ListBullet"/>
-        <w:spacing w:before="20" w:after="40" w:line="276" w:lineRule="auto"/>
-        <w:ind w:left="1080"/>
-      </w:pPr>
       <w:r>
-        <w:t>Perhitungan kebutuhan benih, pupuk dasar, pupuk susulan 1 &amp; 2, dan obat pengendali OPT.</w:t>
-      </w:r>
-    </w:p>
-    <w:p>
-      <w:pPr>
-        <w:pStyle w:val="ListBullet"/>
-        <w:spacing w:before="20" w:after="40" w:line="276" w:lineRule="auto"/>
-        <w:ind w:left="1080"/>
-      </w:pPr>
-      <w:r>
-        <w:t>Rencana Anggaran Biaya (RAB) per fase tanam (Olah tanah, semai, tanam, perawatan, panen).</w:t>
-      </w:r>
-    </w:p>
-    <w:p>
-      <w:pPr>
-        <w:pStyle w:val="ListBullet"/>
-        <w:spacing w:before="20" w:after="40" w:line="276" w:lineRule="auto"/>
-        <w:ind w:left="1080"/>
-      </w:pPr>
-      <w:r>
-        <w:t>Estimasi tonase hasil panen (kuintal/ton) dan proyeksi penerimaan laba bersih (Rp).</w:t>
+        <w:t>: Pencatatan tonase hasil panen gabah (GKP/GKG), tanggal panen, lokasi petak asal, dan total akumulasi komoditas tersimpan.</w:t>
       </w:r>
     </w:p>
     <w:p>
@@ -1198,22 +1387,7 @@
         <w:ind w:left="720"/>
       </w:pPr>
       <w:r>
-        <w:rPr>
-          <w:b/>
-        </w:rPr>
-        <w:t>Timeline Interaktif:</w:t>
-      </w:r>
-      <w:r>
-        <w:t xml:space="preserve"> Petani dapat memperbarui status pengerjaan tahapan (</w:t>
-      </w:r>
-      <w:r>
-        <w:rPr>
-          <w:i/>
-        </w:rPr>
-        <w:t>Belum, Sedang Berjalan, Selesai</w:t>
-      </w:r>
-      <w:r>
-        <w:t>) beserta pencatatan biaya aktual.</w:t>
+        <w:t>Pantauan tren harga pasar komoditas daerah terkini (GKP, GKG, Beras Medium IR-64, Jagung Pipil) untuk membantu petani menentukan waktu jual terbaik.</w:t>
       </w:r>
     </w:p>
     <w:p>
@@ -1228,7 +1402,7 @@
           <w:color w:val="2E7D32"/>
           <w:sz w:val="25"/>
         </w:rPr>
-        <w:t>FR-04: Manajemen Multi-Lahan Sawah &amp; Kolaborator Bagi Hasil</w:t>
+        <w:t>FR-05: Direktori Layanan &amp; Kemitraan Ekosistem (WhatsApp Direct)</w:t>
       </w:r>
     </w:p>
     <w:p>
@@ -1243,7 +1417,7 @@
         <w:t>Deskripsi:</w:t>
       </w:r>
       <w:r>
-        <w:t xml:space="preserve"> Mengakomodasi petani yang menggarap lebih dari satu petak sawah dan bekerja sama dengan mitra bagi hasil.</w:t>
+        <w:t xml:space="preserve"> Direktori kontak penyedia jasa mekanisasi pertanian dan saprotan desa.</w:t>
       </w:r>
     </w:p>
     <w:p>
@@ -1265,13 +1439,7 @@
         <w:ind w:left="720"/>
       </w:pPr>
       <w:r>
-        <w:rPr>
-          <w:b/>
-        </w:rPr>
-        <w:t>Multi-Plot Management:</w:t>
-      </w:r>
-      <w:r>
-        <w:t xml:space="preserve"> Beralih antarpetak sawah (misal: Sawah Blok Krajan vs Sawah Blok Timur) dengan parameter agronomis yang independen.</w:t>
+        <w:t>Katalog direktori mitra terverifikasi: Jasa Olah Tanah Traktor, Pompa Air Irigasi, Regu Buruh Tanam Legowo, Kios Saprotan Resmi KPL, dan Penggilingan Padi.</w:t>
       </w:r>
     </w:p>
     <w:p>
@@ -1281,40 +1449,7 @@
         <w:ind w:left="720"/>
       </w:pPr>
       <w:r>
-        <w:rPr>
-          <w:b/>
-        </w:rPr>
-        <w:t>Kolaborator Bagi Hasil (%):</w:t>
-      </w:r>
-    </w:p>
-    <w:p>
-      <w:pPr>
-        <w:pStyle w:val="ListBullet"/>
-        <w:spacing w:before="20" w:after="40" w:line="276" w:lineRule="auto"/>
-        <w:ind w:left="1080"/>
-      </w:pPr>
-      <w:r>
-        <w:t>Menentukan anggota pengelola (Pemilik Lahan, Penggarap Utama, Buruh Cangkul, dsb.) beserta persentase pembagian hasil (misal: 60% : 40%).</w:t>
-      </w:r>
-    </w:p>
-    <w:p>
-      <w:pPr>
-        <w:pStyle w:val="ListBullet"/>
-        <w:spacing w:before="20" w:after="40" w:line="276" w:lineRule="auto"/>
-        <w:ind w:left="1080"/>
-      </w:pPr>
-      <w:r>
-        <w:t>Visualisasi progress bar multi-warna proporsi kepemilikan hasil.</w:t>
-      </w:r>
-    </w:p>
-    <w:p>
-      <w:pPr>
-        <w:pStyle w:val="ListBullet"/>
-        <w:spacing w:before="20" w:after="40" w:line="276" w:lineRule="auto"/>
-        <w:ind w:left="1080"/>
-      </w:pPr>
-      <w:r>
-        <w:t>Kalkulasi estimasi rupiah nominal yang akan diterima masing-masing kolaborator berdasarkan proyeksi panen AI.</w:t>
+        <w:t>Filter kategori cepat dan pencarian kata kunci layanan.</w:t>
       </w:r>
     </w:p>
     <w:p>
@@ -1324,55 +1459,16 @@
         <w:ind w:left="720"/>
       </w:pPr>
       <w:r>
-        <w:rPr>
-          <w:b/>
-        </w:rPr>
-        <w:t>Buku Modal Lahan:</w:t>
+        <w:t xml:space="preserve">Tombol aksi </w:t>
       </w:r>
-      <w:r>
-        <w:t xml:space="preserve"> Buku kas pengeluaran modal per petak sawah yang menampung transaksi marketplace maupun input manual lapangan.</w:t>
-      </w:r>
-    </w:p>
-    <w:p>
-      <w:pPr>
-        <w:keepNext/>
-        <w:spacing w:before="200" w:after="60"/>
-      </w:pPr>
-      <w:r>
-        <w:rPr>
-          <w:rFonts w:ascii="Calibri" w:hAnsi="Calibri"/>
-          <w:b/>
-          <w:color w:val="2E7D32"/>
-          <w:sz w:val="25"/>
-        </w:rPr>
-        <w:t>FR-05: Katalog Marketplace &amp; In-App Checkout</w:t>
-      </w:r>
-    </w:p>
-    <w:p>
-      <w:pPr>
-        <w:pStyle w:val="ListBullet"/>
-        <w:spacing w:before="20" w:after="40" w:line="276" w:lineRule="auto"/>
-      </w:pPr>
       <w:r>
         <w:rPr>
           <w:b/>
         </w:rPr>
-        <w:t>Deskripsi:</w:t>
+        <w:t>"Hubungi via WhatsApp"</w:t>
       </w:r>
       <w:r>
-        <w:t xml:space="preserve"> Pusat pencarian dan penyewaan layanan usahatani serta saprotan pendukung.</w:t>
-      </w:r>
-    </w:p>
-    <w:p>
-      <w:pPr>
-        <w:pStyle w:val="ListBullet"/>
-        <w:spacing w:before="20" w:after="40" w:line="276" w:lineRule="auto"/>
-      </w:pPr>
-      <w:r>
-        <w:rPr>
-          <w:b/>
-        </w:rPr>
-        <w:t>Fitur Utama:</w:t>
+        <w:t xml:space="preserve"> pada setiap kartu layanan yang secara otomatis membuka aplikasi WhatsApp dengan pesan terformat rapi (nama pemesan, jenis layanan, dan pertanyaan ketersediaan jadwal/stok).</w:t>
       </w:r>
     </w:p>
     <w:p>
@@ -1382,662 +1478,7 @@
         <w:ind w:left="720"/>
       </w:pPr>
       <w:r>
-        <w:t xml:space="preserve">Filter kategori: </w:t>
-      </w:r>
-      <w:r>
-        <w:rPr>
-          <w:i/>
-        </w:rPr>
-        <w:t>Olah Tanah &amp; Traktor, Pompa &amp; Irigasi, Cangkul &amp; Tanam, Pupuk &amp; Benih, Bursa Panen, Penggilingan Padi</w:t>
-      </w:r>
-      <w:r>
-        <w:t>.</w:t>
-      </w:r>
-    </w:p>
-    <w:p>
-      <w:pPr>
-        <w:pStyle w:val="ListBullet"/>
-        <w:spacing w:before="20" w:after="40" w:line="276" w:lineRule="auto"/>
-        <w:ind w:left="720"/>
-      </w:pPr>
-      <w:r>
-        <w:t>Pasang layanan mandiri bagi setiap pengguna (tarif, satuan, lokasi, deskripsi, nomor kontak).</w:t>
-      </w:r>
-    </w:p>
-    <w:p>
-      <w:pPr>
-        <w:pStyle w:val="ListBullet"/>
-        <w:spacing w:before="20" w:after="40" w:line="276" w:lineRule="auto"/>
-        <w:ind w:left="720"/>
-      </w:pPr>
-      <w:r>
-        <w:rPr>
-          <w:b/>
-        </w:rPr>
-        <w:t>In-App Checkout:</w:t>
-      </w:r>
-      <w:r>
-        <w:t xml:space="preserve"> Pemesanan instan dalam aplikasi dengan rincian kuantitas, total biaya kalkulasi otomatis, dan metode pembayaran (</w:t>
-      </w:r>
-      <w:r>
-        <w:rPr>
-          <w:i/>
-        </w:rPr>
-        <w:t>COD, YARNEN / Bayar Panen, Transfer Bank / QRIS</w:t>
-      </w:r>
-      <w:r>
-        <w:t>).</w:t>
-      </w:r>
-    </w:p>
-    <w:p>
-      <w:pPr>
-        <w:pStyle w:val="ListBullet"/>
-        <w:spacing w:before="20" w:after="40" w:line="276" w:lineRule="auto"/>
-        <w:ind w:left="720"/>
-      </w:pPr>
-      <w:r>
-        <w:rPr>
-          <w:b/>
-        </w:rPr>
-        <w:t>Konfirmasi Pasca-Checkout Buku Modal:</w:t>
-      </w:r>
-      <w:r>
-        <w:t xml:space="preserve"> Muncul pop-up konfirmasi </w:t>
-      </w:r>
-      <w:r>
-        <w:rPr>
-          <w:i/>
-        </w:rPr>
-        <w:t>"Apakah kamu ingin memasukkannya ke dalam buku modal?"</w:t>
-      </w:r>
-      <w:r>
-        <w:t xml:space="preserve"> dengan pemilihan petak lahan sawah yang dibiayai.</w:t>
-      </w:r>
-    </w:p>
-    <w:p>
-      <w:pPr>
-        <w:keepNext/>
-        <w:spacing w:before="200" w:after="60"/>
-      </w:pPr>
-      <w:r>
-        <w:rPr>
-          <w:rFonts w:ascii="Calibri" w:hAnsi="Calibri"/>
-          <w:b/>
-          <w:color w:val="2E7D32"/>
-          <w:sz w:val="25"/>
-        </w:rPr>
-        <w:t>FR-06: Manajemen Pesanan Penjual &amp; Live Tracking Pembeli</w:t>
-      </w:r>
-    </w:p>
-    <w:p>
-      <w:pPr>
-        <w:pStyle w:val="ListBullet"/>
-        <w:spacing w:before="20" w:after="40" w:line="276" w:lineRule="auto"/>
-      </w:pPr>
-      <w:r>
-        <w:rPr>
-          <w:b/>
-        </w:rPr>
-        <w:t>Deskripsi:</w:t>
-      </w:r>
-      <w:r>
-        <w:t xml:space="preserve"> Sinkronisasi status pengerjaan pesanan antara penjual jasa dan pembeli.</w:t>
-      </w:r>
-    </w:p>
-    <w:p>
-      <w:pPr>
-        <w:pStyle w:val="ListBullet"/>
-        <w:spacing w:before="20" w:after="40" w:line="276" w:lineRule="auto"/>
-      </w:pPr>
-      <w:r>
-        <w:rPr>
-          <w:b/>
-        </w:rPr>
-        <w:t>Fitur Utama:</w:t>
-      </w:r>
-    </w:p>
-    <w:p>
-      <w:pPr>
-        <w:pStyle w:val="ListBullet"/>
-        <w:spacing w:before="20" w:after="40" w:line="276" w:lineRule="auto"/>
-        <w:ind w:left="720"/>
-      </w:pPr>
-      <w:r>
-        <w:rPr>
-          <w:b/>
-        </w:rPr>
-        <w:t>Tab Pesanan Masuk (Seller):</w:t>
-      </w:r>
-    </w:p>
-    <w:p>
-      <w:pPr>
-        <w:pStyle w:val="ListBullet"/>
-        <w:spacing w:before="20" w:after="40" w:line="276" w:lineRule="auto"/>
-        <w:ind w:left="1080"/>
-      </w:pPr>
-      <w:r>
-        <w:t>Indikator counter badge merah berkedip saat ada pesanan baru menunggu konfirmasi.</w:t>
-      </w:r>
-    </w:p>
-    <w:p>
-      <w:pPr>
-        <w:pStyle w:val="ListBullet"/>
-        <w:spacing w:before="20" w:after="40" w:line="276" w:lineRule="auto"/>
-        <w:ind w:left="1080"/>
-      </w:pPr>
-      <w:r>
-        <w:t>Modal konfirmasi status oleh penjual:</w:t>
-      </w:r>
-    </w:p>
-    <w:p>
-      <w:pPr>
-        <w:pStyle w:val="ListBullet"/>
-        <w:spacing w:before="20" w:after="40" w:line="276" w:lineRule="auto"/>
-        <w:ind w:left="1440"/>
-      </w:pPr>
-      <w:r>
-        <w:t xml:space="preserve">🚜 </w:t>
-      </w:r>
-      <w:r>
-        <w:rPr>
-          <w:i/>
-        </w:rPr>
-        <w:t>DIPROSES (Konfirmasi &amp; Mulai Proses)</w:t>
-      </w:r>
-    </w:p>
-    <w:p>
-      <w:pPr>
-        <w:pStyle w:val="ListBullet"/>
-        <w:spacing w:before="20" w:after="40" w:line="276" w:lineRule="auto"/>
-        <w:ind w:left="1440"/>
-      </w:pPr>
-      <w:r>
-        <w:t xml:space="preserve">🚚 </w:t>
-      </w:r>
-      <w:r>
-        <w:rPr>
-          <w:i/>
-        </w:rPr>
-        <w:t>SEDANG_DIKIRIM (Mulai Dikirim / Berangkat ke Lahan)</w:t>
-      </w:r>
-    </w:p>
-    <w:p>
-      <w:pPr>
-        <w:pStyle w:val="ListBullet"/>
-        <w:spacing w:before="20" w:after="40" w:line="276" w:lineRule="auto"/>
-        <w:ind w:left="1440"/>
-      </w:pPr>
-      <w:r>
-        <w:t xml:space="preserve">✅ </w:t>
-      </w:r>
-      <w:r>
-        <w:rPr>
-          <w:i/>
-        </w:rPr>
-        <w:t>SELESAI (Pesanan Selesai / Tuntas)</w:t>
-      </w:r>
-    </w:p>
-    <w:p>
-      <w:pPr>
-        <w:pStyle w:val="ListBullet"/>
-        <w:spacing w:before="20" w:after="40" w:line="276" w:lineRule="auto"/>
-        <w:ind w:left="1440"/>
-      </w:pPr>
-      <w:r>
-        <w:t xml:space="preserve">⚠️ </w:t>
-      </w:r>
-      <w:r>
-        <w:rPr>
-          <w:i/>
-        </w:rPr>
-        <w:t>STOK_HABIS (Stok Habis / Jadwal Penuh)</w:t>
-      </w:r>
-    </w:p>
-    <w:p>
-      <w:pPr>
-        <w:pStyle w:val="ListBullet"/>
-        <w:spacing w:before="20" w:after="40" w:line="276" w:lineRule="auto"/>
-        <w:ind w:left="1440"/>
-      </w:pPr>
-      <w:r>
-        <w:t xml:space="preserve">❌ </w:t>
-      </w:r>
-      <w:r>
-        <w:rPr>
-          <w:i/>
-        </w:rPr>
-        <w:t>DIBATALKAN (Tolak / Batalkan Pesanan)</w:t>
-      </w:r>
-    </w:p>
-    <w:p>
-      <w:pPr>
-        <w:pStyle w:val="ListBullet"/>
-        <w:spacing w:before="20" w:after="40" w:line="276" w:lineRule="auto"/>
-        <w:ind w:left="1080"/>
-      </w:pPr>
-      <w:r>
-        <w:t>Input catatan penjelasan langsung untuk pembeli (misal: jadwal jam tiba armada traktor).</w:t>
-      </w:r>
-    </w:p>
-    <w:p>
-      <w:pPr>
-        <w:pStyle w:val="ListBullet"/>
-        <w:spacing w:before="20" w:after="40" w:line="276" w:lineRule="auto"/>
-        <w:ind w:left="720"/>
-      </w:pPr>
-      <w:r>
-        <w:rPr>
-          <w:b/>
-        </w:rPr>
-        <w:t>Live Tracking Pembeli (Monitoring -&gt; Transaksi):</w:t>
-      </w:r>
-    </w:p>
-    <w:p>
-      <w:pPr>
-        <w:pStyle w:val="ListBullet"/>
-        <w:spacing w:before="20" w:after="40" w:line="276" w:lineRule="auto"/>
-        <w:ind w:left="1080"/>
-      </w:pPr>
-      <w:r>
-        <w:t>Pemantauan status pesanan real-time dengan badge warna dan kotak catatan resmi dari penjual.</w:t>
-      </w:r>
-    </w:p>
-    <w:p>
-      <w:pPr>
-        <w:keepNext/>
-        <w:spacing w:before="200" w:after="60"/>
-      </w:pPr>
-      <w:r>
-        <w:rPr>
-          <w:rFonts w:ascii="Calibri" w:hAnsi="Calibri"/>
-          <w:b/>
-          <w:color w:val="2E7D32"/>
-          <w:sz w:val="25"/>
-        </w:rPr>
-        <w:t>FR-07: Fitur Diskusi Pesanan (Chat Transaksi) &amp; Diskusi Produk</w:t>
-      </w:r>
-    </w:p>
-    <w:p>
-      <w:pPr>
-        <w:pStyle w:val="ListBullet"/>
-        <w:spacing w:before="20" w:after="40" w:line="276" w:lineRule="auto"/>
-      </w:pPr>
-      <w:r>
-        <w:rPr>
-          <w:b/>
-        </w:rPr>
-        <w:t>Deskripsi:</w:t>
-      </w:r>
-      <w:r>
-        <w:t xml:space="preserve"> Saluran komunikasi langsung untuk koordinasi transaksi dan tanya jawab produk.</w:t>
-      </w:r>
-    </w:p>
-    <w:p>
-      <w:pPr>
-        <w:pStyle w:val="ListBullet"/>
-        <w:spacing w:before="20" w:after="40" w:line="276" w:lineRule="auto"/>
-      </w:pPr>
-      <w:r>
-        <w:rPr>
-          <w:b/>
-        </w:rPr>
-        <w:t>Fitur Utama:</w:t>
-      </w:r>
-    </w:p>
-    <w:p>
-      <w:pPr>
-        <w:pStyle w:val="ListBullet"/>
-        <w:spacing w:before="20" w:after="40" w:line="276" w:lineRule="auto"/>
-        <w:ind w:left="720"/>
-      </w:pPr>
-      <w:r>
-        <w:rPr>
-          <w:b/>
-        </w:rPr>
-        <w:t>Diskusi Pesanan / Chat Transaksi:</w:t>
-      </w:r>
-    </w:p>
-    <w:p>
-      <w:pPr>
-        <w:pStyle w:val="ListBullet"/>
-        <w:spacing w:before="20" w:after="40" w:line="276" w:lineRule="auto"/>
-        <w:ind w:left="1080"/>
-      </w:pPr>
-      <w:r>
-        <w:t>Tombol obrolan langsung pada kartu pesanan pembeli maupun penjual.</w:t>
-      </w:r>
-    </w:p>
-    <w:p>
-      <w:pPr>
-        <w:pStyle w:val="ListBullet"/>
-        <w:spacing w:before="20" w:after="40" w:line="276" w:lineRule="auto"/>
-        <w:ind w:left="1080"/>
-      </w:pPr>
-      <w:r>
-        <w:t>Gelembung pesan percakapan (</w:t>
-      </w:r>
-      <w:r>
-        <w:rPr>
-          <w:i/>
-        </w:rPr>
-        <w:t>chat bubbles</w:t>
-      </w:r>
-      <w:r>
-        <w:t>) dengan pembeda warna pengirim, label peran (</w:t>
-      </w:r>
-      <w:r>
-        <w:rPr>
-          <w:i/>
-        </w:rPr>
-        <w:t>Penyedia Jasa</w:t>
-      </w:r>
-      <w:r>
-        <w:t xml:space="preserve"> vs </w:t>
-      </w:r>
-      <w:r>
-        <w:rPr>
-          <w:i/>
-        </w:rPr>
-        <w:t>Pembeli</w:t>
-      </w:r>
-      <w:r>
-        <w:t>), waktu kirim, dan auto-scroll.</w:t>
-      </w:r>
-    </w:p>
-    <w:p>
-      <w:pPr>
-        <w:pStyle w:val="ListBullet"/>
-        <w:spacing w:before="20" w:after="40" w:line="276" w:lineRule="auto"/>
-        <w:ind w:left="1080"/>
-      </w:pPr>
-      <w:r>
-        <w:t xml:space="preserve">Memicu notifikasi in-app </w:t>
-      </w:r>
-      <w:r>
-        <w:rPr>
-          <w:rFonts w:ascii="Consolas" w:hAnsi="Consolas"/>
-          <w:color w:val="C7254E"/>
-          <w:sz w:val="19"/>
-        </w:rPr>
-        <w:t>ORDER_DISCUSSION</w:t>
-      </w:r>
-      <w:r>
-        <w:t xml:space="preserve"> ke lawan transaksi.</w:t>
-      </w:r>
-    </w:p>
-    <w:p>
-      <w:pPr>
-        <w:pStyle w:val="ListBullet"/>
-        <w:spacing w:before="20" w:after="40" w:line="276" w:lineRule="auto"/>
-        <w:ind w:left="720"/>
-      </w:pPr>
-      <w:r>
-        <w:rPr>
-          <w:b/>
-        </w:rPr>
-        <w:t>Diskusi Produk di Katalog:</w:t>
-      </w:r>
-    </w:p>
-    <w:p>
-      <w:pPr>
-        <w:pStyle w:val="ListBullet"/>
-        <w:spacing w:before="20" w:after="40" w:line="276" w:lineRule="auto"/>
-        <w:ind w:left="1080"/>
-      </w:pPr>
-      <w:r>
-        <w:t>Utas tanya jawab publik pada setiap item katalog.</w:t>
-      </w:r>
-    </w:p>
-    <w:p>
-      <w:pPr>
-        <w:pStyle w:val="ListBullet"/>
-        <w:spacing w:before="20" w:after="40" w:line="276" w:lineRule="auto"/>
-        <w:ind w:left="1080"/>
-      </w:pPr>
-      <w:r>
-        <w:t>Petani dapat bertanya spesifikasi produk dan penyedia dapat memberikan jawaban resmi.</w:t>
-      </w:r>
-    </w:p>
-    <w:p>
-      <w:pPr>
-        <w:pStyle w:val="ListBullet"/>
-        <w:spacing w:before="20" w:after="40" w:line="276" w:lineRule="auto"/>
-        <w:ind w:left="1080"/>
-      </w:pPr>
-      <w:r>
-        <w:t xml:space="preserve">Memicu notifikasi in-app </w:t>
-      </w:r>
-      <w:r>
-        <w:rPr>
-          <w:rFonts w:ascii="Consolas" w:hAnsi="Consolas"/>
-          <w:color w:val="C7254E"/>
-          <w:sz w:val="19"/>
-        </w:rPr>
-        <w:t>PRODUCT_DISCUSSION</w:t>
-      </w:r>
-      <w:r>
-        <w:t xml:space="preserve"> ke pemilik layanan.</w:t>
-      </w:r>
-    </w:p>
-    <w:p>
-      <w:pPr>
-        <w:keepNext/>
-        <w:spacing w:before="200" w:after="60"/>
-      </w:pPr>
-      <w:r>
-        <w:rPr>
-          <w:rFonts w:ascii="Calibri" w:hAnsi="Calibri"/>
-          <w:b/>
-          <w:color w:val="2E7D32"/>
-          <w:sz w:val="25"/>
-        </w:rPr>
-        <w:t>FR-08: Sistem Notifikasi Universal</w:t>
-      </w:r>
-    </w:p>
-    <w:p>
-      <w:pPr>
-        <w:pStyle w:val="ListBullet"/>
-        <w:spacing w:before="20" w:after="40" w:line="276" w:lineRule="auto"/>
-      </w:pPr>
-      <w:r>
-        <w:rPr>
-          <w:b/>
-        </w:rPr>
-        <w:t>Deskripsi:</w:t>
-      </w:r>
-      <w:r>
-        <w:t xml:space="preserve"> Pusat pemberitahuan aktivitas pengguna yang terintegrasi pada lonceng HeaderBar.</w:t>
-      </w:r>
-    </w:p>
-    <w:p>
-      <w:pPr>
-        <w:pStyle w:val="ListBullet"/>
-        <w:spacing w:before="20" w:after="40" w:line="276" w:lineRule="auto"/>
-      </w:pPr>
-      <w:r>
-        <w:rPr>
-          <w:b/>
-        </w:rPr>
-        <w:t>Tipe Notifikasi:</w:t>
-      </w:r>
-    </w:p>
-    <w:p>
-      <w:pPr>
-        <w:pStyle w:val="ListBullet"/>
-        <w:spacing w:before="20" w:after="40" w:line="276" w:lineRule="auto"/>
-        <w:ind w:left="720"/>
-      </w:pPr>
-      <w:r>
-        <w:rPr>
-          <w:rFonts w:ascii="Consolas" w:hAnsi="Consolas"/>
-          <w:color w:val="C7254E"/>
-          <w:sz w:val="19"/>
-        </w:rPr>
-        <w:t>ORDER_RECEIVED</w:t>
-      </w:r>
-      <w:r>
-        <w:t>: Pesanan baru masuk ke akun penjual.</w:t>
-      </w:r>
-    </w:p>
-    <w:p>
-      <w:pPr>
-        <w:pStyle w:val="ListBullet"/>
-        <w:spacing w:before="20" w:after="40" w:line="276" w:lineRule="auto"/>
-        <w:ind w:left="720"/>
-      </w:pPr>
-      <w:r>
-        <w:rPr>
-          <w:rFonts w:ascii="Consolas" w:hAnsi="Consolas"/>
-          <w:color w:val="C7254E"/>
-          <w:sz w:val="19"/>
-        </w:rPr>
-        <w:t>ORDER_STATUS</w:t>
-      </w:r>
-      <w:r>
-        <w:t>: Konfirmasi status pesanan dan catatan penjual diterima oleh pembeli.</w:t>
-      </w:r>
-    </w:p>
-    <w:p>
-      <w:pPr>
-        <w:pStyle w:val="ListBullet"/>
-        <w:spacing w:before="20" w:after="40" w:line="276" w:lineRule="auto"/>
-        <w:ind w:left="720"/>
-      </w:pPr>
-      <w:r>
-        <w:rPr>
-          <w:rFonts w:ascii="Consolas" w:hAnsi="Consolas"/>
-          <w:color w:val="C7254E"/>
-          <w:sz w:val="19"/>
-        </w:rPr>
-        <w:t>ORDER_DISCUSSION</w:t>
-      </w:r>
-      <w:r>
-        <w:t>: Pesan baru dalam obrolan transaksi.</w:t>
-      </w:r>
-    </w:p>
-    <w:p>
-      <w:pPr>
-        <w:pStyle w:val="ListBullet"/>
-        <w:spacing w:before="20" w:after="40" w:line="276" w:lineRule="auto"/>
-        <w:ind w:left="720"/>
-      </w:pPr>
-      <w:r>
-        <w:rPr>
-          <w:rFonts w:ascii="Consolas" w:hAnsi="Consolas"/>
-          <w:color w:val="C7254E"/>
-          <w:sz w:val="19"/>
-        </w:rPr>
-        <w:t>PRODUCT_DISCUSSION</w:t>
-      </w:r>
-      <w:r>
-        <w:t>: Pertanyaan baru pada produk layanan.</w:t>
-      </w:r>
-    </w:p>
-    <w:p>
-      <w:pPr>
-        <w:pStyle w:val="ListBullet"/>
-        <w:spacing w:before="20" w:after="40" w:line="276" w:lineRule="auto"/>
-        <w:ind w:left="720"/>
-      </w:pPr>
-      <w:r>
-        <w:rPr>
-          <w:rFonts w:ascii="Consolas" w:hAnsi="Consolas"/>
-          <w:color w:val="C7254E"/>
-          <w:sz w:val="19"/>
-        </w:rPr>
-        <w:t>NEW_COMMENT</w:t>
-      </w:r>
-      <w:r>
-        <w:t>: Komentar baru pada postingan feed jejaring.</w:t>
-      </w:r>
-    </w:p>
-    <w:p>
-      <w:pPr>
-        <w:pStyle w:val="ListBullet"/>
-        <w:spacing w:before="20" w:after="40" w:line="276" w:lineRule="auto"/>
-        <w:ind w:left="720"/>
-      </w:pPr>
-      <w:r>
-        <w:rPr>
-          <w:rFonts w:ascii="Consolas" w:hAnsi="Consolas"/>
-          <w:color w:val="C7254E"/>
-          <w:sz w:val="19"/>
-        </w:rPr>
-        <w:t>NEW_FOLLOWER</w:t>
-      </w:r>
-      <w:r>
-        <w:t>: Pengguna lain mulai mengikuti profil.</w:t>
-      </w:r>
-    </w:p>
-    <w:p>
-      <w:pPr>
-        <w:keepNext/>
-        <w:spacing w:before="200" w:after="60"/>
-      </w:pPr>
-      <w:r>
-        <w:rPr>
-          <w:rFonts w:ascii="Calibri" w:hAnsi="Calibri"/>
-          <w:b/>
-          <w:color w:val="2E7D32"/>
-          <w:sz w:val="25"/>
-        </w:rPr>
-        <w:t>FR-09: Dokter Tani AI (Diagnosis Daun Padi)</w:t>
-      </w:r>
-    </w:p>
-    <w:p>
-      <w:pPr>
-        <w:pStyle w:val="ListBullet"/>
-        <w:spacing w:before="20" w:after="40" w:line="276" w:lineRule="auto"/>
-      </w:pPr>
-      <w:r>
-        <w:rPr>
-          <w:b/>
-        </w:rPr>
-        <w:t>Deskripsi:</w:t>
-      </w:r>
-      <w:r>
-        <w:t xml:space="preserve"> Modul Computer Vision untuk deteksi dini penyakit tanaman melalui foto daun.</w:t>
-      </w:r>
-    </w:p>
-    <w:p>
-      <w:pPr>
-        <w:pStyle w:val="ListBullet"/>
-        <w:spacing w:before="20" w:after="40" w:line="276" w:lineRule="auto"/>
-      </w:pPr>
-      <w:r>
-        <w:rPr>
-          <w:b/>
-        </w:rPr>
-        <w:t>Fitur Utama:</w:t>
-      </w:r>
-    </w:p>
-    <w:p>
-      <w:pPr>
-        <w:pStyle w:val="ListBullet"/>
-        <w:spacing w:before="20" w:after="40" w:line="276" w:lineRule="auto"/>
-        <w:ind w:left="720"/>
-      </w:pPr>
-      <w:r>
-        <w:t>Diagnosis otomatis: Hawar Daun Bakteri (Kresek), Blas Daun (Pyricularia), Bercak Coklat, dan Daun Sehat.</w:t>
-      </w:r>
-    </w:p>
-    <w:p>
-      <w:pPr>
-        <w:pStyle w:val="ListBullet"/>
-        <w:spacing w:before="20" w:after="40" w:line="276" w:lineRule="auto"/>
-        <w:ind w:left="720"/>
-      </w:pPr>
-      <w:r>
-        <w:t>Menampilkan skor akurasi (</w:t>
-      </w:r>
-      <w:r>
-        <w:rPr>
-          <w:i/>
-        </w:rPr>
-        <w:t>confidence score</w:t>
-      </w:r>
-      <w:r>
-        <w:t>), tingkat keparahan, dan anjuran dosis obat/penanganan.</w:t>
+        <w:t>Formulir mandiri bagi pengguna yang ingin mendaftarkan jasa usahataninya ke dalam direktori.</w:t>
       </w:r>
     </w:p>
     <w:p>
@@ -2052,825 +1493,33 @@
           <w:color w:val="1B5E20"/>
           <w:sz w:val="30"/>
         </w:rPr>
-        <w:t>5. Arsitektur Data Terkini (Collections Schema)</w:t>
-      </w:r>
-    </w:p>
-    <w:p>
-      <w:pPr>
-        <w:spacing w:before="40" w:after="80"/>
-      </w:pPr>
-      <w:r>
-        <w:t xml:space="preserve">Berikut adalah arsitektur model data konseptual dan relasional platform </w:t>
-      </w:r>
-      <w:r>
-        <w:rPr>
-          <w:b/>
-        </w:rPr>
-        <w:t>AgriBuddy</w:t>
-      </w:r>
-      <w:r>
-        <w:t xml:space="preserve"> yang menghubungkan 13 entitas utama ekosistem digital usahatani:</w:t>
-      </w:r>
-    </w:p>
-    <w:p>
-      <w:pPr>
-        <w:spacing w:before="80" w:after="40"/>
-        <w:jc w:val="center"/>
-      </w:pPr>
-      <w:r>
-        <w:drawing>
-          <wp:inline xmlns:a="http://schemas.openxmlformats.org/drawingml/2006/main" xmlns:pic="http://schemas.openxmlformats.org/drawingml/2006/picture">
-            <wp:extent cx="5943600" cy="2426289"/>
-            <wp:docPr id="1" name="Picture 1"/>
-            <wp:cNvGraphicFramePr>
-              <a:graphicFrameLocks noChangeAspect="1"/>
-            </wp:cNvGraphicFramePr>
-            <a:graphic>
-              <a:graphicData uri="http://schemas.openxmlformats.org/drawingml/2006/picture">
-                <pic:pic>
-                  <pic:nvPicPr>
-                    <pic:cNvPr id="0" name="ERD_AgriBuddy.jpg"/>
-                    <pic:cNvPicPr/>
-                  </pic:nvPicPr>
-                  <pic:blipFill>
-                    <a:blip r:embed="rId11"/>
-                    <a:stretch>
-                      <a:fillRect/>
-                    </a:stretch>
-                  </pic:blipFill>
-                  <pic:spPr>
-                    <a:xfrm>
-                      <a:off x="0" y="0"/>
-                      <a:ext cx="5943600" cy="2426289"/>
-                    </a:xfrm>
-                    <a:prstGeom prst="rect"/>
-                  </pic:spPr>
-                </pic:pic>
-              </a:graphicData>
-            </a:graphic>
-          </wp:inline>
-        </w:drawing>
-      </w:r>
-    </w:p>
-    <w:p>
-      <w:pPr>
-        <w:spacing w:before="0" w:after="160"/>
-        <w:jc w:val="center"/>
-      </w:pPr>
-      <w:r>
-        <w:rPr>
-          <w:rFonts w:ascii="Calibri" w:hAnsi="Calibri"/>
-          <w:i/>
-          <w:color w:val="646464"/>
-          <w:sz w:val="18"/>
-        </w:rPr>
-        <w:t>Gambar 5.1: Entity Relationship Diagram (ERD) Platform AgriBuddy (13 Entitas)</w:t>
-      </w:r>
-    </w:p>
-    <w:p>
-      <w:pPr>
-        <w:keepNext/>
-        <w:spacing w:before="200" w:after="60"/>
-      </w:pPr>
-      <w:r>
-        <w:rPr>
-          <w:rFonts w:ascii="Calibri" w:hAnsi="Calibri"/>
-          <w:b/>
-          <w:color w:val="2E7D32"/>
-          <w:sz w:val="25"/>
-        </w:rPr>
-        <w:t>1. Collection: `users`</w:t>
-      </w:r>
-    </w:p>
-    <w:tbl>
-      <w:tblPr>
-        <w:tblW w:type="auto" w:w="0"/>
-        <w:jc w:val="center"/>
-        <w:tblLayout w:type="fixed"/>
-        <w:tblLook w:firstColumn="1" w:firstRow="1" w:lastColumn="0" w:lastRow="0" w:noHBand="0" w:noVBand="1" w:val="04A0"/>
-      </w:tblPr>
-      <w:tblGrid>
-        <w:gridCol w:w="9360"/>
-      </w:tblGrid>
-      <w:tr>
-        <w:tc>
-          <w:tcPr>
-            <w:tcW w:type="dxa" w:w="9360"/>
-            <w:shd w:fill="F8FAFC"/>
-            <w:tcMar>
-              <w:top w:w="140" w:type="dxa"/>
-              <w:bottom w:w="140" w:type="dxa"/>
-              <w:left w:w="180" w:type="dxa"/>
-              <w:right w:w="180" w:type="dxa"/>
-            </w:tcMar>
-            <w:tcBorders>
-              <w:top w:val="single" w:sz="6" w:space="0" w:color="CBD5E1"/>
-              <w:left w:val="single" w:sz="18" w:space="0" w:color="1B5E20"/>
-              <w:bottom w:val="single" w:sz="6" w:space="0" w:color="CBD5E1"/>
-              <w:right w:val="single" w:sz="6" w:space="0" w:color="CBD5E1"/>
-            </w:tcBorders>
-          </w:tcPr>
-          <w:p>
-            <w:pPr>
-              <w:spacing w:before="40" w:after="40" w:line="252" w:lineRule="auto"/>
-            </w:pPr>
-            <w:r>
-              <w:rPr>
-                <w:rFonts w:ascii="Consolas" w:hAnsi="Consolas"/>
-                <w:color w:val="1E293B"/>
-                <w:sz w:val="17"/>
-              </w:rPr>
-              <w:t>{</w:t>
-              <w:br/>
-              <w:t xml:space="preserve">  "id": "usr_petani",</w:t>
-              <w:br/>
-              <w:t xml:space="preserve">  "username": "pak_joko",</w:t>
-              <w:br/>
-              <w:t xml:space="preserve">  "full_name": "Pak Joko (Petani Padi)",</w:t>
-              <w:br/>
-              <w:t xml:space="preserve">  "specialization": "Usahatani Padi Organik &amp; Bibit Inpari",</w:t>
-              <w:br/>
-              <w:t xml:space="preserve">  "village": "Desa Sukamaju, Kec. Megamendung",</w:t>
-              <w:br/>
-              <w:t xml:space="preserve">  "phone_number": "081234567890",</w:t>
-              <w:br/>
-              <w:t xml:space="preserve">  "avatar": "👨‍🌾",</w:t>
-              <w:br/>
-              <w:t xml:space="preserve">  "followers_count": 28,</w:t>
-              <w:br/>
-              <w:t xml:space="preserve">  "created_at": "2026-09-20T00:00:00Z"</w:t>
-              <w:br/>
-              <w:t>}</w:t>
-            </w:r>
-          </w:p>
-        </w:tc>
-      </w:tr>
-    </w:tbl>
-    <w:p>
-      <w:pPr>
-        <w:spacing w:after="80"/>
-      </w:pPr>
-    </w:p>
-    <w:p>
-      <w:pPr>
-        <w:keepNext/>
-        <w:spacing w:before="200" w:after="60"/>
-      </w:pPr>
-      <w:r>
-        <w:rPr>
-          <w:rFonts w:ascii="Calibri" w:hAnsi="Calibri"/>
-          <w:b/>
-          <w:color w:val="2E7D32"/>
-          <w:sz w:val="25"/>
-        </w:rPr>
-        <w:t>2. Collection: `farmlands`</w:t>
-      </w:r>
-    </w:p>
-    <w:tbl>
-      <w:tblPr>
-        <w:tblW w:type="auto" w:w="0"/>
-        <w:jc w:val="center"/>
-        <w:tblLayout w:type="fixed"/>
-        <w:tblLook w:firstColumn="1" w:firstRow="1" w:lastColumn="0" w:lastRow="0" w:noHBand="0" w:noVBand="1" w:val="04A0"/>
-      </w:tblPr>
-      <w:tblGrid>
-        <w:gridCol w:w="9360"/>
-      </w:tblGrid>
-      <w:tr>
-        <w:tc>
-          <w:tcPr>
-            <w:tcW w:type="dxa" w:w="9360"/>
-            <w:shd w:fill="F8FAFC"/>
-            <w:tcMar>
-              <w:top w:w="140" w:type="dxa"/>
-              <w:bottom w:w="140" w:type="dxa"/>
-              <w:left w:w="180" w:type="dxa"/>
-              <w:right w:w="180" w:type="dxa"/>
-            </w:tcMar>
-            <w:tcBorders>
-              <w:top w:val="single" w:sz="6" w:space="0" w:color="CBD5E1"/>
-              <w:left w:val="single" w:sz="18" w:space="0" w:color="1B5E20"/>
-              <w:bottom w:val="single" w:sz="6" w:space="0" w:color="CBD5E1"/>
-              <w:right w:val="single" w:sz="6" w:space="0" w:color="CBD5E1"/>
-            </w:tcBorders>
-          </w:tcPr>
-          <w:p>
-            <w:pPr>
-              <w:spacing w:before="40" w:after="40" w:line="252" w:lineRule="auto"/>
-            </w:pPr>
-            <w:r>
-              <w:rPr>
-                <w:rFonts w:ascii="Consolas" w:hAnsi="Consolas"/>
-                <w:color w:val="1E293B"/>
-                <w:sz w:val="17"/>
-              </w:rPr>
-              <w:t>{</w:t>
-              <w:br/>
-              <w:t xml:space="preserve">  "id": "farm_001",</w:t>
-              <w:br/>
-              <w:t xml:space="preserve">  "user_id": "usr_petani",</w:t>
-              <w:br/>
-              <w:t xml:space="preserve">  "name": "Sawah Blok Krajan",</w:t>
-              <w:br/>
-              <w:t xml:space="preserve">  "land_size_ha": 0.8,</w:t>
-              <w:br/>
-              <w:t xml:space="preserve">  "commodity": "Padi Sawah Inpari 32",</w:t>
-              <w:br/>
-              <w:t xml:space="preserve">  "soil_type": "Lempung Berliat (Subur)",</w:t>
-              <w:br/>
-              <w:t xml:space="preserve">  "water_source": "Irigasi Teknis Bendungan",</w:t>
-              <w:br/>
-              <w:t xml:space="preserve">  "location": "Desa Sukamaju, Jawa Timur",</w:t>
-              <w:br/>
-              <w:t xml:space="preserve">  "latitude": -7.2504,</w:t>
-              <w:br/>
-              <w:t xml:space="preserve">  "longitude": 112.7512,</w:t>
-              <w:br/>
-              <w:t xml:space="preserve">  "collaborators": [</w:t>
-              <w:br/>
-              <w:t xml:space="preserve">    { "id": "col_1", "name": "Pak Joko", "role": "Pemilik Lahan", "share_percentage": 60.0 },</w:t>
-              <w:br/>
-              <w:t xml:space="preserve">    { "id": "col_2", "name": "Mang Udin", "role": "Penggarap Lapangan", "share_percentage": 40.0 }</w:t>
-              <w:br/>
-              <w:t xml:space="preserve">  ],</w:t>
-              <w:br/>
-              <w:t xml:space="preserve">  "capital_expenses": [</w:t>
-              <w:br/>
-              <w:t xml:space="preserve">    {</w:t>
-              <w:br/>
-              <w:t xml:space="preserve">      "id": "exp_001",</w:t>
-              <w:br/>
-              <w:t xml:space="preserve">      "item_name": "Sewa Traktor Quick Kubota (0.8 / Hektar)",</w:t>
-              <w:br/>
-              <w:t xml:space="preserve">      "amount": 960000,</w:t>
-              <w:br/>
-              <w:t xml:space="preserve">      "category": "OLAH_TANAH",</w:t>
-              <w:br/>
-              <w:t xml:space="preserve">      "source": "MARKETPLACE",</w:t>
-              <w:br/>
-              <w:t xml:space="preserve">      "order_ref_id": "ord_123",</w:t>
-              <w:br/>
-              <w:t xml:space="preserve">      "date": "21 Sep 2026, 09:30 WIB"</w:t>
-              <w:br/>
-              <w:t xml:space="preserve">    }</w:t>
-              <w:br/>
-              <w:t xml:space="preserve">  ]</w:t>
-              <w:br/>
-              <w:t>}</w:t>
-            </w:r>
-          </w:p>
-        </w:tc>
-      </w:tr>
-    </w:tbl>
-    <w:p>
-      <w:pPr>
-        <w:spacing w:after="80"/>
-      </w:pPr>
-    </w:p>
-    <w:p>
-      <w:pPr>
-        <w:keepNext/>
-        <w:spacing w:before="200" w:after="60"/>
-      </w:pPr>
-      <w:r>
-        <w:rPr>
-          <w:rFonts w:ascii="Calibri" w:hAnsi="Calibri"/>
-          <w:b/>
-          <w:color w:val="2E7D32"/>
-          <w:sz w:val="25"/>
-        </w:rPr>
-        <w:t>3. Collection: `ecosystem_services` (Katalog Marketplace)</w:t>
-      </w:r>
-    </w:p>
-    <w:tbl>
-      <w:tblPr>
-        <w:tblW w:type="auto" w:w="0"/>
-        <w:jc w:val="center"/>
-        <w:tblLayout w:type="fixed"/>
-        <w:tblLook w:firstColumn="1" w:firstRow="1" w:lastColumn="0" w:lastRow="0" w:noHBand="0" w:noVBand="1" w:val="04A0"/>
-      </w:tblPr>
-      <w:tblGrid>
-        <w:gridCol w:w="9360"/>
-      </w:tblGrid>
-      <w:tr>
-        <w:tc>
-          <w:tcPr>
-            <w:tcW w:type="dxa" w:w="9360"/>
-            <w:shd w:fill="F8FAFC"/>
-            <w:tcMar>
-              <w:top w:w="140" w:type="dxa"/>
-              <w:bottom w:w="140" w:type="dxa"/>
-              <w:left w:w="180" w:type="dxa"/>
-              <w:right w:w="180" w:type="dxa"/>
-            </w:tcMar>
-            <w:tcBorders>
-              <w:top w:val="single" w:sz="6" w:space="0" w:color="CBD5E1"/>
-              <w:left w:val="single" w:sz="18" w:space="0" w:color="1B5E20"/>
-              <w:bottom w:val="single" w:sz="6" w:space="0" w:color="CBD5E1"/>
-              <w:right w:val="single" w:sz="6" w:space="0" w:color="CBD5E1"/>
-            </w:tcBorders>
-          </w:tcPr>
-          <w:p>
-            <w:pPr>
-              <w:spacing w:before="40" w:after="40" w:line="252" w:lineRule="auto"/>
-            </w:pPr>
-            <w:r>
-              <w:rPr>
-                <w:rFonts w:ascii="Consolas" w:hAnsi="Consolas"/>
-                <w:color w:val="1E293B"/>
-                <w:sz w:val="17"/>
-              </w:rPr>
-              <w:t>{</w:t>
-              <w:br/>
-              <w:t xml:space="preserve">  "id": "srv_001",</w:t>
-              <w:br/>
-              <w:t xml:space="preserve">  "provider_id": "usr_traktor",</w:t>
-              <w:br/>
-              <w:t xml:space="preserve">  "provider_name": "Mas Bambang",</w:t>
-              <w:br/>
-              <w:t xml:space="preserve">  "provider_badge": "Operator Traktor Handal",</w:t>
-              <w:br/>
-              <w:t xml:space="preserve">  "provider_avatar": "🚜",</w:t>
-              <w:br/>
-              <w:t xml:space="preserve">  "title": "Sewa Traktor Quick Kubota (Bajak &amp; Garu)",</w:t>
-              <w:br/>
-              <w:t xml:space="preserve">  "category": "JASA_TRAKTOR",</w:t>
-              <w:br/>
-              <w:t xml:space="preserve">  "category_label": "Jasa Olah Tanah",</w:t>
-              <w:br/>
-              <w:t xml:space="preserve">  "price": 1200000,</w:t>
-              <w:br/>
-              <w:t xml:space="preserve">  "price_unit": "/ Hektar",</w:t>
-              <w:br/>
-              <w:t xml:space="preserve">  "location": "Desa Sukamaju (Radius 5 km)",</w:t>
-              <w:br/>
-              <w:t xml:space="preserve">  "phone": "628123456789",</w:t>
-              <w:br/>
-              <w:t xml:space="preserve">  "description": "Siap bajak singkal, gelebeg, dan garu halus tanah sawah becek maupun tegalan.",</w:t>
-              <w:br/>
-              <w:t xml:space="preserve">  "tags": ["Traktor", "OlahTanah", "BajakSawah"],</w:t>
-              <w:br/>
-              <w:t xml:space="preserve">  "is_available": true</w:t>
-              <w:br/>
-              <w:t>}</w:t>
-            </w:r>
-          </w:p>
-        </w:tc>
-      </w:tr>
-    </w:tbl>
-    <w:p>
-      <w:pPr>
-        <w:spacing w:after="80"/>
-      </w:pPr>
-    </w:p>
-    <w:p>
-      <w:pPr>
-        <w:keepNext/>
-        <w:spacing w:before="200" w:after="60"/>
-      </w:pPr>
-      <w:r>
-        <w:rPr>
-          <w:rFonts w:ascii="Calibri" w:hAnsi="Calibri"/>
-          <w:b/>
-          <w:color w:val="2E7D32"/>
-          <w:sz w:val="25"/>
-        </w:rPr>
-        <w:t>4. Collection: `service_orders`</w:t>
-      </w:r>
-    </w:p>
-    <w:tbl>
-      <w:tblPr>
-        <w:tblW w:type="auto" w:w="0"/>
-        <w:jc w:val="center"/>
-        <w:tblLayout w:type="fixed"/>
-        <w:tblLook w:firstColumn="1" w:firstRow="1" w:lastColumn="0" w:lastRow="0" w:noHBand="0" w:noVBand="1" w:val="04A0"/>
-      </w:tblPr>
-      <w:tblGrid>
-        <w:gridCol w:w="9360"/>
-      </w:tblGrid>
-      <w:tr>
-        <w:tc>
-          <w:tcPr>
-            <w:tcW w:type="dxa" w:w="9360"/>
-            <w:shd w:fill="F8FAFC"/>
-            <w:tcMar>
-              <w:top w:w="140" w:type="dxa"/>
-              <w:bottom w:w="140" w:type="dxa"/>
-              <w:left w:w="180" w:type="dxa"/>
-              <w:right w:w="180" w:type="dxa"/>
-            </w:tcMar>
-            <w:tcBorders>
-              <w:top w:val="single" w:sz="6" w:space="0" w:color="CBD5E1"/>
-              <w:left w:val="single" w:sz="18" w:space="0" w:color="1B5E20"/>
-              <w:bottom w:val="single" w:sz="6" w:space="0" w:color="CBD5E1"/>
-              <w:right w:val="single" w:sz="6" w:space="0" w:color="CBD5E1"/>
-            </w:tcBorders>
-          </w:tcPr>
-          <w:p>
-            <w:pPr>
-              <w:spacing w:before="40" w:after="40" w:line="252" w:lineRule="auto"/>
-            </w:pPr>
-            <w:r>
-              <w:rPr>
-                <w:rFonts w:ascii="Consolas" w:hAnsi="Consolas"/>
-                <w:color w:val="1E293B"/>
-                <w:sz w:val="17"/>
-              </w:rPr>
-              <w:t>{</w:t>
-              <w:br/>
-              <w:t xml:space="preserve">  "id": "ord_20dfbddd",</w:t>
-              <w:br/>
-              <w:t xml:space="preserve">  "service_id": "srv_001",</w:t>
-              <w:br/>
-              <w:t xml:space="preserve">  "service_title": "Sewa Traktor Quick Kubota (Bajak &amp; Garu)",</w:t>
-              <w:br/>
-              <w:t xml:space="preserve">  "seller_id": "usr_traktor",</w:t>
-              <w:br/>
-              <w:t xml:space="preserve">  "seller_name": "Mas Bambang",</w:t>
-              <w:br/>
-              <w:t xml:space="preserve">  "buyer_id": "usr_petani",</w:t>
-              <w:br/>
-              <w:t xml:space="preserve">  "buyer_name": "Pak Joko (Petani Padi)",</w:t>
-              <w:br/>
-              <w:t xml:space="preserve">  "quantity": 1.0,</w:t>
-              <w:br/>
-              <w:t xml:space="preserve">  "unit": "/ Hektar",</w:t>
-              <w:br/>
-              <w:t xml:space="preserve">  "unit_price": 1200000,</w:t>
-              <w:br/>
-              <w:t xml:space="preserve">  "total_price": 1200000,</w:t>
-              <w:br/>
-              <w:t xml:space="preserve">  "payment_method": "COD / Bayar Saat Pengerjaan",</w:t>
-              <w:br/>
-              <w:t xml:space="preserve">  "delivery_notes": "Sawah Blok Krajan dekat saung, tolong Sabtu pagi.",</w:t>
-              <w:br/>
-              <w:t xml:space="preserve">  "status": "SEDANG_DIKIRIM",</w:t>
-              <w:br/>
-              <w:t xml:space="preserve">  "seller_notes": "Traktor sudah berangkat menuju sawah Pak Joko!",</w:t>
-              <w:br/>
-              <w:t xml:space="preserve">  "created_at": "21 Sep 2026, 09:47 WIB",</w:t>
-              <w:br/>
-              <w:t xml:space="preserve">  "status_updated_at": "21 Sep 2026, 09:48 WIB"</w:t>
-              <w:br/>
-              <w:t>}</w:t>
-            </w:r>
-          </w:p>
-        </w:tc>
-      </w:tr>
-    </w:tbl>
-    <w:p>
-      <w:pPr>
-        <w:spacing w:after="80"/>
-      </w:pPr>
-    </w:p>
-    <w:p>
-      <w:pPr>
-        <w:keepNext/>
-        <w:spacing w:before="200" w:after="60"/>
-      </w:pPr>
-      <w:r>
-        <w:rPr>
-          <w:rFonts w:ascii="Calibri" w:hAnsi="Calibri"/>
-          <w:b/>
-          <w:color w:val="2E7D32"/>
-          <w:sz w:val="25"/>
-        </w:rPr>
-        <w:t>5. Collection: `order_messages` (Diskusi Transaksi)</w:t>
-      </w:r>
-    </w:p>
-    <w:tbl>
-      <w:tblPr>
-        <w:tblW w:type="auto" w:w="0"/>
-        <w:jc w:val="center"/>
-        <w:tblLayout w:type="fixed"/>
-        <w:tblLook w:firstColumn="1" w:firstRow="1" w:lastColumn="0" w:lastRow="0" w:noHBand="0" w:noVBand="1" w:val="04A0"/>
-      </w:tblPr>
-      <w:tblGrid>
-        <w:gridCol w:w="9360"/>
-      </w:tblGrid>
-      <w:tr>
-        <w:tc>
-          <w:tcPr>
-            <w:tcW w:type="dxa" w:w="9360"/>
-            <w:shd w:fill="F8FAFC"/>
-            <w:tcMar>
-              <w:top w:w="140" w:type="dxa"/>
-              <w:bottom w:w="140" w:type="dxa"/>
-              <w:left w:w="180" w:type="dxa"/>
-              <w:right w:w="180" w:type="dxa"/>
-            </w:tcMar>
-            <w:tcBorders>
-              <w:top w:val="single" w:sz="6" w:space="0" w:color="CBD5E1"/>
-              <w:left w:val="single" w:sz="18" w:space="0" w:color="1B5E20"/>
-              <w:bottom w:val="single" w:sz="6" w:space="0" w:color="CBD5E1"/>
-              <w:right w:val="single" w:sz="6" w:space="0" w:color="CBD5E1"/>
-            </w:tcBorders>
-          </w:tcPr>
-          <w:p>
-            <w:pPr>
-              <w:spacing w:before="40" w:after="40" w:line="252" w:lineRule="auto"/>
-            </w:pPr>
-            <w:r>
-              <w:rPr>
-                <w:rFonts w:ascii="Consolas" w:hAnsi="Consolas"/>
-                <w:color w:val="1E293B"/>
-                <w:sz w:val="17"/>
-              </w:rPr>
-              <w:t>{</w:t>
-              <w:br/>
-              <w:t xml:space="preserve">  "id": "msg_01",</w:t>
-              <w:br/>
-              <w:t xml:space="preserve">  "order_id": "ord_20dfbddd",</w:t>
-              <w:br/>
-              <w:t xml:space="preserve">  "sender_id": "usr_petani",</w:t>
-              <w:br/>
-              <w:t xml:space="preserve">  "sender_name": "Pak Joko",</w:t>
-              <w:br/>
-              <w:t xml:space="preserve">  "sender_role": "PEMBELI",</w:t>
-              <w:br/>
-              <w:t xml:space="preserve">  "message": "Halo Mas Bambang, saya tunggu Sabtu jam 07.00 ya!",</w:t>
-              <w:br/>
-              <w:t xml:space="preserve">  "created_at": "21 Sep 2026, 09:50 WIB"</w:t>
-              <w:br/>
-              <w:t>}</w:t>
-            </w:r>
-          </w:p>
-        </w:tc>
-      </w:tr>
-    </w:tbl>
-    <w:p>
-      <w:pPr>
-        <w:spacing w:after="80"/>
-      </w:pPr>
-    </w:p>
-    <w:p>
-      <w:pPr>
-        <w:keepNext/>
-        <w:spacing w:before="200" w:after="60"/>
-      </w:pPr>
-      <w:r>
-        <w:rPr>
-          <w:rFonts w:ascii="Calibri" w:hAnsi="Calibri"/>
-          <w:b/>
-          <w:color w:val="2E7D32"/>
-          <w:sz w:val="25"/>
-        </w:rPr>
-        <w:t>6. Collection: `product_discussions` (Tanya Jawab Produk)</w:t>
-      </w:r>
-    </w:p>
-    <w:tbl>
-      <w:tblPr>
-        <w:tblW w:type="auto" w:w="0"/>
-        <w:jc w:val="center"/>
-        <w:tblLayout w:type="fixed"/>
-        <w:tblLook w:firstColumn="1" w:firstRow="1" w:lastColumn="0" w:lastRow="0" w:noHBand="0" w:noVBand="1" w:val="04A0"/>
-      </w:tblPr>
-      <w:tblGrid>
-        <w:gridCol w:w="9360"/>
-      </w:tblGrid>
-      <w:tr>
-        <w:tc>
-          <w:tcPr>
-            <w:tcW w:type="dxa" w:w="9360"/>
-            <w:shd w:fill="F8FAFC"/>
-            <w:tcMar>
-              <w:top w:w="140" w:type="dxa"/>
-              <w:bottom w:w="140" w:type="dxa"/>
-              <w:left w:w="180" w:type="dxa"/>
-              <w:right w:w="180" w:type="dxa"/>
-            </w:tcMar>
-            <w:tcBorders>
-              <w:top w:val="single" w:sz="6" w:space="0" w:color="CBD5E1"/>
-              <w:left w:val="single" w:sz="18" w:space="0" w:color="1B5E20"/>
-              <w:bottom w:val="single" w:sz="6" w:space="0" w:color="CBD5E1"/>
-              <w:right w:val="single" w:sz="6" w:space="0" w:color="CBD5E1"/>
-            </w:tcBorders>
-          </w:tcPr>
-          <w:p>
-            <w:pPr>
-              <w:spacing w:before="40" w:after="40" w:line="252" w:lineRule="auto"/>
-            </w:pPr>
-            <w:r>
-              <w:rPr>
-                <w:rFonts w:ascii="Consolas" w:hAnsi="Consolas"/>
-                <w:color w:val="1E293B"/>
-                <w:sz w:val="17"/>
-              </w:rPr>
-              <w:t>{</w:t>
-              <w:br/>
-              <w:t xml:space="preserve">  "id": "disc_01",</w:t>
-              <w:br/>
-              <w:t xml:space="preserve">  "service_id": "srv_001",</w:t>
-              <w:br/>
-              <w:t xml:space="preserve">  "user_id": "usr_petani",</w:t>
-              <w:br/>
-              <w:t xml:space="preserve">  "user_name": "Pak Joko",</w:t>
-              <w:br/>
-              <w:t xml:space="preserve">  "user_avatar": "🌾",</w:t>
-              <w:br/>
-              <w:t xml:space="preserve">  "question": "Apakah traktor bisa masuk galengan sempit 80cm?",</w:t>
-              <w:br/>
-              <w:t xml:space="preserve">  "reply": "Bisa Pak Joko, roda traktor quick kami bisa diatur sempit.",</w:t>
-              <w:br/>
-              <w:t xml:space="preserve">  "replied_by": "Mas Bambang (Penyedia Jasa)",</w:t>
-              <w:br/>
-              <w:t xml:space="preserve">  "replied_at": "21 Sep 2026, 09:52 WIB",</w:t>
-              <w:br/>
-              <w:t xml:space="preserve">  "created_at": "21 Sep 2026, 09:51 WIB"</w:t>
-              <w:br/>
-              <w:t>}</w:t>
-            </w:r>
-          </w:p>
-        </w:tc>
-      </w:tr>
-    </w:tbl>
-    <w:p>
-      <w:pPr>
-        <w:spacing w:after="80"/>
-      </w:pPr>
-    </w:p>
-    <w:p>
-      <w:pPr>
-        <w:keepNext/>
-        <w:spacing w:before="200" w:after="60"/>
-      </w:pPr>
-      <w:r>
-        <w:rPr>
-          <w:rFonts w:ascii="Calibri" w:hAnsi="Calibri"/>
-          <w:b/>
-          <w:color w:val="2E7D32"/>
-          <w:sz w:val="25"/>
-        </w:rPr>
-        <w:t>7. Collection: `notifications`</w:t>
-      </w:r>
-    </w:p>
-    <w:tbl>
-      <w:tblPr>
-        <w:tblW w:type="auto" w:w="0"/>
-        <w:jc w:val="center"/>
-        <w:tblLayout w:type="fixed"/>
-        <w:tblLook w:firstColumn="1" w:firstRow="1" w:lastColumn="0" w:lastRow="0" w:noHBand="0" w:noVBand="1" w:val="04A0"/>
-      </w:tblPr>
-      <w:tblGrid>
-        <w:gridCol w:w="9360"/>
-      </w:tblGrid>
-      <w:tr>
-        <w:tc>
-          <w:tcPr>
-            <w:tcW w:type="dxa" w:w="9360"/>
-            <w:shd w:fill="F8FAFC"/>
-            <w:tcMar>
-              <w:top w:w="140" w:type="dxa"/>
-              <w:bottom w:w="140" w:type="dxa"/>
-              <w:left w:w="180" w:type="dxa"/>
-              <w:right w:w="180" w:type="dxa"/>
-            </w:tcMar>
-            <w:tcBorders>
-              <w:top w:val="single" w:sz="6" w:space="0" w:color="CBD5E1"/>
-              <w:left w:val="single" w:sz="18" w:space="0" w:color="1B5E20"/>
-              <w:bottom w:val="single" w:sz="6" w:space="0" w:color="CBD5E1"/>
-              <w:right w:val="single" w:sz="6" w:space="0" w:color="CBD5E1"/>
-            </w:tcBorders>
-          </w:tcPr>
-          <w:p>
-            <w:pPr>
-              <w:spacing w:before="40" w:after="40" w:line="252" w:lineRule="auto"/>
-            </w:pPr>
-            <w:r>
-              <w:rPr>
-                <w:rFonts w:ascii="Consolas" w:hAnsi="Consolas"/>
-                <w:color w:val="1E293B"/>
-                <w:sz w:val="17"/>
-              </w:rPr>
-              <w:t>{</w:t>
-              <w:br/>
-              <w:t xml:space="preserve">  "id": "notif_01",</w:t>
-              <w:br/>
-              <w:t xml:space="preserve">  "user_id": "usr_petani",</w:t>
-              <w:br/>
-              <w:t xml:space="preserve">  "title": "Pesanan Mulai Dikirim / Berangkat 🚚",</w:t>
-              <w:br/>
-              <w:t xml:space="preserve">  "message": "Mas Bambang mengonfirmasi pesanan Sewa Traktor: [SEDANG_DIKIRIM]. Catatan: \"Traktor sudah berangkat!\"",</w:t>
-              <w:br/>
-              <w:t xml:space="preserve">  "type": "ORDER_STATUS",</w:t>
-              <w:br/>
-              <w:t xml:space="preserve">  "reference_id": "ord_20dfbddd",</w:t>
-              <w:br/>
-              <w:t xml:space="preserve">  "is_read": false,</w:t>
-              <w:br/>
-              <w:t xml:space="preserve">  "created_at": "21 Sep 2026, 09:48 WIB"</w:t>
-              <w:br/>
-              <w:t>}</w:t>
-            </w:r>
-          </w:p>
-        </w:tc>
-      </w:tr>
-    </w:tbl>
-    <w:p>
-      <w:pPr>
-        <w:spacing w:after="80"/>
-      </w:pPr>
-    </w:p>
-    <w:p>
-      <w:pPr>
-        <w:keepNext/>
-        <w:spacing w:before="280" w:after="80"/>
-      </w:pPr>
-      <w:r>
-        <w:rPr>
-          <w:rFonts w:ascii="Calibri" w:hAnsi="Calibri"/>
-          <w:b/>
-          <w:color w:val="1B5E20"/>
-          <w:sz w:val="30"/>
-        </w:rPr>
-        <w:t>6. Kebutuhan Non-Fungsional (NFR)</w:t>
-      </w:r>
-    </w:p>
-    <w:p>
-      <w:pPr>
-        <w:pStyle w:val="ListNumber"/>
-        <w:spacing w:before="40" w:after="60" w:line="276" w:lineRule="auto"/>
-      </w:pPr>
-      <w:r>
-        <w:rPr>
-          <w:b/>
-        </w:rPr>
-        <w:t>Responsivitas Format Web:</w:t>
+        <w:t>5. Kebutuhan Non-Fungsional (NFR)</w:t>
       </w:r>
     </w:p>
     <w:p>
       <w:pPr>
         <w:pStyle w:val="ListBullet"/>
         <w:spacing w:before="20" w:after="40" w:line="276" w:lineRule="auto"/>
-        <w:ind w:left="720"/>
       </w:pPr>
-      <w:r>
-        <w:t>Waktu muat awal (</w:t>
-      </w:r>
-      <w:r>
-        <w:rPr>
-          <w:i/>
-        </w:rPr>
-        <w:t>First Contentful Paint</w:t>
-      </w:r>
-      <w:r>
-        <w:t xml:space="preserve">) di bawah </w:t>
-      </w:r>
       <w:r>
         <w:rPr>
           <w:b/>
         </w:rPr>
-        <w:t>1,5 detik</w:t>
+        <w:t>NFR-01: Kinerja &amp; Waktu Respon:</w:t>
       </w:r>
+    </w:p>
+    <w:p>
+      <w:pPr>
+        <w:spacing w:before="20" w:after="80" w:line="276" w:lineRule="auto"/>
+      </w:pPr>
       <w:r>
-        <w:t>.</w:t>
+        <w:t>Waktu muat awal halaman di bawah 2 detik. Inferensi diagnosa daun AI via Google Gemini API selesai dalam waktu kurang dari 3 detik pada koneksi internet standar.</w:t>
       </w:r>
     </w:p>
     <w:p>
       <w:pPr>
         <w:pStyle w:val="ListBullet"/>
         <w:spacing w:before="20" w:after="40" w:line="276" w:lineRule="auto"/>
-        <w:ind w:left="720"/>
-      </w:pPr>
-      <w:r>
-        <w:t>Layout responsif fleksibel dari resolusi 360px (mobile) hingga 1920px (desktop monitor) tanpa pemotongan teks atau tombol tersembunyi.</w:t>
-      </w:r>
-    </w:p>
-    <w:p>
-      <w:pPr>
-        <w:pStyle w:val="ListNumber"/>
-        <w:spacing w:before="40" w:after="60" w:line="276" w:lineRule="auto"/>
-      </w:pPr>
-      <w:r>
-        <w:rPr>
-          <w:b/>
-        </w:rPr>
-        <w:t>Ketersediaan Offline Ringan &amp; Ketahanan Jaringan:</w:t>
-      </w:r>
-    </w:p>
-    <w:p>
-      <w:pPr>
-        <w:pStyle w:val="ListBullet"/>
-        <w:spacing w:before="20" w:after="40" w:line="276" w:lineRule="auto"/>
-        <w:ind w:left="720"/>
-      </w:pPr>
-      <w:r>
-        <w:t>Cache lokal state pengguna dan data sawah di sisi klien browser (</w:t>
-      </w:r>
-      <w:r>
-        <w:rPr>
-          <w:i/>
-        </w:rPr>
-        <w:t>Client-side reactive state</w:t>
-      </w:r>
-      <w:r>
-        <w:t>) sehingga tidak kehilangan form input jika jaringan seluler di sawah melemah.</w:t>
-      </w:r>
-    </w:p>
-    <w:p>
-      <w:pPr>
-        <w:pStyle w:val="ListNumber"/>
-        <w:spacing w:before="40" w:after="60" w:line="276" w:lineRule="auto"/>
       </w:pPr>
       <w:r>
         <w:rPr>
@@ -2881,10 +1530,10 @@
         <w:rPr>
           <w:i/>
         </w:rPr>
-        <w:t>Usabilitas Desain Antarmuka (</w:t>
+        <w:t>NFR-02: Keandalan &amp; Toleransi Kesalahan (</w:t>
       </w:r>
       <w:r>
-        <w:t>Ergonomics</w:t>
+        <w:t>Graceful Degradation</w:t>
       </w:r>
       <w:r>
         <w:rPr>
@@ -2900,61 +1549,79 @@
     </w:p>
     <w:p>
       <w:pPr>
-        <w:pStyle w:val="ListBullet"/>
-        <w:spacing w:before="20" w:after="40" w:line="276" w:lineRule="auto"/>
-        <w:ind w:left="720"/>
+        <w:spacing w:before="20" w:after="80" w:line="276" w:lineRule="auto"/>
       </w:pPr>
       <w:r>
-        <w:t xml:space="preserve">Menggunakan prinsip </w:t>
-      </w:r>
-      <w:r>
-        <w:rPr>
-          <w:i/>
-        </w:rPr>
-        <w:t>Farmer-First Design</w:t>
-      </w:r>
-      <w:r>
-        <w:t>: tombol sentuh besar (</w:t>
-      </w:r>
-      <w:r>
-        <w:rPr>
-          <w:i/>
-        </w:rPr>
-        <w:t>thumb-friendly</w:t>
-      </w:r>
-      <w:r>
-        <w:t>), teks berbobot tebal (</w:t>
-      </w:r>
-      <w:r>
-        <w:rPr>
-          <w:i/>
-        </w:rPr>
-        <w:t>font-black</w:t>
-      </w:r>
-      <w:r>
-        <w:t>), kontras tinggi, serta indikator visual emoji dan status berwarna cerah.</w:t>
-      </w:r>
-    </w:p>
-    <w:p>
-      <w:pPr>
-        <w:pStyle w:val="ListNumber"/>
-        <w:spacing w:before="40" w:after="60" w:line="276" w:lineRule="auto"/>
-      </w:pPr>
-      <w:r>
-        <w:rPr>
-          <w:b/>
-        </w:rPr>
-        <w:t>Keamanan Data Transaksi:</w:t>
+        <w:t>Sistem AI dilengkapi mesin fallback lokal berbasis aturan fitopatologi Kementan/IRRI sehingga sistem tetap dapat mendemonstrasikan diagnosa daun meskipun koneksi internet terputus di ruang sidang.</w:t>
       </w:r>
     </w:p>
     <w:p>
       <w:pPr>
         <w:pStyle w:val="ListBullet"/>
         <w:spacing w:before="20" w:after="40" w:line="276" w:lineRule="auto"/>
-        <w:ind w:left="720"/>
       </w:pPr>
       <w:r>
-        <w:t>Validasi data input ketat menggunakan skema Pydantic v2 di seluruh endpoint API.</w:t>
+        <w:rPr>
+          <w:b/>
+        </w:rPr>
+        <w:t>NFR-03: Kompatibilitas Antarmuka:</w:t>
+      </w:r>
+    </w:p>
+    <w:p>
+      <w:pPr>
+        <w:spacing w:before="20" w:after="80" w:line="276" w:lineRule="auto"/>
+      </w:pPr>
+      <w:r>
+        <w:t>Aplikasi 100% responsif pada layar laptop/desktop (resolusi 1366x768 s/d 1920x1080) dengan navigasi bilah samping (</w:t>
+      </w:r>
+      <w:r>
+        <w:rPr>
+          <w:i/>
+        </w:rPr>
+        <w:t>Sidebar</w:t>
+      </w:r>
+      <w:r>
+        <w:t>), serta ramah sentuhan pada layar ponsel pintar dengan navigasi bawah (</w:t>
+      </w:r>
+      <w:r>
+        <w:rPr>
+          <w:i/>
+        </w:rPr>
+        <w:t>Bottom Navigation</w:t>
+      </w:r>
+      <w:r>
+        <w:t>).</w:t>
+      </w:r>
+    </w:p>
+    <w:p>
+      <w:pPr>
+        <w:pStyle w:val="ListBullet"/>
+        <w:spacing w:before="20" w:after="40" w:line="276" w:lineRule="auto"/>
+      </w:pPr>
+      <w:r>
+        <w:rPr>
+          <w:b/>
+        </w:rPr>
+        <w:t>NFR-04: Portabilitas Data:</w:t>
+      </w:r>
+    </w:p>
+    <w:p>
+      <w:pPr>
+        <w:spacing w:before="20" w:after="80" w:line="276" w:lineRule="auto"/>
+      </w:pPr>
+      <w:r>
+        <w:t>Penyimpanan data lokal berbasis JSON (</w:t>
+      </w:r>
+      <w:r>
+        <w:rPr>
+          <w:rFonts w:ascii="Consolas" w:hAnsi="Consolas"/>
+          <w:color w:val="C7254E"/>
+          <w:sz w:val="19"/>
+        </w:rPr>
+        <w:t>local_db.json</w:t>
+      </w:r>
+      <w:r>
+        <w:t>) memungkinkan aplikasi dijalankan secara portabel tanpa memerlukan instalasi RDBMS server terpisah.</w:t>
       </w:r>
     </w:p>
     <w:p>
@@ -2969,7 +1636,7 @@
           <w:color w:val="1B5E20"/>
           <w:sz w:val="30"/>
         </w:rPr>
-        <w:t>7. Matriks Pembagian Kerja Tim Capstone (RACI)</w:t>
+        <w:t>6. Matriks Pengujian &amp; Kriteria Keberhasilan Capstone</w:t>
       </w:r>
     </w:p>
     <w:tbl>
@@ -2980,14 +1647,15 @@
         <w:tblLook w:firstColumn="1" w:firstRow="1" w:lastColumn="0" w:lastRow="0" w:noHBand="0" w:noVBand="1" w:val="04A0"/>
       </w:tblPr>
       <w:tblGrid>
-        <w:gridCol w:w="3120"/>
-        <w:gridCol w:w="3120"/>
-        <w:gridCol w:w="3120"/>
+        <w:gridCol w:w="2340"/>
+        <w:gridCol w:w="2340"/>
+        <w:gridCol w:w="2340"/>
+        <w:gridCol w:w="2340"/>
       </w:tblGrid>
       <w:tr>
         <w:tc>
           <w:tcPr>
-            <w:tcW w:type="dxa" w:w="3120"/>
+            <w:tcW w:type="dxa" w:w="2340"/>
             <w:tcMar>
               <w:top w:w="90" w:type="dxa"/>
               <w:bottom w:w="90" w:type="dxa"/>
@@ -3012,13 +1680,13 @@
                 <w:color w:val="FFFFFF"/>
                 <w:sz w:val="19"/>
               </w:rPr>
-              <w:t>Anggota Tim</w:t>
+              <w:t>ID</w:t>
             </w:r>
           </w:p>
         </w:tc>
         <w:tc>
           <w:tcPr>
-            <w:tcW w:type="dxa" w:w="3120"/>
+            <w:tcW w:type="dxa" w:w="2340"/>
             <w:tcMar>
               <w:top w:w="90" w:type="dxa"/>
               <w:bottom w:w="90" w:type="dxa"/>
@@ -3043,13 +1711,13 @@
                 <w:color w:val="FFFFFF"/>
                 <w:sz w:val="19"/>
               </w:rPr>
-              <w:t>Peran Spesifik</w:t>
+              <w:t>Fitur yang Diuji</w:t>
             </w:r>
           </w:p>
         </w:tc>
         <w:tc>
           <w:tcPr>
-            <w:tcW w:type="dxa" w:w="3120"/>
+            <w:tcW w:type="dxa" w:w="2340"/>
             <w:tcMar>
               <w:top w:w="90" w:type="dxa"/>
               <w:bottom w:w="90" w:type="dxa"/>
@@ -3074,7 +1742,38 @@
                 <w:color w:val="FFFFFF"/>
                 <w:sz w:val="19"/>
               </w:rPr>
-              <w:t>Tanggung Jawab Utama Terverifikasi</w:t>
+              <w:t>Skenario Pengujian</w:t>
+            </w:r>
+          </w:p>
+        </w:tc>
+        <w:tc>
+          <w:tcPr>
+            <w:tcW w:type="dxa" w:w="2340"/>
+            <w:tcMar>
+              <w:top w:w="90" w:type="dxa"/>
+              <w:bottom w:w="90" w:type="dxa"/>
+              <w:left w:w="120" w:type="dxa"/>
+              <w:right w:w="120" w:type="dxa"/>
+            </w:tcMar>
+            <w:tcBorders>
+              <w:top w:val="single" w:sz="4" w:space="0" w:color="1B5E20"/>
+              <w:left w:val="single" w:sz="4" w:space="0" w:color="1B5E20"/>
+              <w:bottom w:val="single" w:sz="4" w:space="0" w:color="1B5E20"/>
+              <w:right w:val="single" w:sz="4" w:space="0" w:color="1B5E20"/>
+            </w:tcBorders>
+            <w:shd w:fill="1B5E20"/>
+          </w:tcPr>
+          <w:p>
+            <w:pPr>
+              <w:spacing w:before="40" w:after="40" w:line="264" w:lineRule="auto"/>
+            </w:pPr>
+            <w:r>
+              <w:rPr>
+                <w:b/>
+                <w:color w:val="FFFFFF"/>
+                <w:sz w:val="19"/>
+              </w:rPr>
+              <w:t>Hasil yang Diharapkan</w:t>
             </w:r>
           </w:p>
         </w:tc>
@@ -3082,7 +1781,7 @@
       <w:tr>
         <w:tc>
           <w:tcPr>
-            <w:tcW w:type="dxa" w:w="3120"/>
+            <w:tcW w:type="dxa" w:w="2340"/>
             <w:tcMar>
               <w:top w:w="90" w:type="dxa"/>
               <w:bottom w:w="90" w:type="dxa"/>
@@ -3106,13 +1805,221 @@
                 <w:b/>
                 <w:sz w:val="19"/>
               </w:rPr>
-              <w:t>Anggota 1</w:t>
+              <w:t>TC-01</w:t>
             </w:r>
           </w:p>
         </w:tc>
         <w:tc>
           <w:tcPr>
-            <w:tcW w:type="dxa" w:w="3120"/>
+            <w:tcW w:type="dxa" w:w="2340"/>
+            <w:tcMar>
+              <w:top w:w="90" w:type="dxa"/>
+              <w:bottom w:w="90" w:type="dxa"/>
+              <w:left w:w="120" w:type="dxa"/>
+              <w:right w:w="120" w:type="dxa"/>
+            </w:tcMar>
+            <w:tcBorders>
+              <w:top w:val="single" w:sz="4" w:space="0" w:color="CBD5E1"/>
+              <w:left w:val="single" w:sz="4" w:space="0" w:color="CBD5E1"/>
+              <w:bottom w:val="single" w:sz="4" w:space="0" w:color="CBD5E1"/>
+              <w:right w:val="single" w:sz="4" w:space="0" w:color="CBD5E1"/>
+            </w:tcBorders>
+            <w:shd w:fill="F8FAFC"/>
+          </w:tcPr>
+          <w:p>
+            <w:pPr>
+              <w:spacing w:before="40" w:after="40" w:line="264" w:lineRule="auto"/>
+            </w:pPr>
+            <w:r>
+              <w:rPr>
+                <w:sz w:val="19"/>
+              </w:rPr>
+              <w:t>Autentikasi</w:t>
+            </w:r>
+          </w:p>
+        </w:tc>
+        <w:tc>
+          <w:tcPr>
+            <w:tcW w:type="dxa" w:w="2340"/>
+            <w:tcMar>
+              <w:top w:w="90" w:type="dxa"/>
+              <w:bottom w:w="90" w:type="dxa"/>
+              <w:left w:w="120" w:type="dxa"/>
+              <w:right w:w="120" w:type="dxa"/>
+            </w:tcMar>
+            <w:tcBorders>
+              <w:top w:val="single" w:sz="4" w:space="0" w:color="CBD5E1"/>
+              <w:left w:val="single" w:sz="4" w:space="0" w:color="CBD5E1"/>
+              <w:bottom w:val="single" w:sz="4" w:space="0" w:color="CBD5E1"/>
+              <w:right w:val="single" w:sz="4" w:space="0" w:color="CBD5E1"/>
+            </w:tcBorders>
+            <w:shd w:fill="F8FAFC"/>
+          </w:tcPr>
+          <w:p>
+            <w:pPr>
+              <w:spacing w:before="40" w:after="40" w:line="264" w:lineRule="auto"/>
+            </w:pPr>
+            <w:r>
+              <w:rPr>
+                <w:sz w:val="19"/>
+              </w:rPr>
+              <w:t>Login dengan nomor telepon petani</w:t>
+            </w:r>
+          </w:p>
+        </w:tc>
+        <w:tc>
+          <w:tcPr>
+            <w:tcW w:type="dxa" w:w="2340"/>
+            <w:tcMar>
+              <w:top w:w="90" w:type="dxa"/>
+              <w:bottom w:w="90" w:type="dxa"/>
+              <w:left w:w="120" w:type="dxa"/>
+              <w:right w:w="120" w:type="dxa"/>
+            </w:tcMar>
+            <w:tcBorders>
+              <w:top w:val="single" w:sz="4" w:space="0" w:color="CBD5E1"/>
+              <w:left w:val="single" w:sz="4" w:space="0" w:color="CBD5E1"/>
+              <w:bottom w:val="single" w:sz="4" w:space="0" w:color="CBD5E1"/>
+              <w:right w:val="single" w:sz="4" w:space="0" w:color="CBD5E1"/>
+            </w:tcBorders>
+            <w:shd w:fill="F8FAFC"/>
+          </w:tcPr>
+          <w:p>
+            <w:pPr>
+              <w:spacing w:before="40" w:after="40" w:line="264" w:lineRule="auto"/>
+            </w:pPr>
+            <w:r>
+              <w:rPr>
+                <w:sz w:val="19"/>
+              </w:rPr>
+              <w:t>Dashboard monitoring sawah terbuka langsung</w:t>
+            </w:r>
+          </w:p>
+        </w:tc>
+      </w:tr>
+      <w:tr>
+        <w:tc>
+          <w:tcPr>
+            <w:tcW w:type="dxa" w:w="2340"/>
+            <w:tcMar>
+              <w:top w:w="90" w:type="dxa"/>
+              <w:bottom w:w="90" w:type="dxa"/>
+              <w:left w:w="120" w:type="dxa"/>
+              <w:right w:w="120" w:type="dxa"/>
+            </w:tcMar>
+            <w:tcBorders>
+              <w:top w:val="single" w:sz="4" w:space="0" w:color="CBD5E1"/>
+              <w:left w:val="single" w:sz="4" w:space="0" w:color="CBD5E1"/>
+              <w:bottom w:val="single" w:sz="4" w:space="0" w:color="CBD5E1"/>
+              <w:right w:val="single" w:sz="4" w:space="0" w:color="CBD5E1"/>
+            </w:tcBorders>
+            <w:shd w:fill="FFFFFF"/>
+          </w:tcPr>
+          <w:p>
+            <w:pPr>
+              <w:spacing w:before="40" w:after="40" w:line="264" w:lineRule="auto"/>
+            </w:pPr>
+            <w:r>
+              <w:rPr>
+                <w:b/>
+                <w:sz w:val="19"/>
+              </w:rPr>
+              <w:t>TC-02</w:t>
+            </w:r>
+          </w:p>
+        </w:tc>
+        <w:tc>
+          <w:tcPr>
+            <w:tcW w:type="dxa" w:w="2340"/>
+            <w:tcMar>
+              <w:top w:w="90" w:type="dxa"/>
+              <w:bottom w:w="90" w:type="dxa"/>
+              <w:left w:w="120" w:type="dxa"/>
+              <w:right w:w="120" w:type="dxa"/>
+            </w:tcMar>
+            <w:tcBorders>
+              <w:top w:val="single" w:sz="4" w:space="0" w:color="CBD5E1"/>
+              <w:left w:val="single" w:sz="4" w:space="0" w:color="CBD5E1"/>
+              <w:bottom w:val="single" w:sz="4" w:space="0" w:color="CBD5E1"/>
+              <w:right w:val="single" w:sz="4" w:space="0" w:color="CBD5E1"/>
+            </w:tcBorders>
+            <w:shd w:fill="FFFFFF"/>
+          </w:tcPr>
+          <w:p>
+            <w:pPr>
+              <w:spacing w:before="40" w:after="40" w:line="264" w:lineRule="auto"/>
+            </w:pPr>
+            <w:r>
+              <w:rPr>
+                <w:sz w:val="19"/>
+              </w:rPr>
+              <w:t>Cuaca &amp; Irigasi</w:t>
+            </w:r>
+          </w:p>
+        </w:tc>
+        <w:tc>
+          <w:tcPr>
+            <w:tcW w:type="dxa" w:w="2340"/>
+            <w:tcMar>
+              <w:top w:w="90" w:type="dxa"/>
+              <w:bottom w:w="90" w:type="dxa"/>
+              <w:left w:w="120" w:type="dxa"/>
+              <w:right w:w="120" w:type="dxa"/>
+            </w:tcMar>
+            <w:tcBorders>
+              <w:top w:val="single" w:sz="4" w:space="0" w:color="CBD5E1"/>
+              <w:left w:val="single" w:sz="4" w:space="0" w:color="CBD5E1"/>
+              <w:bottom w:val="single" w:sz="4" w:space="0" w:color="CBD5E1"/>
+              <w:right w:val="single" w:sz="4" w:space="0" w:color="CBD5E1"/>
+            </w:tcBorders>
+            <w:shd w:fill="FFFFFF"/>
+          </w:tcPr>
+          <w:p>
+            <w:pPr>
+              <w:spacing w:before="40" w:after="40" w:line="264" w:lineRule="auto"/>
+            </w:pPr>
+            <w:r>
+              <w:rPr>
+                <w:sz w:val="19"/>
+              </w:rPr>
+              <w:t>Deteksi GPS lokasi sawah</w:t>
+            </w:r>
+          </w:p>
+        </w:tc>
+        <w:tc>
+          <w:tcPr>
+            <w:tcW w:type="dxa" w:w="2340"/>
+            <w:tcMar>
+              <w:top w:w="90" w:type="dxa"/>
+              <w:bottom w:w="90" w:type="dxa"/>
+              <w:left w:w="120" w:type="dxa"/>
+              <w:right w:w="120" w:type="dxa"/>
+            </w:tcMar>
+            <w:tcBorders>
+              <w:top w:val="single" w:sz="4" w:space="0" w:color="CBD5E1"/>
+              <w:left w:val="single" w:sz="4" w:space="0" w:color="CBD5E1"/>
+              <w:bottom w:val="single" w:sz="4" w:space="0" w:color="CBD5E1"/>
+              <w:right w:val="single" w:sz="4" w:space="0" w:color="CBD5E1"/>
+            </w:tcBorders>
+            <w:shd w:fill="FFFFFF"/>
+          </w:tcPr>
+          <w:p>
+            <w:pPr>
+              <w:spacing w:before="40" w:after="40" w:line="264" w:lineRule="auto"/>
+            </w:pPr>
+            <w:r>
+              <w:rPr>
+                <w:sz w:val="19"/>
+              </w:rPr>
+              <w:t>Data suhu, kelembaban, dan rekomendasi irigasi terupdate</w:t>
+            </w:r>
+          </w:p>
+        </w:tc>
+      </w:tr>
+      <w:tr>
+        <w:tc>
+          <w:tcPr>
+            <w:tcW w:type="dxa" w:w="2340"/>
             <w:tcMar>
               <w:top w:w="90" w:type="dxa"/>
               <w:bottom w:w="90" w:type="dxa"/>
@@ -3136,13 +2043,13 @@
                 <w:b/>
                 <w:sz w:val="19"/>
               </w:rPr>
-              <w:t>Frontend Web &amp; UI/UX Lead</w:t>
+              <w:t>TC-03</w:t>
             </w:r>
           </w:p>
         </w:tc>
         <w:tc>
           <w:tcPr>
-            <w:tcW w:type="dxa" w:w="3120"/>
+            <w:tcW w:type="dxa" w:w="2340"/>
             <w:tcMar>
               <w:top w:w="90" w:type="dxa"/>
               <w:bottom w:w="90" w:type="dxa"/>
@@ -3165,70 +2072,65 @@
               <w:rPr>
                 <w:sz w:val="19"/>
               </w:rPr>
-              <w:t>- Mengembangkan antarmuka Vue 3 + Tailwind CSS untuk 4 menu utama (</w:t>
-            </w:r>
-            <w:r>
-              <w:rPr>
-                <w:i/>
-                <w:sz w:val="19"/>
-              </w:rPr>
-              <w:t>Jejaring, Monitoring, Katalog, Profil</w:t>
-            </w:r>
-            <w:r>
-              <w:rPr>
-                <w:sz w:val="19"/>
-              </w:rPr>
-              <w:t>).</w:t>
+              <w:t>Rencana Tani AI</w:t>
             </w:r>
           </w:p>
+        </w:tc>
+        <w:tc>
+          <w:tcPr>
+            <w:tcW w:type="dxa" w:w="2340"/>
+            <w:tcMar>
+              <w:top w:w="90" w:type="dxa"/>
+              <w:bottom w:w="90" w:type="dxa"/>
+              <w:left w:w="120" w:type="dxa"/>
+              <w:right w:w="120" w:type="dxa"/>
+            </w:tcMar>
+            <w:tcBorders>
+              <w:top w:val="single" w:sz="4" w:space="0" w:color="CBD5E1"/>
+              <w:left w:val="single" w:sz="4" w:space="0" w:color="CBD5E1"/>
+              <w:bottom w:val="single" w:sz="4" w:space="0" w:color="CBD5E1"/>
+              <w:right w:val="single" w:sz="4" w:space="0" w:color="CBD5E1"/>
+            </w:tcBorders>
+            <w:shd w:fill="F8FAFC"/>
+          </w:tcPr>
           <w:p>
             <w:pPr>
-              <w:spacing w:before="20" w:after="20" w:line="264" w:lineRule="auto"/>
+              <w:spacing w:before="40" w:after="40" w:line="264" w:lineRule="auto"/>
             </w:pPr>
             <w:r>
               <w:rPr>
                 <w:sz w:val="19"/>
               </w:rPr>
-              <w:t>- Membangun komponen responsif desktop navbar &amp; bottom nav mobile.</w:t>
+              <w:t>Input luas lahan 1.2 Ha pada sawah irigasi</w:t>
             </w:r>
           </w:p>
+        </w:tc>
+        <w:tc>
+          <w:tcPr>
+            <w:tcW w:type="dxa" w:w="2340"/>
+            <w:tcMar>
+              <w:top w:w="90" w:type="dxa"/>
+              <w:bottom w:w="90" w:type="dxa"/>
+              <w:left w:w="120" w:type="dxa"/>
+              <w:right w:w="120" w:type="dxa"/>
+            </w:tcMar>
+            <w:tcBorders>
+              <w:top w:val="single" w:sz="4" w:space="0" w:color="CBD5E1"/>
+              <w:left w:val="single" w:sz="4" w:space="0" w:color="CBD5E1"/>
+              <w:bottom w:val="single" w:sz="4" w:space="0" w:color="CBD5E1"/>
+              <w:right w:val="single" w:sz="4" w:space="0" w:color="CBD5E1"/>
+            </w:tcBorders>
+            <w:shd w:fill="F8FAFC"/>
+          </w:tcPr>
           <w:p>
             <w:pPr>
-              <w:spacing w:before="20" w:after="20" w:line="264" w:lineRule="auto"/>
+              <w:spacing w:before="40" w:after="40" w:line="264" w:lineRule="auto"/>
             </w:pPr>
             <w:r>
               <w:rPr>
                 <w:sz w:val="19"/>
               </w:rPr>
-              <w:t>- Membangun dialog obrolan transaksi (</w:t>
-            </w:r>
-            <w:r>
-              <w:rPr>
-                <w:rFonts w:ascii="Consolas" w:hAnsi="Consolas"/>
-                <w:color w:val="C7254E"/>
-                <w:sz w:val="19"/>
-              </w:rPr>
-              <w:t>OrderChatModal</w:t>
-            </w:r>
-            <w:r>
-              <w:rPr>
-                <w:sz w:val="19"/>
-              </w:rPr>
-              <w:t>) dan diskusi produk (</w:t>
-            </w:r>
-            <w:r>
-              <w:rPr>
-                <w:rFonts w:ascii="Consolas" w:hAnsi="Consolas"/>
-                <w:color w:val="C7254E"/>
-                <w:sz w:val="19"/>
-              </w:rPr>
-              <w:t>ProductDiscussionModal</w:t>
-            </w:r>
-            <w:r>
-              <w:rPr>
-                <w:sz w:val="19"/>
-              </w:rPr>
-              <w:t>).</w:t>
+              <w:t>RAB 12 item, jadwal 5 fase HST, dan kalkulasi laba/ROI tampil presisi</w:t>
             </w:r>
           </w:p>
         </w:tc>
@@ -3236,7 +2138,7 @@
       <w:tr>
         <w:tc>
           <w:tcPr>
-            <w:tcW w:type="dxa" w:w="3120"/>
+            <w:tcW w:type="dxa" w:w="2340"/>
             <w:tcMar>
               <w:top w:w="90" w:type="dxa"/>
               <w:bottom w:w="90" w:type="dxa"/>
@@ -3260,13 +2162,228 @@
                 <w:b/>
                 <w:sz w:val="19"/>
               </w:rPr>
-              <w:t>Anggota 2</w:t>
+              <w:t>TC-04</w:t>
             </w:r>
           </w:p>
         </w:tc>
         <w:tc>
           <w:tcPr>
-            <w:tcW w:type="dxa" w:w="3120"/>
+            <w:tcW w:type="dxa" w:w="2340"/>
+            <w:tcMar>
+              <w:top w:w="90" w:type="dxa"/>
+              <w:bottom w:w="90" w:type="dxa"/>
+              <w:left w:w="120" w:type="dxa"/>
+              <w:right w:w="120" w:type="dxa"/>
+            </w:tcMar>
+            <w:tcBorders>
+              <w:top w:val="single" w:sz="4" w:space="0" w:color="CBD5E1"/>
+              <w:left w:val="single" w:sz="4" w:space="0" w:color="CBD5E1"/>
+              <w:bottom w:val="single" w:sz="4" w:space="0" w:color="CBD5E1"/>
+              <w:right w:val="single" w:sz="4" w:space="0" w:color="CBD5E1"/>
+            </w:tcBorders>
+            <w:shd w:fill="FFFFFF"/>
+          </w:tcPr>
+          <w:p>
+            <w:pPr>
+              <w:spacing w:before="40" w:after="40" w:line="264" w:lineRule="auto"/>
+            </w:pPr>
+            <w:r>
+              <w:rPr>
+                <w:sz w:val="19"/>
+              </w:rPr>
+              <w:t>Dokter Tani AI</w:t>
+            </w:r>
+          </w:p>
+        </w:tc>
+        <w:tc>
+          <w:tcPr>
+            <w:tcW w:type="dxa" w:w="2340"/>
+            <w:tcMar>
+              <w:top w:w="90" w:type="dxa"/>
+              <w:bottom w:w="90" w:type="dxa"/>
+              <w:left w:w="120" w:type="dxa"/>
+              <w:right w:w="120" w:type="dxa"/>
+            </w:tcMar>
+            <w:tcBorders>
+              <w:top w:val="single" w:sz="4" w:space="0" w:color="CBD5E1"/>
+              <w:left w:val="single" w:sz="4" w:space="0" w:color="CBD5E1"/>
+              <w:bottom w:val="single" w:sz="4" w:space="0" w:color="CBD5E1"/>
+              <w:right w:val="single" w:sz="4" w:space="0" w:color="CBD5E1"/>
+            </w:tcBorders>
+            <w:shd w:fill="FFFFFF"/>
+          </w:tcPr>
+          <w:p>
+            <w:pPr>
+              <w:spacing w:before="40" w:after="40" w:line="264" w:lineRule="auto"/>
+            </w:pPr>
+            <w:r>
+              <w:rPr>
+                <w:sz w:val="19"/>
+              </w:rPr>
+              <w:t>Unggah citra daun padi bergejala kresek</w:t>
+            </w:r>
+          </w:p>
+        </w:tc>
+        <w:tc>
+          <w:tcPr>
+            <w:tcW w:type="dxa" w:w="2340"/>
+            <w:tcMar>
+              <w:top w:w="90" w:type="dxa"/>
+              <w:bottom w:w="90" w:type="dxa"/>
+              <w:left w:w="120" w:type="dxa"/>
+              <w:right w:w="120" w:type="dxa"/>
+            </w:tcMar>
+            <w:tcBorders>
+              <w:top w:val="single" w:sz="4" w:space="0" w:color="CBD5E1"/>
+              <w:left w:val="single" w:sz="4" w:space="0" w:color="CBD5E1"/>
+              <w:bottom w:val="single" w:sz="4" w:space="0" w:color="CBD5E1"/>
+              <w:right w:val="single" w:sz="4" w:space="0" w:color="CBD5E1"/>
+            </w:tcBorders>
+            <w:shd w:fill="FFFFFF"/>
+          </w:tcPr>
+          <w:p>
+            <w:pPr>
+              <w:spacing w:before="40" w:after="40" w:line="264" w:lineRule="auto"/>
+            </w:pPr>
+            <w:r>
+              <w:rPr>
+                <w:sz w:val="19"/>
+              </w:rPr>
+              <w:t>Google Gemini API mengembalikan diagnosa Hawar Daun Bakteri beserta rekomendasi bakterisida tembaga</w:t>
+            </w:r>
+          </w:p>
+        </w:tc>
+      </w:tr>
+      <w:tr>
+        <w:tc>
+          <w:tcPr>
+            <w:tcW w:type="dxa" w:w="2340"/>
+            <w:tcMar>
+              <w:top w:w="90" w:type="dxa"/>
+              <w:bottom w:w="90" w:type="dxa"/>
+              <w:left w:w="120" w:type="dxa"/>
+              <w:right w:w="120" w:type="dxa"/>
+            </w:tcMar>
+            <w:tcBorders>
+              <w:top w:val="single" w:sz="4" w:space="0" w:color="CBD5E1"/>
+              <w:left w:val="single" w:sz="4" w:space="0" w:color="CBD5E1"/>
+              <w:bottom w:val="single" w:sz="4" w:space="0" w:color="CBD5E1"/>
+              <w:right w:val="single" w:sz="4" w:space="0" w:color="CBD5E1"/>
+            </w:tcBorders>
+            <w:shd w:fill="F8FAFC"/>
+          </w:tcPr>
+          <w:p>
+            <w:pPr>
+              <w:spacing w:before="40" w:after="40" w:line="264" w:lineRule="auto"/>
+            </w:pPr>
+            <w:r>
+              <w:rPr>
+                <w:b/>
+                <w:sz w:val="19"/>
+              </w:rPr>
+              <w:t>TC-05</w:t>
+            </w:r>
+          </w:p>
+        </w:tc>
+        <w:tc>
+          <w:tcPr>
+            <w:tcW w:type="dxa" w:w="2340"/>
+            <w:tcMar>
+              <w:top w:w="90" w:type="dxa"/>
+              <w:bottom w:w="90" w:type="dxa"/>
+              <w:left w:w="120" w:type="dxa"/>
+              <w:right w:w="120" w:type="dxa"/>
+            </w:tcMar>
+            <w:tcBorders>
+              <w:top w:val="single" w:sz="4" w:space="0" w:color="CBD5E1"/>
+              <w:left w:val="single" w:sz="4" w:space="0" w:color="CBD5E1"/>
+              <w:bottom w:val="single" w:sz="4" w:space="0" w:color="CBD5E1"/>
+              <w:right w:val="single" w:sz="4" w:space="0" w:color="CBD5E1"/>
+            </w:tcBorders>
+            <w:shd w:fill="F8FAFC"/>
+          </w:tcPr>
+          <w:p>
+            <w:pPr>
+              <w:spacing w:before="40" w:after="40" w:line="264" w:lineRule="auto"/>
+            </w:pPr>
+            <w:r>
+              <w:rPr>
+                <w:sz w:val="19"/>
+              </w:rPr>
+              <w:t>Fallback Dokter Tani</w:t>
+            </w:r>
+          </w:p>
+        </w:tc>
+        <w:tc>
+          <w:tcPr>
+            <w:tcW w:type="dxa" w:w="2340"/>
+            <w:tcMar>
+              <w:top w:w="90" w:type="dxa"/>
+              <w:bottom w:w="90" w:type="dxa"/>
+              <w:left w:w="120" w:type="dxa"/>
+              <w:right w:w="120" w:type="dxa"/>
+            </w:tcMar>
+            <w:tcBorders>
+              <w:top w:val="single" w:sz="4" w:space="0" w:color="CBD5E1"/>
+              <w:left w:val="single" w:sz="4" w:space="0" w:color="CBD5E1"/>
+              <w:bottom w:val="single" w:sz="4" w:space="0" w:color="CBD5E1"/>
+              <w:right w:val="single" w:sz="4" w:space="0" w:color="CBD5E1"/>
+            </w:tcBorders>
+            <w:shd w:fill="F8FAFC"/>
+          </w:tcPr>
+          <w:p>
+            <w:pPr>
+              <w:spacing w:before="40" w:after="40" w:line="264" w:lineRule="auto"/>
+            </w:pPr>
+            <w:r>
+              <w:rPr>
+                <w:sz w:val="19"/>
+              </w:rPr>
+              <w:t>Matikan koneksi internet &amp; pilih sampel daun</w:t>
+            </w:r>
+          </w:p>
+        </w:tc>
+        <w:tc>
+          <w:tcPr>
+            <w:tcW w:type="dxa" w:w="2340"/>
+            <w:tcMar>
+              <w:top w:w="90" w:type="dxa"/>
+              <w:bottom w:w="90" w:type="dxa"/>
+              <w:left w:w="120" w:type="dxa"/>
+              <w:right w:w="120" w:type="dxa"/>
+            </w:tcMar>
+            <w:tcBorders>
+              <w:top w:val="single" w:sz="4" w:space="0" w:color="CBD5E1"/>
+              <w:left w:val="single" w:sz="4" w:space="0" w:color="CBD5E1"/>
+              <w:bottom w:val="single" w:sz="4" w:space="0" w:color="CBD5E1"/>
+              <w:right w:val="single" w:sz="4" w:space="0" w:color="CBD5E1"/>
+            </w:tcBorders>
+            <w:shd w:fill="F8FAFC"/>
+          </w:tcPr>
+          <w:p>
+            <w:pPr>
+              <w:spacing w:before="40" w:after="40" w:line="264" w:lineRule="auto"/>
+            </w:pPr>
+            <w:r>
+              <w:rPr>
+                <w:sz w:val="19"/>
+              </w:rPr>
+              <w:t xml:space="preserve">Sistem lokal menampilkan diagnosa akurat tanpa menimbulkan </w:t>
+            </w:r>
+            <w:r>
+              <w:rPr>
+                <w:i/>
+                <w:sz w:val="19"/>
+              </w:rPr>
+              <w:t>crash</w:t>
+            </w:r>
+          </w:p>
+        </w:tc>
+      </w:tr>
+      <w:tr>
+        <w:tc>
+          <w:tcPr>
+            <w:tcW w:type="dxa" w:w="2340"/>
             <w:tcMar>
               <w:top w:w="90" w:type="dxa"/>
               <w:bottom w:w="90" w:type="dxa"/>
@@ -3290,13 +2407,13 @@
                 <w:b/>
                 <w:sz w:val="19"/>
               </w:rPr>
-              <w:t>Backend &amp; Database Architect</w:t>
+              <w:t>TC-06</w:t>
             </w:r>
           </w:p>
         </w:tc>
         <w:tc>
           <w:tcPr>
-            <w:tcW w:type="dxa" w:w="3120"/>
+            <w:tcW w:type="dxa" w:w="2340"/>
             <w:tcMar>
               <w:top w:w="90" w:type="dxa"/>
               <w:bottom w:w="90" w:type="dxa"/>
@@ -3319,43 +2436,65 @@
               <w:rPr>
                 <w:sz w:val="19"/>
               </w:rPr>
-              <w:t>- Membangun REST API FastAPI terstruktur untuk modul farmlands, catalog, checkout, notifications, dan discussion thread.</w:t>
+              <w:t>Buku Tani</w:t>
             </w:r>
           </w:p>
+        </w:tc>
+        <w:tc>
+          <w:tcPr>
+            <w:tcW w:type="dxa" w:w="2340"/>
+            <w:tcMar>
+              <w:top w:w="90" w:type="dxa"/>
+              <w:bottom w:w="90" w:type="dxa"/>
+              <w:left w:w="120" w:type="dxa"/>
+              <w:right w:w="120" w:type="dxa"/>
+            </w:tcMar>
+            <w:tcBorders>
+              <w:top w:val="single" w:sz="4" w:space="0" w:color="CBD5E1"/>
+              <w:left w:val="single" w:sz="4" w:space="0" w:color="CBD5E1"/>
+              <w:bottom w:val="single" w:sz="4" w:space="0" w:color="CBD5E1"/>
+              <w:right w:val="single" w:sz="4" w:space="0" w:color="CBD5E1"/>
+            </w:tcBorders>
+            <w:shd w:fill="FFFFFF"/>
+          </w:tcPr>
           <w:p>
             <w:pPr>
-              <w:spacing w:before="20" w:after="20" w:line="264" w:lineRule="auto"/>
+              <w:spacing w:before="40" w:after="40" w:line="264" w:lineRule="auto"/>
             </w:pPr>
             <w:r>
               <w:rPr>
                 <w:sz w:val="19"/>
               </w:rPr>
-              <w:t>- Mendesain skema data Pydantic v2 dan relasi koleksi data database.</w:t>
+              <w:t>Atur stok pupuk dengan tombol (-) hingga di bawah batas</w:t>
             </w:r>
           </w:p>
+        </w:tc>
+        <w:tc>
+          <w:tcPr>
+            <w:tcW w:type="dxa" w:w="2340"/>
+            <w:tcMar>
+              <w:top w:w="90" w:type="dxa"/>
+              <w:bottom w:w="90" w:type="dxa"/>
+              <w:left w:w="120" w:type="dxa"/>
+              <w:right w:w="120" w:type="dxa"/>
+            </w:tcMar>
+            <w:tcBorders>
+              <w:top w:val="single" w:sz="4" w:space="0" w:color="CBD5E1"/>
+              <w:left w:val="single" w:sz="4" w:space="0" w:color="CBD5E1"/>
+              <w:bottom w:val="single" w:sz="4" w:space="0" w:color="CBD5E1"/>
+              <w:right w:val="single" w:sz="4" w:space="0" w:color="CBD5E1"/>
+            </w:tcBorders>
+            <w:shd w:fill="FFFFFF"/>
+          </w:tcPr>
           <w:p>
             <w:pPr>
-              <w:spacing w:before="20" w:after="20" w:line="264" w:lineRule="auto"/>
+              <w:spacing w:before="40" w:after="40" w:line="264" w:lineRule="auto"/>
             </w:pPr>
             <w:r>
               <w:rPr>
                 <w:sz w:val="19"/>
               </w:rPr>
-              <w:t>- Menguji endpoint via Swagger UI (</w:t>
-            </w:r>
-            <w:r>
-              <w:rPr>
-                <w:rFonts w:ascii="Consolas" w:hAnsi="Consolas"/>
-                <w:color w:val="C7254E"/>
-                <w:sz w:val="19"/>
-              </w:rPr>
-              <w:t>/docs</w:t>
-            </w:r>
-            <w:r>
-              <w:rPr>
-                <w:sz w:val="19"/>
-              </w:rPr>
-              <w:t>) dan skrip integrasi otomatis.</w:t>
+              <w:t>Indikator kuning "Menipis" muncul otomatis</w:t>
             </w:r>
           </w:p>
         </w:tc>
@@ -3363,7 +2502,7 @@
       <w:tr>
         <w:tc>
           <w:tcPr>
-            <w:tcW w:type="dxa" w:w="3120"/>
+            <w:tcW w:type="dxa" w:w="2340"/>
             <w:tcMar>
               <w:top w:w="90" w:type="dxa"/>
               <w:bottom w:w="90" w:type="dxa"/>
@@ -3387,43 +2526,13 @@
                 <w:b/>
                 <w:sz w:val="19"/>
               </w:rPr>
-              <w:t>Anggota 3</w:t>
+              <w:t>TC-07</w:t>
             </w:r>
           </w:p>
         </w:tc>
         <w:tc>
           <w:tcPr>
-            <w:tcW w:type="dxa" w:w="3120"/>
-            <w:tcMar>
-              <w:top w:w="90" w:type="dxa"/>
-              <w:bottom w:w="90" w:type="dxa"/>
-              <w:left w:w="120" w:type="dxa"/>
-              <w:right w:w="120" w:type="dxa"/>
-            </w:tcMar>
-            <w:tcBorders>
-              <w:top w:val="single" w:sz="4" w:space="0" w:color="CBD5E1"/>
-              <w:left w:val="single" w:sz="4" w:space="0" w:color="CBD5E1"/>
-              <w:bottom w:val="single" w:sz="4" w:space="0" w:color="CBD5E1"/>
-              <w:right w:val="single" w:sz="4" w:space="0" w:color="CBD5E1"/>
-            </w:tcBorders>
-            <w:shd w:fill="F8FAFC"/>
-          </w:tcPr>
-          <w:p>
-            <w:pPr>
-              <w:spacing w:before="40" w:after="40" w:line="264" w:lineRule="auto"/>
-            </w:pPr>
-            <w:r>
-              <w:rPr>
-                <w:b/>
-                <w:sz w:val="19"/>
-              </w:rPr>
-              <w:t>AI &amp; Agronomic System Engineer</w:t>
-            </w:r>
-          </w:p>
-        </w:tc>
-        <w:tc>
-          <w:tcPr>
-            <w:tcW w:type="dxa" w:w="3120"/>
+            <w:tcW w:type="dxa" w:w="2340"/>
             <w:tcMar>
               <w:top w:w="90" w:type="dxa"/>
               <w:bottom w:w="90" w:type="dxa"/>
@@ -3446,37 +2555,13 @@
               <w:rPr>
                 <w:sz w:val="19"/>
               </w:rPr>
-              <w:t>- Mengembangkan algoritma perhitungan Rencana Tani AI &amp; RAB berdasarkan kondisi tanah, cuaca, dan luas lahan.</w:t>
-            </w:r>
-          </w:p>
-          <w:p>
-            <w:pPr>
-              <w:spacing w:before="20" w:after="20" w:line="264" w:lineRule="auto"/>
-            </w:pPr>
-            <w:r>
-              <w:rPr>
-                <w:sz w:val="19"/>
-              </w:rPr>
-              <w:t>- Membangun modul computer vision Dokter Tani AI untuk deteksi penyakit daun padi.</w:t>
-            </w:r>
-          </w:p>
-          <w:p>
-            <w:pPr>
-              <w:spacing w:before="20" w:after="20" w:line="264" w:lineRule="auto"/>
-            </w:pPr>
-            <w:r>
-              <w:rPr>
-                <w:sz w:val="19"/>
-              </w:rPr>
-              <w:t>- Integrasi peta koordinat Leaflet Maps dan API cuaca geolokasi.</w:t>
+              <w:t>Direktori WhatsApp</w:t>
             </w:r>
           </w:p>
         </w:tc>
-      </w:tr>
-      <w:tr>
         <w:tc>
           <w:tcPr>
-            <w:tcW w:type="dxa" w:w="3120"/>
+            <w:tcW w:type="dxa" w:w="2340"/>
             <w:tcMar>
               <w:top w:w="90" w:type="dxa"/>
               <w:bottom w:w="90" w:type="dxa"/>
@@ -3489,7 +2574,7 @@
               <w:bottom w:val="single" w:sz="4" w:space="0" w:color="CBD5E1"/>
               <w:right w:val="single" w:sz="4" w:space="0" w:color="CBD5E1"/>
             </w:tcBorders>
-            <w:shd w:fill="FFFFFF"/>
+            <w:shd w:fill="F8FAFC"/>
           </w:tcPr>
           <w:p>
             <w:pPr>
@@ -3497,16 +2582,15 @@
             </w:pPr>
             <w:r>
               <w:rPr>
-                <w:b/>
                 <w:sz w:val="19"/>
               </w:rPr>
-              <w:t>Anggota 4</w:t>
+              <w:t>Klik tombol "Hubungi via WhatsApp" pada jasa traktor</w:t>
             </w:r>
           </w:p>
         </w:tc>
         <w:tc>
           <w:tcPr>
-            <w:tcW w:type="dxa" w:w="3120"/>
+            <w:tcW w:type="dxa" w:w="2340"/>
             <w:tcMar>
               <w:top w:w="90" w:type="dxa"/>
               <w:bottom w:w="90" w:type="dxa"/>
@@ -3519,37 +2603,7 @@
               <w:bottom w:val="single" w:sz="4" w:space="0" w:color="CBD5E1"/>
               <w:right w:val="single" w:sz="4" w:space="0" w:color="CBD5E1"/>
             </w:tcBorders>
-            <w:shd w:fill="FFFFFF"/>
-          </w:tcPr>
-          <w:p>
-            <w:pPr>
-              <w:spacing w:before="40" w:after="40" w:line="264" w:lineRule="auto"/>
-            </w:pPr>
-            <w:r>
-              <w:rPr>
-                <w:b/>
-                <w:sz w:val="19"/>
-              </w:rPr>
-              <w:t>Product Lead, QA &amp; DevOps</w:t>
-            </w:r>
-          </w:p>
-        </w:tc>
-        <w:tc>
-          <w:tcPr>
-            <w:tcW w:type="dxa" w:w="3120"/>
-            <w:tcMar>
-              <w:top w:w="90" w:type="dxa"/>
-              <w:bottom w:w="90" w:type="dxa"/>
-              <w:left w:w="120" w:type="dxa"/>
-              <w:right w:w="120" w:type="dxa"/>
-            </w:tcMar>
-            <w:tcBorders>
-              <w:top w:val="single" w:sz="4" w:space="0" w:color="CBD5E1"/>
-              <w:left w:val="single" w:sz="4" w:space="0" w:color="CBD5E1"/>
-              <w:bottom w:val="single" w:sz="4" w:space="0" w:color="CBD5E1"/>
-              <w:right w:val="single" w:sz="4" w:space="0" w:color="CBD5E1"/>
-            </w:tcBorders>
-            <w:shd w:fill="FFFFFF"/>
+            <w:shd w:fill="F8FAFC"/>
           </w:tcPr>
           <w:p>
             <w:pPr>
@@ -3559,42 +2613,21 @@
               <w:rPr>
                 <w:sz w:val="19"/>
               </w:rPr>
-              <w:t>- Menyusun dan memperbarui dokumen PRD Capstone sesuai arahan dosen/stakeholder.</w:t>
-            </w:r>
-          </w:p>
-          <w:p>
-            <w:pPr>
-              <w:spacing w:before="20" w:after="20" w:line="264" w:lineRule="auto"/>
-            </w:pPr>
-            <w:r>
-              <w:rPr>
-                <w:sz w:val="19"/>
-              </w:rPr>
-              <w:t>- Menjalankan pengujian otomatis (</w:t>
+              <w:t xml:space="preserve">Tautan </w:t>
             </w:r>
             <w:r>
               <w:rPr>
-                <w:i/>
+                <w:rFonts w:ascii="Consolas" w:hAnsi="Consolas"/>
+                <w:color w:val="C7254E"/>
                 <w:sz w:val="19"/>
               </w:rPr>
-              <w:t>End-to-End Integration Testing</w:t>
+              <w:t>https://wa.me/...</w:t>
             </w:r>
             <w:r>
               <w:rPr>
                 <w:sz w:val="19"/>
               </w:rPr>
-              <w:t>).</w:t>
-            </w:r>
-          </w:p>
-          <w:p>
-            <w:pPr>
-              <w:spacing w:before="20" w:after="20" w:line="264" w:lineRule="auto"/>
-            </w:pPr>
-            <w:r>
-              <w:rPr>
-                <w:sz w:val="19"/>
-              </w:rPr>
-              <w:t>- Mengelola repositori Git ([ombay86/agribuddy](https://github.com/ombay86/agribuddy)), deployment, dan penyusunan laporan akhir tugas akhir.</w:t>
+              <w:t xml:space="preserve"> terbuka dengan template teks terisi lengkap</w:t>
             </w:r>
           </w:p>
         </w:tc>
@@ -3604,128 +2637,6 @@
       <w:pPr>
         <w:spacing w:after="120"/>
       </w:pPr>
-    </w:p>
-    <w:p>
-      <w:pPr>
-        <w:keepNext/>
-        <w:spacing w:before="280" w:after="80"/>
-      </w:pPr>
-      <w:r>
-        <w:rPr>
-          <w:rFonts w:ascii="Calibri" w:hAnsi="Calibri"/>
-          <w:b/>
-          <w:color w:val="1B5E20"/>
-          <w:sz w:val="30"/>
-        </w:rPr>
-        <w:t>8. Status Implementasi &amp; Verifikasi</w:t>
-      </w:r>
-    </w:p>
-    <w:p>
-      <w:pPr>
-        <w:spacing w:before="20" w:after="80" w:line="276" w:lineRule="auto"/>
-      </w:pPr>
-      <w:r>
-        <w:t xml:space="preserve">Seluruh kebutuhan fungsional yang tertuang dalam PRD ini telah </w:t>
-      </w:r>
-      <w:r>
-        <w:rPr>
-          <w:b/>
-        </w:rPr>
-        <w:t>selesai diimplementasikan dan diverifikasi 100%</w:t>
-      </w:r>
-      <w:r>
-        <w:t>:</w:t>
-      </w:r>
-    </w:p>
-    <w:p>
-      <w:pPr>
-        <w:pStyle w:val="ListBullet"/>
-        <w:spacing w:before="20" w:after="40" w:line="276" w:lineRule="auto"/>
-      </w:pPr>
-      <w:r>
-        <w:t xml:space="preserve">✅ Backend API FastAPI berjalan stabil pada port </w:t>
-      </w:r>
-      <w:r>
-        <w:rPr>
-          <w:rFonts w:ascii="Consolas" w:hAnsi="Consolas"/>
-          <w:color w:val="C7254E"/>
-          <w:sz w:val="19"/>
-        </w:rPr>
-        <w:t>8000</w:t>
-      </w:r>
-      <w:r>
-        <w:t>.</w:t>
-      </w:r>
-    </w:p>
-    <w:p>
-      <w:pPr>
-        <w:pStyle w:val="ListBullet"/>
-        <w:spacing w:before="20" w:after="40" w:line="276" w:lineRule="auto"/>
-      </w:pPr>
-      <w:r>
-        <w:t xml:space="preserve">✅ Frontend Vue 3 berjalan responsif pada port </w:t>
-      </w:r>
-      <w:r>
-        <w:rPr>
-          <w:rFonts w:ascii="Consolas" w:hAnsi="Consolas"/>
-          <w:color w:val="C7254E"/>
-          <w:sz w:val="19"/>
-        </w:rPr>
-        <w:t>5173</w:t>
-      </w:r>
-      <w:r>
-        <w:t xml:space="preserve"> dengan build tanpa error.</w:t>
-      </w:r>
-    </w:p>
-    <w:p>
-      <w:pPr>
-        <w:pStyle w:val="ListBullet"/>
-        <w:spacing w:before="20" w:after="40" w:line="276" w:lineRule="auto"/>
-      </w:pPr>
-      <w:r>
-        <w:t xml:space="preserve">✅ Pengujian otomatis skrip integrasi (Multi-Lahan, Kolaborator Bagi Hasil, In-App Checkout, Buku Modal, Live Status Seller, Obrolan Transaksi, dan Diskusi Produk) lulus dengan status </w:t>
-      </w:r>
-      <w:r>
-        <w:rPr>
-          <w:rFonts w:ascii="Consolas" w:hAnsi="Consolas"/>
-          <w:color w:val="C7254E"/>
-          <w:sz w:val="19"/>
-        </w:rPr>
-        <w:t>ALL TESTS PASSED</w:t>
-      </w:r>
-      <w:r>
-        <w:t>.</w:t>
-      </w:r>
-    </w:p>
-    <w:p>
-      <w:pPr>
-        <w:pStyle w:val="ListBullet"/>
-        <w:spacing w:before="20" w:after="40" w:line="276" w:lineRule="auto"/>
-      </w:pPr>
-      <w:r>
-        <w:t xml:space="preserve">✅ Seluruh source code tersinkronisasi dan ter-deploy di branch </w:t>
-      </w:r>
-      <w:r>
-        <w:rPr>
-          <w:rFonts w:ascii="Consolas" w:hAnsi="Consolas"/>
-          <w:color w:val="C7254E"/>
-          <w:sz w:val="19"/>
-        </w:rPr>
-        <w:t>main</w:t>
-      </w:r>
-      <w:r>
-        <w:t xml:space="preserve"> repositori GitHub </w:t>
-      </w:r>
-      <w:r>
-        <w:rPr>
-          <w:color w:val="1B5E20"/>
-          <w:u w:val="single"/>
-        </w:rPr>
-        <w:t>ombay86/agribuddy</w:t>
-      </w:r>
-      <w:r>
-        <w:t>.</w:t>
-      </w:r>
     </w:p>
     <w:sectPr>
       <w:headerReference w:type="default" r:id="rId9"/>

</xml_diff>

<commit_message>
fix: ganti model gemini-2.5-flash non-standar ke gemini-1.5-flash valid dan dukung konfigurasi GEMINI_MODEL di env
</commit_message>
<xml_diff>
--- a/PRD_AgriBuddy_Capstone.docx
+++ b/PRD_AgriBuddy_Capstone.docx
@@ -410,7 +410,7 @@
         <w:rPr>
           <w:b/>
         </w:rPr>
-        <w:t>Google Gemini 2.5 Flash Multimodal Vision</w:t>
+        <w:t>Google Gemini 1.5 Flash Multimodal Vision</w:t>
       </w:r>
       <w:r>
         <w:t>), pencatatan inventaris sarana produksi dan hasil panen di lumbung (Buku Tani), serta direktori kemitraan layanan mekanisasi dan kios saprotan desa.</w:t>
@@ -570,7 +570,7 @@
           <w:color w:val="C7254E"/>
           <w:sz w:val="19"/>
         </w:rPr>
-        <w:t>gemini-2.5-flash</w:t>
+        <w:t>gemini-1.5-flash</w:t>
       </w:r>
       <w:r>
         <w:t xml:space="preserve"> multimodal vision) untuk analisis penyakit daun padi.</w:t>
@@ -804,7 +804,7 @@
               <w:br/>
               <w:t xml:space="preserve">   │     ├── Unggah Foto Daun Padi / Pilihan Sampel Uji Cepat</w:t>
               <w:br/>
-              <w:t xml:space="preserve">   │     ├── Inferensi Google Gemini 2.5 Flash Vision Multimodal</w:t>
+              <w:t xml:space="preserve">   │     ├── Inferensi Google Gemini 1.5 Flash Vision Multimodal</w:t>
               <w:br/>
               <w:t xml:space="preserve">   │     ├── Output: Nama Penyakit, Akurasi (%), Tingkat Keparahan, Gejala, &amp; Solusi</w:t>
               <w:br/>
@@ -1160,7 +1160,7 @@
           <w:color w:val="C7254E"/>
           <w:sz w:val="19"/>
         </w:rPr>
-        <w:t>gemini-2.5-flash</w:t>
+        <w:t>gemini-1.5-flash</w:t>
       </w:r>
       <w:r>
         <w:t>) untuk inferensi multimodal visual.</w:t>

</xml_diff>

<commit_message>
feat(ai): terapkan mekanisme Auto-Discovery & moving alias gemini-flash-latest agar sistem selalu otomatis menggunakan model Gemini vision terbaru
</commit_message>
<xml_diff>
--- a/PRD_AgriBuddy_Capstone.docx
+++ b/PRD_AgriBuddy_Capstone.docx
@@ -410,7 +410,7 @@
         <w:rPr>
           <w:b/>
         </w:rPr>
-        <w:t>Google Gemini 1.5 Flash Multimodal Vision</w:t>
+        <w:t>Google Gemini Multimodal Vision (Auto-Discovery Latest)</w:t>
       </w:r>
       <w:r>
         <w:t>), pencatatan inventaris sarana produksi dan hasil panen di lumbung (Buku Tani), serta direktori kemitraan layanan mekanisasi dan kios saprotan desa.</w:t>
@@ -570,7 +570,7 @@
           <w:color w:val="C7254E"/>
           <w:sz w:val="19"/>
         </w:rPr>
-        <w:t>gemini-1.5-flash</w:t>
+        <w:t>gemini-flash-latest</w:t>
       </w:r>
       <w:r>
         <w:t xml:space="preserve"> multimodal vision) untuk analisis penyakit daun padi.</w:t>
@@ -804,7 +804,7 @@
               <w:br/>
               <w:t xml:space="preserve">   │     ├── Unggah Foto Daun Padi / Pilihan Sampel Uji Cepat</w:t>
               <w:br/>
-              <w:t xml:space="preserve">   │     ├── Inferensi Google Gemini 1.5 Flash Vision Multimodal</w:t>
+              <w:t xml:space="preserve">   │     ├── Inferensi Google Gemini Multimodal Vision Multimodal</w:t>
               <w:br/>
               <w:t xml:space="preserve">   │     ├── Output: Nama Penyakit, Akurasi (%), Tingkat Keparahan, Gejala, &amp; Solusi</w:t>
               <w:br/>
@@ -1160,7 +1160,7 @@
           <w:color w:val="C7254E"/>
           <w:sz w:val="19"/>
         </w:rPr>
-        <w:t>gemini-1.5-flash</w:t>
+        <w:t>gemini-flash-latest</w:t>
       </w:r>
       <w:r>
         <w:t>) untuk inferensi multimodal visual.</w:t>

</xml_diff>

<commit_message>
docs: update PRD, ERD, Use Case, Activity Diagram, and Flowchart to version 2.5
</commit_message>
<xml_diff>
--- a/PRD_AgriBuddy_Capstone.docx
+++ b/PRD_AgriBuddy_Capstone.docx
@@ -380,7 +380,7 @@
         <w:t>Jenis Platform:</w:t>
       </w:r>
       <w:r>
-        <w:t xml:space="preserve"> Modern Responsive Web Application (Desktop, Laptop, Tablet, &amp; Mobile Browser)</w:t>
+        <w:t xml:space="preserve"> Modern Responsive Progressive Web Application (Desktop, Laptop, Tablet, &amp; Mobile Browser)</w:t>
       </w:r>
     </w:p>
     <w:p>
@@ -404,16 +404,16 @@
         <w:t>Smart Farming Decision Support System (DSS)</w:t>
       </w:r>
       <w:r>
-        <w:t xml:space="preserve"> terpadu pendamping petani padi untuk manajemen petak lahan geospasial, perencanaan anggaran biaya dan jadwal tanam berbasis AI (Smart Farm Planner), deteksi dini fitopatologi daun padi berbasis Computer Vision (</w:t>
+        <w:t xml:space="preserve"> terpadu pendamping petani padi untuk manajemen petak lahan geospasial, perencanaan anggaran biaya dan jadwal tanam berbasis AI (Smart Farm Planner), kendali modal dan siklus budidaya interaktif, deteksi dini fitopatologi daun padi berbasis Computer Vision (</w:t>
       </w:r>
       <w:r>
         <w:rPr>
           <w:b/>
         </w:rPr>
-        <w:t>Google Gemini Multimodal Vision (Auto-Discovery Latest)</w:t>
+        <w:t>Google Gemini 2.5 Flash Multimodal Vision</w:t>
       </w:r>
       <w:r>
-        <w:t>), pencatatan inventaris sarana produksi dan hasil panen di lumbung (Buku Tani), serta direktori kemitraan layanan mekanisasi dan kios saprotan desa.</w:t>
+        <w:t>), asisten tanya-jawab agronomi (Agri AI Chat), pencatatan inventaris sarana produksi dan hasil panen di lumbung yang terisolasi aman per akun usahatani (Buku Tani), serta direktori kemitraan layanan mekanisasi dan kios saprotan desa terhubung langsung via WhatsApp.</w:t>
       </w:r>
     </w:p>
     <w:p>
@@ -451,7 +451,7 @@
         <w:t>Artificial Intelligence (AI)</w:t>
       </w:r>
       <w:r>
-        <w:t xml:space="preserve"> dalam membantu pengambilan keputusan budidaya padi oleh petani, menghilangkan fitur sekunder yang redundan (seperti media sosial umum dan bursa lelang bidding) demi menjaga ketajaman ruang lingkup penelitian dan keandalan sistem saat sidang pengujian.</w:t>
+        <w:t xml:space="preserve"> dalam membantu pengambilan keputusan budidaya padi oleh petani, menghilangkan fitur sekunder yang redundan demi menjaga ketajaman ruang lingkup penelitian dan keandalan sistem saat sidang pengujian.</w:t>
       </w:r>
     </w:p>
     <w:p>
@@ -479,7 +479,18 @@
         <w:t>Frontend:</w:t>
       </w:r>
       <w:r>
-        <w:t xml:space="preserve"> Vue.js 3, Vite, TypeScript, Tailwind CSS, Lucide Icons, Leaflet Maps (OpenStreetMap).</w:t>
+        <w:t xml:space="preserve"> Vue.js 3 (Composition API </w:t>
+      </w:r>
+      <w:r>
+        <w:rPr>
+          <w:rFonts w:ascii="Consolas" w:hAnsi="Consolas"/>
+          <w:color w:val="C7254E"/>
+          <w:sz w:val="19"/>
+        </w:rPr>
+        <w:t>&lt;script setup&gt;</w:t>
+      </w:r>
+      <w:r>
+        <w:t>), Vite, TypeScript, Tailwind CSS, Lucide Icons, Leaflet Maps (OpenStreetMap), SweetAlert2 (Desain Modal Konfirmasi &amp; Notifikasi Interaktif Modern).</w:t>
       </w:r>
     </w:p>
     <w:p>
@@ -495,7 +506,7 @@
         <w:t>Backend API:</w:t>
       </w:r>
       <w:r>
-        <w:t xml:space="preserve"> Node.js (v24+), Express.js, TypeScript.</w:t>
+        <w:t xml:space="preserve"> Node.js (v20+ / v24+), Express.js, TypeScript.</w:t>
       </w:r>
     </w:p>
     <w:p>
@@ -508,7 +519,47 @@
         <w:rPr>
           <w:b/>
         </w:rPr>
-        <w:t>Database &amp; Persistence:</w:t>
+        <w:t>Database &amp; Dual Persistence Engine:</w:t>
+      </w:r>
+    </w:p>
+    <w:p>
+      <w:pPr>
+        <w:pStyle w:val="ListBullet"/>
+        <w:spacing w:before="20" w:after="40" w:line="276" w:lineRule="auto"/>
+        <w:ind w:left="1080"/>
+      </w:pPr>
+      <w:r>
+        <w:rPr>
+          <w:b/>
+        </w:rPr>
+        <w:t>Production (Cloud Coolify):</w:t>
+      </w:r>
+      <w:r>
+        <w:t xml:space="preserve"> PostgreSQL Database (</w:t>
+      </w:r>
+      <w:r>
+        <w:rPr>
+          <w:rFonts w:ascii="Consolas" w:hAnsi="Consolas"/>
+          <w:color w:val="C7254E"/>
+          <w:sz w:val="19"/>
+        </w:rPr>
+        <w:t>agribuddy_records</w:t>
+      </w:r>
+      <w:r>
+        <w:t xml:space="preserve"> table dengan JSONB storage dan schema indexing).</w:t>
+      </w:r>
+    </w:p>
+    <w:p>
+      <w:pPr>
+        <w:pStyle w:val="ListBullet"/>
+        <w:spacing w:before="20" w:after="40" w:line="276" w:lineRule="auto"/>
+        <w:ind w:left="1080"/>
+      </w:pPr>
+      <w:r>
+        <w:rPr>
+          <w:b/>
+        </w:rPr>
+        <w:t>Development / Offline:</w:t>
       </w:r>
       <w:r>
         <w:t xml:space="preserve"> File-based JSON Persistence Engine (</w:t>
@@ -522,7 +573,16 @@
         <w:t>local_db.json</w:t>
       </w:r>
       <w:r>
-        <w:t>).</w:t>
+        <w:t xml:space="preserve">) dengan mekanisme </w:t>
+      </w:r>
+      <w:r>
+        <w:rPr>
+          <w:i/>
+        </w:rPr>
+        <w:t>auto-seeding</w:t>
+      </w:r>
+      <w:r>
+        <w:t xml:space="preserve"> ke PostgreSQL saat inisialisasi awal server.</w:t>
       </w:r>
     </w:p>
     <w:p>
@@ -573,7 +633,23 @@
         <w:t>gemini-flash-latest</w:t>
       </w:r>
       <w:r>
-        <w:t xml:space="preserve"> multimodal vision) untuk analisis penyakit daun padi.</w:t>
+        <w:t xml:space="preserve"> / Gemini 2.5 Flash Vision Multimodal) untuk analisis penyakit daun padi dan percakapan konsultasi interaktif.</w:t>
+      </w:r>
+    </w:p>
+    <w:p>
+      <w:pPr>
+        <w:pStyle w:val="ListBullet"/>
+        <w:spacing w:before="20" w:after="40" w:line="276" w:lineRule="auto"/>
+        <w:ind w:left="1080"/>
+      </w:pPr>
+      <w:r>
+        <w:rPr>
+          <w:b/>
+        </w:rPr>
+        <w:t>BYOK (Bring Your Own Key) Engine:</w:t>
+      </w:r>
+      <w:r>
+        <w:t xml:space="preserve"> Mendukung pemasangan Gemini API Key pribadi per akun pengguna dari Google AI Studio untuk akses kuota gratis tanpa batas antrean.</w:t>
       </w:r>
     </w:p>
     <w:p>
@@ -604,34 +680,47 @@
           <w:color w:val="1B5E20"/>
           <w:sz w:val="30"/>
         </w:rPr>
-        <w:t>2. Analisis Pengguna &amp; Skenario Usahatani</w:t>
+        <w:t>2. Analisis Pengguna &amp; Multi-Persona Usahatani</w:t>
       </w:r>
     </w:p>
     <w:p>
       <w:pPr>
-        <w:keepNext/>
-        <w:spacing w:before="200" w:after="60"/>
+        <w:spacing w:before="20" w:after="80" w:line="276" w:lineRule="auto"/>
       </w:pPr>
       <w:r>
+        <w:t>AgriBuddy mendukung sistem autentikasi multi-peran dengan username unik (</w:t>
+      </w:r>
+      <w:r>
         <w:rPr>
-          <w:rFonts w:ascii="Calibri" w:hAnsi="Calibri"/>
+          <w:rFonts w:ascii="Consolas" w:hAnsi="Consolas"/>
+          <w:color w:val="C7254E"/>
+          <w:sz w:val="19"/>
+        </w:rPr>
+        <w:t>@username</w:t>
+      </w:r>
+      <w:r>
+        <w:t xml:space="preserve">), nomor WhatsApp/telepon, kode PIN keamanan, dan avatar kustom. Terdapat </w:t>
+      </w:r>
+      <w:r>
+        <w:rPr>
           <w:b/>
-          <w:color w:val="2E7D32"/>
-          <w:sz w:val="25"/>
         </w:rPr>
-        <w:t>A. Persona Pengguna Utama</w:t>
+        <w:t>6 Persona Usahatani</w:t>
+      </w:r>
+      <w:r>
+        <w:t xml:space="preserve"> terdaftar dalam ekosistem:</w:t>
       </w:r>
     </w:p>
     <w:p>
       <w:pPr>
-        <w:pStyle w:val="ListBullet"/>
-        <w:spacing w:before="20" w:after="40" w:line="276" w:lineRule="auto"/>
+        <w:pStyle w:val="ListNumber"/>
+        <w:spacing w:before="40" w:after="60" w:line="276" w:lineRule="auto"/>
       </w:pPr>
       <w:r>
         <w:rPr>
           <w:b/>
         </w:rPr>
-        <w:t>Pak Joko (Petani Padi Mandiri):</w:t>
+        <w:t>Pak Joko (`@pak_joko` / `PETANI_MANDIRI`):</w:t>
       </w:r>
     </w:p>
     <w:p>
@@ -641,7 +730,7 @@
         <w:ind w:left="720"/>
       </w:pPr>
       <w:r>
-        <w:t>Mengelola petak sawah irigasi teknis di Desa Sukamaju (Sawah Blok Krajan 0.8 Ha &amp; Sawah Blok Timur 1.2 Ha).</w:t>
+        <w:t>Petani Padi Binaan Kelompok Tani Makmur di Desa Sukamaju.</w:t>
       </w:r>
     </w:p>
     <w:p>
@@ -651,7 +740,7 @@
         <w:ind w:left="720"/>
       </w:pPr>
       <w:r>
-        <w:t>Menghadapi ketidakpastian biaya modal budidaya, risiko serangan hama/penyakit kresek di musim hujan, serta keterbatasan pencatatan stok pupuk dan tonase panen.</w:t>
+        <w:t>Mengelola petak sawah irigasi teknis dengan varietas Padi Inpari 32.</w:t>
       </w:r>
     </w:p>
     <w:p>
@@ -661,7 +750,7 @@
         <w:ind w:left="720"/>
       </w:pPr>
       <w:r>
-        <w:t>Membutuhkan sistem yang dapat:</w:t>
+        <w:t>Kebutuhan: Perencanaan biaya modal tanam (RAB), monitoring cuaca &amp; irigasi, diagnosa penyakit daun via kamera, kontrol fase pengerjaan, dan pencatatan stok pupuk di gudang usahatani.</w:t>
       </w:r>
     </w:p>
     <w:p>
@@ -670,7 +759,30 @@
         <w:spacing w:before="40" w:after="60" w:line="276" w:lineRule="auto"/>
       </w:pPr>
       <w:r>
-        <w:t>Mengalkulasi estimasi biaya modal usahatani secara presisi berdasarkan luas lahan dan prakiraan cuaca lokal.</w:t>
+        <w:rPr>
+          <w:b/>
+        </w:rPr>
+        <w:t>Mas Bambang (`@bambang_traktor` / `JASA_TRAKTOR`):</w:t>
+      </w:r>
+    </w:p>
+    <w:p>
+      <w:pPr>
+        <w:pStyle w:val="ListBullet"/>
+        <w:spacing w:before="20" w:after="40" w:line="276" w:lineRule="auto"/>
+        <w:ind w:left="720"/>
+      </w:pPr>
+      <w:r>
+        <w:t>Pemilik Bengkel &amp; Persewaan Traktor Quick Kubota di Sukamaju Krajan.</w:t>
+      </w:r>
+    </w:p>
+    <w:p>
+      <w:pPr>
+        <w:pStyle w:val="ListBullet"/>
+        <w:spacing w:before="20" w:after="40" w:line="276" w:lineRule="auto"/>
+        <w:ind w:left="720"/>
+      </w:pPr>
+      <w:r>
+        <w:t>Kebutuhan: Terhubung dalam direktori layanan mekanisasi olah tanah, menerima order sewa bajak tanah via WhatsApp dari petani sekitar.</w:t>
       </w:r>
     </w:p>
     <w:p>
@@ -679,7 +791,30 @@
         <w:spacing w:before="40" w:after="60" w:line="276" w:lineRule="auto"/>
       </w:pPr>
       <w:r>
-        <w:t>Memberikan diagnosa instan saat daun padi menguning atau berbintik bercak jamur melalui foto kamera smartphone.</w:t>
+        <w:rPr>
+          <w:b/>
+        </w:rPr>
+        <w:t>Pak Slamet (`@slamet_irigasi` / `JASA_PENGAIRAN`):</w:t>
+      </w:r>
+    </w:p>
+    <w:p>
+      <w:pPr>
+        <w:pStyle w:val="ListBullet"/>
+        <w:spacing w:before="20" w:after="40" w:line="276" w:lineRule="auto"/>
+        <w:ind w:left="720"/>
+      </w:pPr>
+      <w:r>
+        <w:t>Pengelola Jasa Pompa Air Alkon 3 Inci dan sumur bor pantek sawah.</w:t>
+      </w:r>
+    </w:p>
+    <w:p>
+      <w:pPr>
+        <w:pStyle w:val="ListBullet"/>
+        <w:spacing w:before="20" w:after="40" w:line="276" w:lineRule="auto"/>
+        <w:ind w:left="720"/>
+      </w:pPr>
+      <w:r>
+        <w:t>Kebutuhan: Menyediakan layanan pompanisasi saat musim kemarau dan menerima panggilan darurat pengairan sawah via WhatsApp.</w:t>
       </w:r>
     </w:p>
     <w:p>
@@ -688,7 +823,30 @@
         <w:spacing w:before="40" w:after="60" w:line="276" w:lineRule="auto"/>
       </w:pPr>
       <w:r>
-        <w:t>Mengelola stok pupuk subsidi / benih di gudang dan mencatat hasil panen gabah di lumbung.</w:t>
+        <w:rPr>
+          <w:b/>
+        </w:rPr>
+        <w:t>Mang Udin (`@udin_cangkul` / `JASA_CANGKUL`):</w:t>
+      </w:r>
+    </w:p>
+    <w:p>
+      <w:pPr>
+        <w:pStyle w:val="ListBullet"/>
+        <w:spacing w:before="20" w:after="40" w:line="276" w:lineRule="auto"/>
+        <w:ind w:left="720"/>
+      </w:pPr>
+      <w:r>
+        <w:t>Koordinator Regu Buruh Tanam Borongan &amp; Tenaga Cangkul Galengan.</w:t>
+      </w:r>
+    </w:p>
+    <w:p>
+      <w:pPr>
+        <w:pStyle w:val="ListBullet"/>
+        <w:spacing w:before="20" w:after="40" w:line="276" w:lineRule="auto"/>
+        <w:ind w:left="720"/>
+      </w:pPr>
+      <w:r>
+        <w:t>Kebutuhan: Mendapatkan order borongan olah pematang, pindah tanam jajar legowo, dan penyiangan gulma.</w:t>
       </w:r>
     </w:p>
     <w:p>
@@ -697,7 +855,103 @@
         <w:spacing w:before="40" w:after="60" w:line="276" w:lineRule="auto"/>
       </w:pPr>
       <w:r>
-        <w:t>Menghubungi penyedia jasa olah tanah traktor terdekat atau kios saprotan secara mudah via WhatsApp.</w:t>
+        <w:rPr>
+          <w:b/>
+        </w:rPr>
+        <w:t>Ibu Ratna (`@ratna_kios` / `KIOS_SAPROTAN`):</w:t>
+      </w:r>
+    </w:p>
+    <w:p>
+      <w:pPr>
+        <w:pStyle w:val="ListBullet"/>
+        <w:spacing w:before="20" w:after="40" w:line="276" w:lineRule="auto"/>
+        <w:ind w:left="720"/>
+      </w:pPr>
+      <w:r>
+        <w:t>Pengelola KPL Resmi Kios Tani Subur Makmur (Pasar Tradisional Sukamaju).</w:t>
+      </w:r>
+    </w:p>
+    <w:p>
+      <w:pPr>
+        <w:pStyle w:val="ListBullet"/>
+        <w:spacing w:before="20" w:after="40" w:line="276" w:lineRule="auto"/>
+        <w:ind w:left="720"/>
+      </w:pPr>
+      <w:r>
+        <w:t>Kebutuhan: Menerima pesanan restock pupuk subsidi (Urea, NPK) dan benih bersertifikat dari petani via WhatsApp dengan konfirmasi instan.</w:t>
+      </w:r>
+    </w:p>
+    <w:p>
+      <w:pPr>
+        <w:pStyle w:val="ListNumber"/>
+        <w:spacing w:before="40" w:after="60" w:line="276" w:lineRule="auto"/>
+      </w:pPr>
+      <w:r>
+        <w:rPr>
+          <w:b/>
+        </w:rPr>
+        <w:t>Bpk. Hendra Jaya (`@gilingan_hendra` / `PENGGILINGAN_PADI`):</w:t>
+      </w:r>
+    </w:p>
+    <w:p>
+      <w:pPr>
+        <w:pStyle w:val="ListBullet"/>
+        <w:spacing w:before="20" w:after="40" w:line="276" w:lineRule="auto"/>
+        <w:ind w:left="720"/>
+      </w:pPr>
+      <w:r>
+        <w:t>Pemilik Penggilingan Padi Sri Jaya (Sentra Penggilingan Km 3).</w:t>
+      </w:r>
+    </w:p>
+    <w:p>
+      <w:pPr>
+        <w:pStyle w:val="ListBullet"/>
+        <w:spacing w:before="20" w:after="40" w:line="276" w:lineRule="auto"/>
+        <w:ind w:left="720"/>
+      </w:pPr>
+      <w:r>
+        <w:t>Kebutuhan: Penyerapan gabah hasil panen petani (GKP/GKG) dengan timbangan terkalibrasi dan armada jemput lumbung.</w:t>
+      </w:r>
+    </w:p>
+    <w:p>
+      <w:pPr>
+        <w:pStyle w:val="ListNumber"/>
+        <w:spacing w:before="40" w:after="60" w:line="276" w:lineRule="auto"/>
+      </w:pPr>
+      <w:r>
+        <w:rPr>
+          <w:b/>
+        </w:rPr>
+        <w:t>Pengguna Baru / Petani Terdaftar Kustom (e.g. `@ombay`):</w:t>
+      </w:r>
+    </w:p>
+    <w:p>
+      <w:pPr>
+        <w:pStyle w:val="ListBullet"/>
+        <w:spacing w:before="20" w:after="40" w:line="276" w:lineRule="auto"/>
+        <w:ind w:left="720"/>
+      </w:pPr>
+      <w:r>
+        <w:t>Pengguna mandiri yang mendaftar akun baru dengan username unik, peran, nomor WhatsApp, dan PIN.</w:t>
+      </w:r>
+    </w:p>
+    <w:p>
+      <w:pPr>
+        <w:pStyle w:val="ListBullet"/>
+        <w:spacing w:before="20" w:after="40" w:line="276" w:lineRule="auto"/>
+        <w:ind w:left="720"/>
+      </w:pPr>
+      <w:r>
+        <w:t xml:space="preserve">Memulai dengan </w:t>
+      </w:r>
+      <w:r>
+        <w:rPr>
+          <w:b/>
+        </w:rPr>
+        <w:t>0 lahan</w:t>
+      </w:r>
+      <w:r>
+        <w:t xml:space="preserve"> (tanpa pemaksaan lahan default). Menikmati isolasi data mandiri untuk gudang pupuk dan lumbung panen.</w:t>
       </w:r>
     </w:p>
     <w:p>
@@ -720,16 +974,7 @@
         <w:spacing w:before="20" w:after="80" w:line="276" w:lineRule="auto"/>
       </w:pPr>
       <w:r>
-        <w:t xml:space="preserve">Sesuai penyederhanaan arsitektur informasi terkini, platform mengusung </w:t>
-      </w:r>
-      <w:r>
-        <w:rPr>
-          <w:b/>
-        </w:rPr>
-        <w:t>5 Modul Utama</w:t>
-      </w:r>
-      <w:r>
-        <w:t xml:space="preserve"> yang terstruktur secara ergonomis:</w:t>
+        <w:t>Platform mengusung struktur ergonomis yang responsif penuh antara Desktop Sidebar dan Mobile Top/Bottom Bar:</w:t>
       </w:r>
     </w:p>
     <w:tbl>
@@ -770,75 +1015,141 @@
                 <w:color w:val="1E293B"/>
                 <w:sz w:val="17"/>
               </w:rPr>
-              <w:t>[ AgriBuddy Web Application (Desktop Sidebar &amp; Mobile Bottom Nav) ]</w:t>
+              <w:t>[ AgriBuddy Modern Responsive Web Application ]</w:t>
               <w:br/>
               <w:t xml:space="preserve">   │</w:t>
               <w:br/>
-              <w:t xml:space="preserve">   ├── 1. MONITORING SAWAH (Beranda Utama - /)</w:t>
+              <w:t xml:space="preserve">   ├── 1. MONITORING USAHATANI (/ atau /monitoring)</w:t>
               <w:br/>
-              <w:t xml:space="preserve">   │     ├── Dashboard Cuaca GPS Real-Time (Suhu, Kelembaban, Peluang Hujan)</w:t>
+              <w:t xml:space="preserve">   │     ├── Dashboard Cuaca GPS Real-Time (Suhu, Kelembaban, Curah Hujan, Kecepatan Angin)</w:t>
               <w:br/>
-              <w:t xml:space="preserve">   │     ├── Rekomendasi Pengairan &amp; Irigasi Cerdas Berbasis Cuaca</w:t>
+              <w:t xml:space="preserve">   │     ├── Rekomendasi Irigasi &amp; Pengairan Cerdas (Auto-Detect Cuaca &amp; Hujan)</w:t>
               <w:br/>
-              <w:t xml:space="preserve">   │     ├── Manajemen Multi-Lahan Sawah (Peta Leaflet GIS &amp; Detail Petak)</w:t>
+              <w:t xml:space="preserve">   │     ├── Peta Geospasial Sawah Interaktif (Leaflet GIS + OpenStreetMap Tile)</w:t>
               <w:br/>
-              <w:t xml:space="preserve">   │     ├── Buku Modal Lahan (Pencatatan Biaya Riil Usahatani)</w:t>
+              <w:t xml:space="preserve">   │     ├── Ringkasan Kartu Cepat: Stok Saprotan &amp; Lumbung Panen Akun Aktif</w:t>
               <w:br/>
-              <w:t xml:space="preserve">   │     └── Ringkasan Status Rencana Tani AI Aktif</w:t>
+              <w:t xml:space="preserve">   │     └── Tugas Agronomi Harian Berdasarkan Fase Sawah Berjalan</w:t>
               <w:br/>
               <w:t xml:space="preserve">   │</w:t>
               <w:br/>
-              <w:t xml:space="preserve">   ├── 2. RENCANA TANI AI (Smart Farm Planner - /rencana)</w:t>
+              <w:t xml:space="preserve">   ├── 2. KELOLA LAHAN (/rencana)</w:t>
               <w:br/>
-              <w:t xml:space="preserve">   │     ├── Input Parameter Lahan (Luas Ha, Komoditas, Tanah, Sumber Air)</w:t>
+              <w:t xml:space="preserve">   │     ├── Sub-Mode 1: RENCANA TANI AI (Perencanaan Musim Tanam Baru)</w:t>
               <w:br/>
-              <w:t xml:space="preserve">   │     ├── Kalkulasi Rencana Anggaran Biaya (RAB) 12 Item Riil</w:t>
+              <w:t xml:space="preserve">   │     │     ├── Form Wizard 4 Langkah (Identitas Lahan, Luas Ha, Komoditas, Tanah, Sumber Air)</w:t>
               <w:br/>
-              <w:t xml:space="preserve">   │     ├── Linimasa 5 Fase Budidaya (HST) dengan AI Agronomy Tips</w:t>
+              <w:t xml:space="preserve">   │     │     ├── Kalkulasi Otomatis Rencana Anggaran Biaya (RAB) 12 Komponen Riil</w:t>
               <w:br/>
-              <w:t xml:space="preserve">   │     └── Proyeksi Finansial: HPP/kg, Estimasi Hasil Panen, Laba Bersih, &amp; ROI (%)</w:t>
+              <w:t xml:space="preserve">   │     │     ├── Penyesuaian Dosis Pupuk Otomatis terhadap Iklim Mikro</w:t>
+              <w:br/>
+              <w:t xml:space="preserve">   │     │     ├── Linimasa 5 Fase Budidaya (HST) dengan AI Agronomy Recommendations</w:t>
+              <w:br/>
+              <w:t xml:space="preserve">   │     │     ├── Proyeksi Finansial: HPP/kg, Estimasi Tonase, Laba Bersih, &amp; ROI (%)</w:t>
+              <w:br/>
+              <w:t xml:space="preserve">   │     │     └── Aksi: Simpan Draf Rencana atau Langsung "Mulai Garap Sawah"</w:t>
+              <w:br/>
+              <w:t xml:space="preserve">   │     │</w:t>
+              <w:br/>
+              <w:t xml:space="preserve">   │     └── Sub-Mode 2: KONTROL TANAM &amp; MODAL (Monitoring Siklus &amp; Kas Riil)</w:t>
+              <w:br/>
+              <w:t xml:space="preserve">   │           ├── Empty State (Jika 0 Lahan: "Kamu belum membuat lahan untuk diolah" + "Buat Sekarang")</w:t>
+              <w:br/>
+              <w:t xml:space="preserve">   │           ├── Panel Kelola Lahan:</w:t>
+              <w:br/>
+              <w:t xml:space="preserve">   │           │     ├── Pilihan Switcher Multi-Lahan</w:t>
+              <w:br/>
+              <w:t xml:space="preserve">   │           │     ├── Modal Edit Lahan (Nama, Luas, Komoditas, Lokasi, Tgl Tanam)</w:t>
+              <w:br/>
+              <w:t xml:space="preserve">   │           │     ├── Modal Hapus Lahan (Konfirmasi SweetAlert2 Danger &amp; Pembersihan Cache)</w:t>
+              <w:br/>
+              <w:t xml:space="preserve">   │           │     └── Modal Set Fase Lapangan (Fast-Track Mulai dari Tengah untuk Petani Konvensional)</w:t>
+              <w:br/>
+              <w:t xml:space="preserve">   │           ├── Neraca Kendali Modal &amp; Siklus Budidaya (Plafon RAB AI, Modal Terpakai, Sisa Modal, Progress Bar)</w:t>
+              <w:br/>
+              <w:t xml:space="preserve">   │           ├── Tab Kiri: 5 Fase Interaktif (Dual Control: Checklist Tugas + Kontak Mitra WA)</w:t>
+              <w:br/>
+              <w:t xml:space="preserve">   │           ├── Tab Kiri: Arus Kas Transaksi Riil (Pencatatan Beban Modal Usahatani)</w:t>
+              <w:br/>
+              <w:t xml:space="preserve">   │           └── Panel Kanan: Kemitraan Usahatani (Kolaborator Bagi Hasil &amp; Undangan Mitra)</w:t>
               <w:br/>
               <w:t xml:space="preserve">   │</w:t>
               <w:br/>
-              <w:t xml:space="preserve">   ├── 3. DOKTER TANI AI (Gemini Multimodal Vision - /dokter)</w:t>
+              <w:t xml:space="preserve">   ├── 3. DOKTER TANI AI (/dokter)</w:t>
               <w:br/>
-              <w:t xml:space="preserve">   │     ├── Unggah Foto Daun Padi / Pilihan Sampel Uji Cepat</w:t>
+              <w:t xml:space="preserve">   │     ├── Mode 1: LAB DIAGNOSA DAUN (Computer Vision Multimodal)</w:t>
               <w:br/>
-              <w:t xml:space="preserve">   │     ├── Inferensi Google Gemini Multimodal Vision Multimodal</w:t>
+              <w:t xml:space="preserve">   │     │     ├── Unggah Foto Daun Kamera / Pilih Sampel Uji Cepat Padi</w:t>
               <w:br/>
-              <w:t xml:space="preserve">   │     ├── Output: Nama Penyakit, Akurasi (%), Tingkat Keparahan, Gejala, &amp; Solusi</w:t>
+              <w:t xml:space="preserve">   │     │     ├── Inferensi Google Gemini 2.5 Flash Vision Multimodal</w:t>
               <w:br/>
-              <w:t xml:space="preserve">   │     └── Riwayat Diagnosa Lab Pertanian</w:t>
+              <w:t xml:space="preserve">   │     │     ├── Hasil Diagnosa: Nama Penyakit, Akurasi (%), Keparahan, Gejala, &amp; Solusi Kementan/IRRI</w:t>
+              <w:br/>
+              <w:t xml:space="preserve">   │     │     └── Riwayat Diagnosa Lab Pertanian</w:t>
+              <w:br/>
+              <w:t xml:space="preserve">   │     │</w:t>
+              <w:br/>
+              <w:t xml:space="preserve">   │     └── Mode 2: AGRI AI CHATBOT (Konsultasi Agronomi Interaktif)</w:t>
+              <w:br/>
+              <w:t xml:space="preserve">   │           ├── Chat Tanya-Jawab AI Real-Time</w:t>
+              <w:br/>
+              <w:t xml:space="preserve">   │           ├── Riwayat Sesi Obrolan &amp; Tombol Obrolan Baru</w:t>
+              <w:br/>
+              <w:t xml:space="preserve">   │           ├── 2 Contoh Pertanyaan Populer Ringkas 1 Baris (Hawar Daun &amp; Wereng Coklat)</w:t>
+              <w:br/>
+              <w:t xml:space="preserve">   │           └── Panduan Cepat Pasang Gemini API Key Pribadi (Tampil Utuh Tanpa Scroll)</w:t>
               <w:br/>
               <w:t xml:space="preserve">   │</w:t>
               <w:br/>
-              <w:t xml:space="preserve">   ├── 4. BUKU TANI (Gudang &amp; Lumbung - /buku-tani)</w:t>
+              <w:t xml:space="preserve">   ├── 4. BUKU TANI (/buku-tani) — Isolasi Ketat Per Akun</w:t>
               <w:br/>
-              <w:t xml:space="preserve">   │     ├── Tab 1: Gudang Saprotan (Stok Pupuk, Benih, Obat + Quick Adjust + Low Stock Alert)</w:t>
+              <w:t xml:space="preserve">   │     ├── Tab 1: Gudang Saprotan</w:t>
               <w:br/>
-              <w:t xml:space="preserve">   │     └── Tab 2: Lumbung Panen (Catatan Tonase Gabah GKP/GKG &amp; Pantauan Harga Pasar)</w:t>
+              <w:t xml:space="preserve">   │     │     ├── Inventaris Stok Pupuk, Benih, dan Obat Mandiri Petani</w:t>
+              <w:br/>
+              <w:t xml:space="preserve">   │     │     ├── Tombol Penyesuaian Cepat (+ / - 1 Unit)</w:t>
+              <w:br/>
+              <w:t xml:space="preserve">   │     │     ├── Indikator Peringatan Stok Menipis (Low-Stock Alert)</w:t>
+              <w:br/>
+              <w:t xml:space="preserve">   │     │     ├── Tambah Item Saprotan Baru ke Gudang</w:t>
+              <w:br/>
+              <w:t xml:space="preserve">   │     │     └── Modal Pesan Restock via WhatsApp ke Kios Mitra Resmi + Konfirmasi Barang Tiba</w:t>
+              <w:br/>
+              <w:t xml:space="preserve">   │     │</w:t>
+              <w:br/>
+              <w:t xml:space="preserve">   │     └── Tab 2: Lumbung Hasil Panen</w:t>
+              <w:br/>
+              <w:t xml:space="preserve">   │           ├── Akumulasi Total Tonase Gabah Tersimpan (Ton &amp; Kg)</w:t>
+              <w:br/>
+              <w:t xml:space="preserve">   │           ├── Catatan Hasil Panen Sawah (Komoditas, Tanggal, Tonase, Status Simpan/Jual)</w:t>
+              <w:br/>
+              <w:t xml:space="preserve">   │           ├── Formulir Catat Hasil Panen Baru</w:t>
+              <w:br/>
+              <w:t xml:space="preserve">   │           └── Pantauan Tren Harga Pasar Komoditas Daerah Harian (GKP, GKG, Beras, Jagung)</w:t>
               <w:br/>
               <w:t xml:space="preserve">   │</w:t>
               <w:br/>
               <w:t xml:space="preserve">   ├── 5. DIREKTORI LAYANAN EKOSISTEM (/layanan)</w:t>
               <w:br/>
-              <w:t xml:space="preserve">   │     ├── Direktori Jasa Traktor, Pompa Irigasi, Buruh Tanam, Kios Pupuk, &amp; Penggilingan</w:t>
+              <w:t xml:space="preserve">   │     ├── Katalog Direktori Mitra: Jasa Traktor, Pompa Air, Regu Tanam, Kios Pupuk, Penggilingan</w:t>
               <w:br/>
               <w:t xml:space="preserve">   │     ├── Filter Kategori Cepat &amp; Pencarian Kata Kunci</w:t>
               <w:br/>
-              <w:t xml:space="preserve">   │     ├── Kartu Informasi Tarif &amp; Spesifikasi Layanan</w:t>
+              <w:t xml:space="preserve">   │     ├── Tombol Interaktif "Hubungi via WhatsApp" (Pesan Otomatis Terisi)</w:t>
               <w:br/>
-              <w:t xml:space="preserve">   │     ├── Tombol Aksi Langsung: "Hubungi via WhatsApp" (Pesan Otomatis)</w:t>
-              <w:br/>
-              <w:t xml:space="preserve">   │     └── Form Pasang Layanan Mandiri</w:t>
+              <w:t xml:space="preserve">   │     └── Formulir Pasang Profil Layanan Mandiri bagi Mitra</w:t>
               <w:br/>
               <w:t xml:space="preserve">   │</w:t>
               <w:br/>
-              <w:t xml:space="preserve">   └── 6. PROFIL PETANI MANDIRI (/profil)</w:t>
+              <w:t xml:space="preserve">   └── 6. PROFIL PENGGUNA (/profil)</w:t>
               <w:br/>
-              <w:t xml:space="preserve">         ├── Informasi Usahatani Pengguna (Pak Joko)</w:t>
+              <w:t xml:space="preserve">         ├── Identitas Petani, Username Unik (@username), Peran Usahatani, &amp; Kontak</w:t>
               <w:br/>
-              <w:t xml:space="preserve">         └── Tombol Keluar Akun (Logout)</w:t>
+              <w:t xml:space="preserve">         ├── Unggah Foto Avatar Kustom &amp; Ubah Username</w:t>
+              <w:br/>
+              <w:t xml:space="preserve">         ├── Pengaturan Google Gemini API Key Pribadi (BYOK)</w:t>
+              <w:br/>
+              <w:t xml:space="preserve">         └── Tombol Keluar Sistem (Logout)</w:t>
             </w:r>
           </w:p>
         </w:tc>
@@ -876,7 +1187,7 @@
           <w:color w:val="2E7D32"/>
           <w:sz w:val="25"/>
         </w:rPr>
-        <w:t>FR-01: Monitoring Sawah &amp; Cuaca Lahan Real-Time (Beranda)</w:t>
+        <w:t>FR-01: Monitoring Usahatani &amp; Telemetri Cuaca Real-Time (`/` atau `/monitoring`)</w:t>
       </w:r>
     </w:p>
     <w:p>
@@ -891,7 +1202,7 @@
         <w:t>Deskripsi:</w:t>
       </w:r>
       <w:r>
-        <w:t xml:space="preserve"> Dasbor utama pemantauan iklim mikro sawah dan kondisi lahan geospasial petani.</w:t>
+        <w:t xml:space="preserve"> Dasbor utama pemantauan mikroklimat sawah dan status operasional usahatani.</w:t>
       </w:r>
     </w:p>
     <w:p>
@@ -913,7 +1224,7 @@
         <w:ind w:left="720"/>
       </w:pPr>
       <w:r>
-        <w:t>Pengambilan telemetri cuaca terkini (suhu, kelembaban, probabilitas curah hujan).</w:t>
+        <w:t>Pengambilan telemetri cuaca terkini (suhu, kelembaban udara, probabilitas curah hujan harian, kecepatan angin).</w:t>
       </w:r>
     </w:p>
     <w:p>
@@ -932,7 +1243,7 @@
         <w:t>Auto-Detect GPS</w:t>
       </w:r>
       <w:r>
-        <w:t xml:space="preserve"> untuk mendeteksi koordinat lintang &amp; bujur sawah pengguna secara instan.</w:t>
+        <w:t xml:space="preserve"> untuk mendeteksi koordinat lintang &amp; bujur sawah secara instan menggunakan sensor perangkat.</w:t>
       </w:r>
     </w:p>
     <w:p>
@@ -942,7 +1253,7 @@
         <w:ind w:left="720"/>
       </w:pPr>
       <w:r>
-        <w:t>Rekomendasi irigasi cerdas: Menganjurkan penyiraman atau penundaan pengairan secara otomatis berdasarkan probabilitas hujan demi menghemat bahan bakar pompa dan tenaga kerja.</w:t>
+        <w:t>Rekomendasi irigasi cerdas otomatis: Menganjurkan penyiraman atau penundaan pengairan berdasarkan curah hujan untuk efisiensi pompa dan bahan bakar.</w:t>
       </w:r>
     </w:p>
     <w:p>
@@ -952,7 +1263,7 @@
         <w:ind w:left="720"/>
       </w:pPr>
       <w:r>
-        <w:t>Visualisasi peta geospasial sawah interaktif berbasis Leaflet GIS dan OpenStreetMap.</w:t>
+        <w:t>Visualisasi peta geospasial sawah interaktif berbasis Leaflet GIS dan OpenStreetMap Tile.</w:t>
       </w:r>
     </w:p>
     <w:p>
@@ -962,7 +1273,7 @@
         <w:ind w:left="720"/>
       </w:pPr>
       <w:r>
-        <w:t>Buku Modal Pengeluaran Lahan: Pencatatan pengeluaran riil per petak sawah.</w:t>
+        <w:t>Switcher petak sawah aktif dengan integrasi tugas agronomi fase berjalan.</w:t>
       </w:r>
     </w:p>
     <w:p>
@@ -977,7 +1288,7 @@
           <w:color w:val="2E7D32"/>
           <w:sz w:val="25"/>
         </w:rPr>
-        <w:t>FR-02: Rencana Tani AI &amp; Kalkulator Modal (Smart Farm Planner)</w:t>
+        <w:t>FR-02: Kelola Lahan — Rencana Tani AI &amp; Kontrol Tanam/Modal (`/rencana`)</w:t>
       </w:r>
     </w:p>
     <w:p>
@@ -992,329 +1303,7 @@
         <w:t>Deskripsi:</w:t>
       </w:r>
       <w:r>
-        <w:t xml:space="preserve"> Sistem pendukung keputusan agronomi cerdas untuk perencanaan musim tanam yang terukur.</w:t>
-      </w:r>
-    </w:p>
-    <w:p>
-      <w:pPr>
-        <w:pStyle w:val="ListBullet"/>
-        <w:spacing w:before="20" w:after="40" w:line="276" w:lineRule="auto"/>
-      </w:pPr>
-      <w:r>
-        <w:rPr>
-          <w:b/>
-        </w:rPr>
-        <w:t>Fitur Utama:</w:t>
-      </w:r>
-    </w:p>
-    <w:p>
-      <w:pPr>
-        <w:pStyle w:val="ListBullet"/>
-        <w:spacing w:before="20" w:after="40" w:line="276" w:lineRule="auto"/>
-        <w:ind w:left="720"/>
-      </w:pPr>
-      <w:r>
-        <w:t>Kalkulasi Rencana Anggaran Biaya (RAB) 12 item kebutuhan riil usahatani (sewa traktor, buruh cangkul, benih bersertifikat, buruh tanam legowo, urea subsidi, NPK majemuk, pupuk organik, biaya air, obat pengendali hama, upah semprot, tenaga panen, karung angkut).</w:t>
-      </w:r>
-    </w:p>
-    <w:p>
-      <w:pPr>
-        <w:pStyle w:val="ListBullet"/>
-        <w:spacing w:before="20" w:after="40" w:line="276" w:lineRule="auto"/>
-        <w:ind w:left="720"/>
-      </w:pPr>
-      <w:r>
-        <w:t>Penyesuaian dosis pupuk otomatis terhadap iklim: jika musim hujan tinggi, dosis urea otomatis diturunkan 15% untuk mencegah kerentanan penyakit kresek, dan penguatan pupuk Kalium ditingkatkan.</w:t>
-      </w:r>
-    </w:p>
-    <w:p>
-      <w:pPr>
-        <w:pStyle w:val="ListBullet"/>
-        <w:spacing w:before="20" w:after="40" w:line="276" w:lineRule="auto"/>
-        <w:ind w:left="720"/>
-      </w:pPr>
-      <w:r>
-        <w:t>Jadwal budidaya 5 tahapan Hari Setelah Tanam (HST) dengan status pengerjaan (</w:t>
-      </w:r>
-      <w:r>
-        <w:rPr>
-          <w:i/>
-        </w:rPr>
-        <w:t>SELESAI</w:t>
-      </w:r>
-      <w:r>
-        <w:t xml:space="preserve">, </w:t>
-      </w:r>
-      <w:r>
-        <w:rPr>
-          <w:i/>
-        </w:rPr>
-        <w:t>SEDANG_BERJALAN</w:t>
-      </w:r>
-      <w:r>
-        <w:t xml:space="preserve">, </w:t>
-      </w:r>
-      <w:r>
-        <w:rPr>
-          <w:i/>
-        </w:rPr>
-        <w:t>BELUM</w:t>
-      </w:r>
-      <w:r>
-        <w:t>) dan catatan biaya aktual riil.</w:t>
-      </w:r>
-    </w:p>
-    <w:p>
-      <w:pPr>
-        <w:pStyle w:val="ListBullet"/>
-        <w:spacing w:before="20" w:after="40" w:line="276" w:lineRule="auto"/>
-        <w:ind w:left="720"/>
-      </w:pPr>
-      <w:r>
-        <w:t>Proyeksi finansial komprehensif: Harga Pokok Produksi (HPP) per kg, estimasi tonase hasil panen, proyeksi pendapatan kotor, laba bersih usahatani, dan rasio ROI (</w:t>
-      </w:r>
-      <w:r>
-        <w:rPr>
-          <w:i/>
-        </w:rPr>
-        <w:t>Return on Investment</w:t>
-      </w:r>
-      <w:r>
-        <w:t>).</w:t>
-      </w:r>
-    </w:p>
-    <w:p>
-      <w:pPr>
-        <w:keepNext/>
-        <w:spacing w:before="200" w:after="60"/>
-      </w:pPr>
-      <w:r>
-        <w:rPr>
-          <w:rFonts w:ascii="Calibri" w:hAnsi="Calibri"/>
-          <w:b/>
-          <w:color w:val="2E7D32"/>
-          <w:sz w:val="25"/>
-        </w:rPr>
-        <w:t>FR-03: Dokter Tani AI — Fitopatologi Daun Padi (Gemini Vision)</w:t>
-      </w:r>
-    </w:p>
-    <w:p>
-      <w:pPr>
-        <w:pStyle w:val="ListBullet"/>
-        <w:spacing w:before="20" w:after="40" w:line="276" w:lineRule="auto"/>
-      </w:pPr>
-      <w:r>
-        <w:rPr>
-          <w:b/>
-        </w:rPr>
-        <w:t>Deskripsi:</w:t>
-      </w:r>
-      <w:r>
-        <w:t xml:space="preserve"> Modul kecerdasan buatan visual untuk deteksi dini penyakit tanaman padi dari citra daun.</w:t>
-      </w:r>
-    </w:p>
-    <w:p>
-      <w:pPr>
-        <w:pStyle w:val="ListBullet"/>
-        <w:spacing w:before="20" w:after="40" w:line="276" w:lineRule="auto"/>
-      </w:pPr>
-      <w:r>
-        <w:rPr>
-          <w:b/>
-        </w:rPr>
-        <w:t>Fitur Utama:</w:t>
-      </w:r>
-    </w:p>
-    <w:p>
-      <w:pPr>
-        <w:pStyle w:val="ListBullet"/>
-        <w:spacing w:before="20" w:after="40" w:line="276" w:lineRule="auto"/>
-        <w:ind w:left="720"/>
-      </w:pPr>
-      <w:r>
-        <w:t xml:space="preserve">Integrasi resmi </w:t>
-      </w:r>
-      <w:r>
-        <w:rPr>
-          <w:b/>
-        </w:rPr>
-        <w:t>Google Gemini API</w:t>
-      </w:r>
-      <w:r>
-        <w:t xml:space="preserve"> (</w:t>
-      </w:r>
-      <w:r>
-        <w:rPr>
-          <w:rFonts w:ascii="Consolas" w:hAnsi="Consolas"/>
-          <w:color w:val="C7254E"/>
-          <w:sz w:val="19"/>
-        </w:rPr>
-        <w:t>@google/genai</w:t>
-      </w:r>
-      <w:r>
-        <w:t xml:space="preserve"> model </w:t>
-      </w:r>
-      <w:r>
-        <w:rPr>
-          <w:rFonts w:ascii="Consolas" w:hAnsi="Consolas"/>
-          <w:color w:val="C7254E"/>
-          <w:sz w:val="19"/>
-        </w:rPr>
-        <w:t>gemini-flash-latest</w:t>
-      </w:r>
-      <w:r>
-        <w:t>) untuk inferensi multimodal visual.</w:t>
-      </w:r>
-    </w:p>
-    <w:p>
-      <w:pPr>
-        <w:pStyle w:val="ListBullet"/>
-        <w:spacing w:before="20" w:after="40" w:line="276" w:lineRule="auto"/>
-        <w:ind w:left="720"/>
-      </w:pPr>
-      <w:r>
-        <w:t>Klasifikasi kondisi daun padi:</w:t>
-      </w:r>
-    </w:p>
-    <w:p>
-      <w:pPr>
-        <w:pStyle w:val="ListNumber"/>
-        <w:spacing w:before="40" w:after="60" w:line="276" w:lineRule="auto"/>
-      </w:pPr>
-      <w:r>
-        <w:rPr>
-          <w:i/>
-        </w:rPr>
-        <w:t>Hawar Daun Bakteri (Kresek / Xanthomonas oryzae)</w:t>
-      </w:r>
-    </w:p>
-    <w:p>
-      <w:pPr>
-        <w:pStyle w:val="ListNumber"/>
-        <w:spacing w:before="40" w:after="60" w:line="276" w:lineRule="auto"/>
-      </w:pPr>
-      <w:r>
-        <w:rPr>
-          <w:i/>
-        </w:rPr>
-        <w:t>Blas Daun (Pyricularia oryzae)</w:t>
-      </w:r>
-    </w:p>
-    <w:p>
-      <w:pPr>
-        <w:pStyle w:val="ListNumber"/>
-        <w:spacing w:before="40" w:after="60" w:line="276" w:lineRule="auto"/>
-      </w:pPr>
-      <w:r>
-        <w:rPr>
-          <w:i/>
-        </w:rPr>
-        <w:t>Bercak Coklat (Helminthosporium oryzae)</w:t>
-      </w:r>
-    </w:p>
-    <w:p>
-      <w:pPr>
-        <w:pStyle w:val="ListNumber"/>
-        <w:spacing w:before="40" w:after="60" w:line="276" w:lineRule="auto"/>
-      </w:pPr>
-      <w:r>
-        <w:rPr>
-          <w:i/>
-        </w:rPr>
-        <w:t>Daun Padi Sehat</w:t>
-      </w:r>
-    </w:p>
-    <w:p>
-      <w:pPr>
-        <w:pStyle w:val="ListBullet"/>
-        <w:spacing w:before="20" w:after="40" w:line="276" w:lineRule="auto"/>
-        <w:ind w:left="720"/>
-      </w:pPr>
-      <w:r>
-        <w:t>Output terstruktur: Nama penyakit lokal &amp; ilmiah, skor keyakinan (</w:t>
-      </w:r>
-      <w:r>
-        <w:rPr>
-          <w:i/>
-        </w:rPr>
-        <w:t>confidence score</w:t>
-      </w:r>
-      <w:r>
-        <w:t xml:space="preserve"> 0.0 - 1.0), tingkat keparahan (</w:t>
-      </w:r>
-      <w:r>
-        <w:rPr>
-          <w:i/>
-        </w:rPr>
-        <w:t>Aman/Sedang/Tinggi</w:t>
-      </w:r>
-      <w:r>
-        <w:t>), gejala klinis visual, dan langkah penanganan agronomi nyata (pengeringan petak, pengurangan urea, anjuran bakterisida/fungisida tembaga).</w:t>
-      </w:r>
-    </w:p>
-    <w:p>
-      <w:pPr>
-        <w:pStyle w:val="ListBullet"/>
-        <w:spacing w:before="20" w:after="40" w:line="276" w:lineRule="auto"/>
-        <w:ind w:left="720"/>
-      </w:pPr>
-      <w:r>
-        <w:rPr>
-          <w:i/>
-        </w:rPr>
-        <w:t>Graceful Fallback Mechanism</w:t>
-      </w:r>
-      <w:r>
-        <w:t>: Otomatis beralih ke basis pengetahuan lokal Kementan &amp; IRRI jika perangkat offline atau API key belum terpasang (</w:t>
-      </w:r>
-      <w:r>
-        <w:rPr>
-          <w:i/>
-        </w:rPr>
-        <w:t>anti-crash &amp; demo-ready</w:t>
-      </w:r>
-      <w:r>
-        <w:t>).</w:t>
-      </w:r>
-    </w:p>
-    <w:p>
-      <w:pPr>
-        <w:pStyle w:val="ListBullet"/>
-        <w:spacing w:before="20" w:after="40" w:line="276" w:lineRule="auto"/>
-        <w:ind w:left="720"/>
-      </w:pPr>
-      <w:r>
-        <w:t>Tersedia sampel foto daun siap uji untuk kemudahan demonstrasi tanpa harus menyiapkan citra eksternal.</w:t>
-      </w:r>
-    </w:p>
-    <w:p>
-      <w:pPr>
-        <w:keepNext/>
-        <w:spacing w:before="200" w:after="60"/>
-      </w:pPr>
-      <w:r>
-        <w:rPr>
-          <w:rFonts w:ascii="Calibri" w:hAnsi="Calibri"/>
-          <w:b/>
-          <w:color w:val="2E7D32"/>
-          <w:sz w:val="25"/>
-        </w:rPr>
-        <w:t>FR-04: Buku Tani — Gudang Saprotan &amp; Lumbung Panen</w:t>
-      </w:r>
-    </w:p>
-    <w:p>
-      <w:pPr>
-        <w:pStyle w:val="ListBullet"/>
-        <w:spacing w:before="20" w:after="40" w:line="276" w:lineRule="auto"/>
-      </w:pPr>
-      <w:r>
-        <w:rPr>
-          <w:b/>
-        </w:rPr>
-        <w:t>Deskripsi:</w:t>
-      </w:r>
-      <w:r>
-        <w:t xml:space="preserve"> Pengelolaan logistik persediaan sarana produksi dan catatan hasil panen mandiri petani.</w:t>
+        <w:t xml:space="preserve"> Modul terintegrasi perencanaan usahatani cerdas berbasis AI dan pengendalian siklus budidaya riil di lapangan.</w:t>
       </w:r>
     </w:p>
     <w:p>
@@ -1339,10 +1328,37 @@
         <w:rPr>
           <w:b/>
         </w:rPr>
-        <w:t>Gudang Saprotan</w:t>
+        <w:t>Aturan Akun 0 Lahan:</w:t>
       </w:r>
       <w:r>
-        <w:t>: Pencatatan stok pupuk, benih, dan obat dengan tombol penyesuaian cepat (+ / - 1 unit) tanpa perlu form edit rumit.</w:t>
+        <w:t xml:space="preserve"> Tidak ada pemaksaan atau auto-provisioning lahan default. Setiap akun boleh memiliki 0 lahan. Jika belum ada lahan aktif, sistem menyajikan </w:t>
+      </w:r>
+      <w:r>
+        <w:rPr>
+          <w:i/>
+        </w:rPr>
+        <w:t>Empty State</w:t>
+      </w:r>
+      <w:r>
+        <w:t xml:space="preserve"> elegan (</w:t>
+      </w:r>
+      <w:r>
+        <w:rPr>
+          <w:i/>
+        </w:rPr>
+        <w:t>"Kamu belum membuat lahan untuk diolah."</w:t>
+      </w:r>
+      <w:r>
+        <w:t xml:space="preserve"> + tombol </w:t>
+      </w:r>
+      <w:r>
+        <w:rPr>
+          <w:i/>
+        </w:rPr>
+        <w:t>"Buat Sekarang"</w:t>
+      </w:r>
+      <w:r>
+        <w:t>).</w:t>
       </w:r>
     </w:p>
     <w:p>
@@ -1350,6 +1366,600 @@
         <w:pStyle w:val="ListBullet"/>
         <w:spacing w:before="20" w:after="40" w:line="276" w:lineRule="auto"/>
         <w:ind w:left="720"/>
+      </w:pPr>
+      <w:r>
+        <w:rPr>
+          <w:b/>
+        </w:rPr>
+        <w:t>Smart Farm Planner (Wizard 4 Langkah):</w:t>
+      </w:r>
+    </w:p>
+    <w:p>
+      <w:pPr>
+        <w:pStyle w:val="ListBullet"/>
+        <w:spacing w:before="20" w:after="40" w:line="276" w:lineRule="auto"/>
+        <w:ind w:left="1080"/>
+      </w:pPr>
+      <w:r>
+        <w:t>Input parameter: Nama petak sawah, luasan (Ha), komoditas utama (Padi Inpari 32, Ciherang, dll), karakteristik tanah, sumber air, dan koordinat peta.</w:t>
+      </w:r>
+    </w:p>
+    <w:p>
+      <w:pPr>
+        <w:pStyle w:val="ListBullet"/>
+        <w:spacing w:before="20" w:after="40" w:line="276" w:lineRule="auto"/>
+        <w:ind w:left="1080"/>
+      </w:pPr>
+      <w:r>
+        <w:t>Kalkulasi Rencana Anggaran Biaya (RAB) 12 item riil (sewa traktor, buruh cangkul, benih bersertifikat, buruh tanam legowo, urea subsidi, NPK majemuk, pupuk organik, biaya air, obat hama, upah semprot, tenaga panen, karung angkut).</w:t>
+      </w:r>
+    </w:p>
+    <w:p>
+      <w:pPr>
+        <w:pStyle w:val="ListBullet"/>
+        <w:spacing w:before="20" w:after="40" w:line="276" w:lineRule="auto"/>
+        <w:ind w:left="1080"/>
+      </w:pPr>
+      <w:r>
+        <w:t>Penyesuaian dosis pupuk cerdas iklim mikro (penurunan urea saat curah hujan tinggi untuk mencegah penyakit kresek).</w:t>
+      </w:r>
+    </w:p>
+    <w:p>
+      <w:pPr>
+        <w:pStyle w:val="ListBullet"/>
+        <w:spacing w:before="20" w:after="40" w:line="276" w:lineRule="auto"/>
+        <w:ind w:left="1080"/>
+      </w:pPr>
+      <w:r>
+        <w:t>Proyeksi finansial komprehensif: Harga Pokok Produksi (HPP/kg), estimasi tonase hasil panen, proyeksi omzet penjualan, estimasi laba bersih, dan rasio ROI (</w:t>
+      </w:r>
+      <w:r>
+        <w:rPr>
+          <w:i/>
+        </w:rPr>
+        <w:t>Return on Investment</w:t>
+      </w:r>
+      <w:r>
+        <w:t>).</w:t>
+      </w:r>
+    </w:p>
+    <w:p>
+      <w:pPr>
+        <w:pStyle w:val="ListBullet"/>
+        <w:spacing w:before="20" w:after="40" w:line="276" w:lineRule="auto"/>
+        <w:ind w:left="1080"/>
+      </w:pPr>
+      <w:r>
+        <w:t>Opsi: Simpan sebagai Draf Perencanaan atau Langsung Aktifkan Menjadi Sawah Garap Aktif.</w:t>
+      </w:r>
+    </w:p>
+    <w:p>
+      <w:pPr>
+        <w:pStyle w:val="ListBullet"/>
+        <w:spacing w:before="20" w:after="40" w:line="276" w:lineRule="auto"/>
+        <w:ind w:left="720"/>
+      </w:pPr>
+      <w:r>
+        <w:rPr>
+          <w:b/>
+        </w:rPr>
+        <w:t>Kontrol Tanam &amp; Modal Usahatani:</w:t>
+      </w:r>
+    </w:p>
+    <w:p>
+      <w:pPr>
+        <w:pStyle w:val="ListBullet"/>
+        <w:spacing w:before="20" w:after="40" w:line="276" w:lineRule="auto"/>
+        <w:ind w:left="1080"/>
+      </w:pPr>
+      <w:r>
+        <w:rPr>
+          <w:b/>
+        </w:rPr>
+        <w:t>Panel Kelola Lahan:</w:t>
+      </w:r>
+    </w:p>
+    <w:p>
+      <w:pPr>
+        <w:pStyle w:val="ListBullet"/>
+        <w:spacing w:before="20" w:after="40" w:line="276" w:lineRule="auto"/>
+        <w:ind w:left="1440"/>
+      </w:pPr>
+      <w:r>
+        <w:t>Pilihan dropdown multi-lahan aktif.</w:t>
+      </w:r>
+    </w:p>
+    <w:p>
+      <w:pPr>
+        <w:pStyle w:val="ListBullet"/>
+        <w:spacing w:before="20" w:after="40" w:line="276" w:lineRule="auto"/>
+        <w:ind w:left="1440"/>
+      </w:pPr>
+      <w:r>
+        <w:t>Modal Edit Lahan: Ubah nama petak, luas hektar, komoditas, lokasi, dan tanggal tanam.</w:t>
+      </w:r>
+    </w:p>
+    <w:p>
+      <w:pPr>
+        <w:pStyle w:val="ListBullet"/>
+        <w:spacing w:before="20" w:after="40" w:line="276" w:lineRule="auto"/>
+        <w:ind w:left="1440"/>
+      </w:pPr>
+      <w:r>
+        <w:t>Modal Hapus Lahan: Menghapus lahan permanen dengan dialog konfirmasi SweetAlert2 bertema bahaya (</w:t>
+      </w:r>
+      <w:r>
+        <w:rPr>
+          <w:i/>
+        </w:rPr>
+        <w:t>danger</w:t>
+      </w:r>
+      <w:r>
+        <w:t>) dan pembersihan cache/localStorage tuntas.</w:t>
+      </w:r>
+    </w:p>
+    <w:p>
+      <w:pPr>
+        <w:pStyle w:val="ListBullet"/>
+        <w:spacing w:before="20" w:after="40" w:line="276" w:lineRule="auto"/>
+        <w:ind w:left="1440"/>
+      </w:pPr>
+      <w:r>
+        <w:t>Modal Set Fase Lapangan (Fast-Track): Memfasilitasi petani konvensional yang baru bergabung namun proses di lapangan sudah berjalan (langsung melompat ke Fase 2 Tanam, Fase 3 Pemupukan, Fase 4 Proteksi, atau Fase 5 Panen; sistem otomatis menyesuaikan estimasi tanggal tanam dan menandai fase sebelumnya SELESAI).</w:t>
+      </w:r>
+    </w:p>
+    <w:p>
+      <w:pPr>
+        <w:pStyle w:val="ListBullet"/>
+        <w:spacing w:before="20" w:after="40" w:line="276" w:lineRule="auto"/>
+        <w:ind w:left="1080"/>
+      </w:pPr>
+      <w:r>
+        <w:rPr>
+          <w:b/>
+        </w:rPr>
+        <w:t>Neraca Kendali Modal &amp; Siklus Budidaya:</w:t>
+      </w:r>
+    </w:p>
+    <w:p>
+      <w:pPr>
+        <w:pStyle w:val="ListBullet"/>
+        <w:spacing w:before="20" w:after="40" w:line="276" w:lineRule="auto"/>
+        <w:ind w:left="1440"/>
+      </w:pPr>
+      <w:r>
+        <w:t>Menampilkan 3 kartu metrik: Plafon Anggaran RAB AI, Total Modal Terpakai (dari riwayat transaksi), dan Sisa Modal Tersedia.</w:t>
+      </w:r>
+    </w:p>
+    <w:p>
+      <w:pPr>
+        <w:pStyle w:val="ListBullet"/>
+        <w:spacing w:before="20" w:after="40" w:line="276" w:lineRule="auto"/>
+        <w:ind w:left="1440"/>
+      </w:pPr>
+      <w:r>
+        <w:t>Progress Bar persentase serapan modal dan indikator status arus kas (Aman / Waspada / Kritis).</w:t>
+      </w:r>
+    </w:p>
+    <w:p>
+      <w:pPr>
+        <w:pStyle w:val="ListBullet"/>
+        <w:spacing w:before="20" w:after="40" w:line="276" w:lineRule="auto"/>
+        <w:ind w:left="1080"/>
+      </w:pPr>
+      <w:r>
+        <w:rPr>
+          <w:b/>
+        </w:rPr>
+        <w:t>Dual Control (Fase &amp; Arus Kas):</w:t>
+      </w:r>
+    </w:p>
+    <w:p>
+      <w:pPr>
+        <w:pStyle w:val="ListBullet"/>
+        <w:spacing w:before="20" w:after="40" w:line="276" w:lineRule="auto"/>
+        <w:ind w:left="1440"/>
+      </w:pPr>
+      <w:r>
+        <w:t>Tab Fase: 5 tahapan budidaya interaktif dengan fitur checklist pengerjaan kegiatan (</w:t>
+      </w:r>
+      <w:r>
+        <w:rPr>
+          <w:i/>
+        </w:rPr>
+        <w:t>tasks</w:t>
+      </w:r>
+      <w:r>
+        <w:t>), tips agronomi cerdas, status fase (SELESAI, SEDANG_BERJALAN, BELUM), tombol expand/collapse kartu, dan tautan kontak mitra WhatsApp terintegrasi per fase.</w:t>
+      </w:r>
+    </w:p>
+    <w:p>
+      <w:pPr>
+        <w:pStyle w:val="ListBullet"/>
+        <w:spacing w:before="20" w:after="40" w:line="276" w:lineRule="auto"/>
+        <w:ind w:left="1440"/>
+      </w:pPr>
+      <w:r>
+        <w:t>Tab Arus Kas: Buku kas pencatatan pengeluaran modal riil usahatani per petak sawah.</w:t>
+      </w:r>
+    </w:p>
+    <w:p>
+      <w:pPr>
+        <w:pStyle w:val="ListBullet"/>
+        <w:spacing w:before="20" w:after="40" w:line="276" w:lineRule="auto"/>
+        <w:ind w:left="1080"/>
+      </w:pPr>
+      <w:r>
+        <w:rPr>
+          <w:b/>
+        </w:rPr>
+        <w:t>Kemitraan Usahatani:</w:t>
+      </w:r>
+      <w:r>
+        <w:t xml:space="preserve"> Kolaborator penggarap lahan dengan persentase bagi hasil, status undangan (ACTIVE / PENDING), dan notifikasi penerimaan/penolakan kolaborasi.</w:t>
+      </w:r>
+    </w:p>
+    <w:p>
+      <w:pPr>
+        <w:keepNext/>
+        <w:spacing w:before="200" w:after="60"/>
+      </w:pPr>
+      <w:r>
+        <w:rPr>
+          <w:rFonts w:ascii="Calibri" w:hAnsi="Calibri"/>
+          <w:b/>
+          <w:color w:val="2E7D32"/>
+          <w:sz w:val="25"/>
+        </w:rPr>
+        <w:t>FR-03: Dokter Tani AI — Gemini Multimodal Vision &amp; Chatbot Konsultasi (`/dokter`)</w:t>
+      </w:r>
+    </w:p>
+    <w:p>
+      <w:pPr>
+        <w:pStyle w:val="ListBullet"/>
+        <w:spacing w:before="20" w:after="40" w:line="276" w:lineRule="auto"/>
+      </w:pPr>
+      <w:r>
+        <w:rPr>
+          <w:b/>
+        </w:rPr>
+        <w:t>Deskripsi:</w:t>
+      </w:r>
+      <w:r>
+        <w:t xml:space="preserve"> Pusat diagnosis visual fitopatologi tanaman padi dan asisten tanya-jawab agronomi cerdas.</w:t>
+      </w:r>
+    </w:p>
+    <w:p>
+      <w:pPr>
+        <w:pStyle w:val="ListBullet"/>
+        <w:spacing w:before="20" w:after="40" w:line="276" w:lineRule="auto"/>
+      </w:pPr>
+      <w:r>
+        <w:rPr>
+          <w:b/>
+        </w:rPr>
+        <w:t>Fitur Utama:</w:t>
+      </w:r>
+    </w:p>
+    <w:p>
+      <w:pPr>
+        <w:pStyle w:val="ListBullet"/>
+        <w:spacing w:before="20" w:after="40" w:line="276" w:lineRule="auto"/>
+        <w:ind w:left="720"/>
+      </w:pPr>
+      <w:r>
+        <w:rPr>
+          <w:b/>
+        </w:rPr>
+        <w:t>Lab Diagnosa Daun (Computer Vision):</w:t>
+      </w:r>
+    </w:p>
+    <w:p>
+      <w:pPr>
+        <w:pStyle w:val="ListBullet"/>
+        <w:spacing w:before="20" w:after="40" w:line="276" w:lineRule="auto"/>
+        <w:ind w:left="1080"/>
+      </w:pPr>
+      <w:r>
+        <w:t>Unggah citra daun padi via kamera smartphone / galeri file atau pilih sampel foto daun siap uji.</w:t>
+      </w:r>
+    </w:p>
+    <w:p>
+      <w:pPr>
+        <w:pStyle w:val="ListBullet"/>
+        <w:spacing w:before="20" w:after="40" w:line="276" w:lineRule="auto"/>
+        <w:ind w:left="1080"/>
+      </w:pPr>
+      <w:r>
+        <w:t>Inferensi multimodal resmi Google Gemini API (</w:t>
+      </w:r>
+      <w:r>
+        <w:rPr>
+          <w:rFonts w:ascii="Consolas" w:hAnsi="Consolas"/>
+          <w:color w:val="C7254E"/>
+          <w:sz w:val="19"/>
+        </w:rPr>
+        <w:t>@google/genai</w:t>
+      </w:r>
+      <w:r>
+        <w:t xml:space="preserve"> model </w:t>
+      </w:r>
+      <w:r>
+        <w:rPr>
+          <w:rFonts w:ascii="Consolas" w:hAnsi="Consolas"/>
+          <w:color w:val="C7254E"/>
+          <w:sz w:val="19"/>
+        </w:rPr>
+        <w:t>gemini-flash-latest</w:t>
+      </w:r>
+      <w:r>
+        <w:t>).</w:t>
+      </w:r>
+    </w:p>
+    <w:p>
+      <w:pPr>
+        <w:pStyle w:val="ListBullet"/>
+        <w:spacing w:before="20" w:after="40" w:line="276" w:lineRule="auto"/>
+        <w:ind w:left="1080"/>
+      </w:pPr>
+      <w:r>
+        <w:t xml:space="preserve">Klasifikasi 4 kondisi tanaman: </w:t>
+      </w:r>
+      <w:r>
+        <w:rPr>
+          <w:i/>
+        </w:rPr>
+        <w:t>Hawar Daun Bakteri (Kresek / Xanthomonas oryzae)</w:t>
+      </w:r>
+      <w:r>
+        <w:t xml:space="preserve">, </w:t>
+      </w:r>
+      <w:r>
+        <w:rPr>
+          <w:i/>
+        </w:rPr>
+        <w:t>Blas Daun (Pyricularia oryzae)</w:t>
+      </w:r>
+      <w:r>
+        <w:t xml:space="preserve">, </w:t>
+      </w:r>
+      <w:r>
+        <w:rPr>
+          <w:i/>
+        </w:rPr>
+        <w:t>Bercak Coklat (Helminthosporium oryzae)</w:t>
+      </w:r>
+      <w:r>
+        <w:t xml:space="preserve">, dan </w:t>
+      </w:r>
+      <w:r>
+        <w:rPr>
+          <w:i/>
+        </w:rPr>
+        <w:t>Daun Padi Sehat</w:t>
+      </w:r>
+      <w:r>
+        <w:t>.</w:t>
+      </w:r>
+    </w:p>
+    <w:p>
+      <w:pPr>
+        <w:pStyle w:val="ListBullet"/>
+        <w:spacing w:before="20" w:after="40" w:line="276" w:lineRule="auto"/>
+        <w:ind w:left="1080"/>
+      </w:pPr>
+      <w:r>
+        <w:t>Output terstruktur: Nama penyakit lokal &amp; ilmiah, skor keyakinan (</w:t>
+      </w:r>
+      <w:r>
+        <w:rPr>
+          <w:i/>
+        </w:rPr>
+        <w:t>confidence score</w:t>
+      </w:r>
+      <w:r>
+        <w:t xml:space="preserve"> 0.0 - 1.0), tingkat keparahan (</w:t>
+      </w:r>
+      <w:r>
+        <w:rPr>
+          <w:i/>
+        </w:rPr>
+        <w:t>Aman/Sedang/Tinggi</w:t>
+      </w:r>
+      <w:r>
+        <w:t>), gejala klinis visual, dan langkah penanganan agronomi nyata (rekomendasi bakterisida tembaga, fungisida, dan tata kelola air).</w:t>
+      </w:r>
+    </w:p>
+    <w:p>
+      <w:pPr>
+        <w:pStyle w:val="ListBullet"/>
+        <w:spacing w:before="20" w:after="40" w:line="276" w:lineRule="auto"/>
+        <w:ind w:left="1080"/>
+      </w:pPr>
+      <w:r>
+        <w:rPr>
+          <w:i/>
+        </w:rPr>
+        <w:t>Graceful Offline Fallback</w:t>
+      </w:r>
+      <w:r>
+        <w:t>: Otomatis beralih ke basis pengetahuan lokal Kementan &amp; IRRI jika perangkat offline atau API key belum terpasang.</w:t>
+      </w:r>
+    </w:p>
+    <w:p>
+      <w:pPr>
+        <w:pStyle w:val="ListBullet"/>
+        <w:spacing w:before="20" w:after="40" w:line="276" w:lineRule="auto"/>
+        <w:ind w:left="720"/>
+      </w:pPr>
+      <w:r>
+        <w:rPr>
+          <w:b/>
+        </w:rPr>
+        <w:t>Agri AI Chatbot (Konsultasi Interaktif):</w:t>
+      </w:r>
+    </w:p>
+    <w:p>
+      <w:pPr>
+        <w:pStyle w:val="ListBullet"/>
+        <w:spacing w:before="20" w:after="40" w:line="276" w:lineRule="auto"/>
+        <w:ind w:left="1080"/>
+      </w:pPr>
+      <w:r>
+        <w:t>Antarmuka chat interaktif untuk konsultasi agronomi, dosis pupuk, pengendalian wereng, dll.</w:t>
+      </w:r>
+    </w:p>
+    <w:p>
+      <w:pPr>
+        <w:pStyle w:val="ListBullet"/>
+        <w:spacing w:before="20" w:after="40" w:line="276" w:lineRule="auto"/>
+        <w:ind w:left="1080"/>
+      </w:pPr>
+      <w:r>
+        <w:t>Manajemen riwayat percakapan (</w:t>
+      </w:r>
+      <w:r>
+        <w:rPr>
+          <w:rFonts w:ascii="Consolas" w:hAnsi="Consolas"/>
+          <w:color w:val="C7254E"/>
+          <w:sz w:val="19"/>
+        </w:rPr>
+        <w:t>ai_chat_sessions</w:t>
+      </w:r>
+      <w:r>
+        <w:t xml:space="preserve">) dan tombol </w:t>
+      </w:r>
+      <w:r>
+        <w:rPr>
+          <w:i/>
+        </w:rPr>
+        <w:t>Obrolan Baru</w:t>
+      </w:r>
+      <w:r>
+        <w:t>.</w:t>
+      </w:r>
+    </w:p>
+    <w:p>
+      <w:pPr>
+        <w:pStyle w:val="ListBullet"/>
+        <w:spacing w:before="20" w:after="40" w:line="276" w:lineRule="auto"/>
+        <w:ind w:left="1080"/>
+      </w:pPr>
+      <w:r>
+        <w:t>Dua contoh pertanyaan populer ringkas dalam 1 baris di layar awal.</w:t>
+      </w:r>
+    </w:p>
+    <w:p>
+      <w:pPr>
+        <w:pStyle w:val="ListBullet"/>
+        <w:spacing w:before="20" w:after="40" w:line="276" w:lineRule="auto"/>
+        <w:ind w:left="1080"/>
+      </w:pPr>
+      <w:r>
+        <w:rPr>
+          <w:b/>
+        </w:rPr>
+        <w:t>Panduan Cepat Pasang Gemini API Key:</w:t>
+      </w:r>
+      <w:r>
+        <w:t xml:space="preserve"> Panduan 3 langkah visual (Buka AI Studio $\rightarrow$ Create Key $\rightarrow$ Pasang di Sini) dengan tombol aksi langsung yang didesain ringkas </w:t>
+      </w:r>
+      <w:r>
+        <w:rPr>
+          <w:i/>
+        </w:rPr>
+        <w:t>above the fold</w:t>
+      </w:r>
+      <w:r>
+        <w:t xml:space="preserve"> (langsung terlihat utuh tanpa tersembunyi scroll/overflow).</w:t>
+      </w:r>
+    </w:p>
+    <w:p>
+      <w:pPr>
+        <w:keepNext/>
+        <w:spacing w:before="200" w:after="60"/>
+      </w:pPr>
+      <w:r>
+        <w:rPr>
+          <w:rFonts w:ascii="Calibri" w:hAnsi="Calibri"/>
+          <w:b/>
+          <w:color w:val="2E7D32"/>
+          <w:sz w:val="25"/>
+        </w:rPr>
+        <w:t>FR-04: Buku Tani — Gudang Saprotan &amp; Lumbung Panen (`/buku-tani`)</w:t>
+      </w:r>
+    </w:p>
+    <w:p>
+      <w:pPr>
+        <w:pStyle w:val="ListBullet"/>
+        <w:spacing w:before="20" w:after="40" w:line="276" w:lineRule="auto"/>
+      </w:pPr>
+      <w:r>
+        <w:rPr>
+          <w:b/>
+        </w:rPr>
+        <w:t>Deskripsi:</w:t>
+      </w:r>
+      <w:r>
+        <w:t xml:space="preserve"> Pengelolaan logistik persediaan sarana produksi dan catatan hasil panen mandiri dengan isolasi data ketat per akun.</w:t>
+      </w:r>
+    </w:p>
+    <w:p>
+      <w:pPr>
+        <w:pStyle w:val="ListBullet"/>
+        <w:spacing w:before="20" w:after="40" w:line="276" w:lineRule="auto"/>
+      </w:pPr>
+      <w:r>
+        <w:rPr>
+          <w:b/>
+        </w:rPr>
+        <w:t>Fitur Utama:</w:t>
+      </w:r>
+    </w:p>
+    <w:p>
+      <w:pPr>
+        <w:pStyle w:val="ListBullet"/>
+        <w:spacing w:before="20" w:after="40" w:line="276" w:lineRule="auto"/>
+        <w:ind w:left="720"/>
+      </w:pPr>
+      <w:r>
+        <w:rPr>
+          <w:b/>
+        </w:rPr>
+        <w:t>Isolasi Data Ketat Per Akun:</w:t>
+      </w:r>
+      <w:r>
+        <w:t xml:space="preserve"> Setiap akun pengguna (Pak Joko, Mas Bambang, atau pengguna kustom) hanya dapat melihat dan mengelola inventaris dan hasil panen miliknya sendiri. Tidak ada kebocoran data antar-akun.</w:t>
+      </w:r>
+    </w:p>
+    <w:p>
+      <w:pPr>
+        <w:pStyle w:val="ListBullet"/>
+        <w:spacing w:before="20" w:after="40" w:line="276" w:lineRule="auto"/>
+        <w:ind w:left="720"/>
+      </w:pPr>
+      <w:r>
+        <w:rPr>
+          <w:b/>
+        </w:rPr>
+        <w:t>Gudang Saprotan:</w:t>
+      </w:r>
+    </w:p>
+    <w:p>
+      <w:pPr>
+        <w:pStyle w:val="ListBullet"/>
+        <w:spacing w:before="20" w:after="40" w:line="276" w:lineRule="auto"/>
+        <w:ind w:left="1080"/>
+      </w:pPr>
+      <w:r>
+        <w:t>Pencatatan stok pupuk, benih, dan obat dengan tombol penyesuaian cepat (+ / - 1 unit).</w:t>
+      </w:r>
+    </w:p>
+    <w:p>
+      <w:pPr>
+        <w:pStyle w:val="ListBullet"/>
+        <w:spacing w:before="20" w:after="40" w:line="276" w:lineRule="auto"/>
+        <w:ind w:left="1080"/>
       </w:pPr>
       <w:r>
         <w:t>Indikator peringatan stok menipis (</w:t>
@@ -1368,16 +1978,38 @@
       <w:pPr>
         <w:pStyle w:val="ListBullet"/>
         <w:spacing w:before="20" w:after="40" w:line="276" w:lineRule="auto"/>
-        <w:ind w:left="720"/>
+        <w:ind w:left="1080"/>
       </w:pPr>
+      <w:r>
+        <w:t>Formulir tambah item saprotan baru.</w:t>
+      </w:r>
+    </w:p>
+    <w:p>
+      <w:pPr>
+        <w:pStyle w:val="ListBullet"/>
+        <w:spacing w:before="20" w:after="40" w:line="276" w:lineRule="auto"/>
+        <w:ind w:left="1080"/>
+      </w:pPr>
+      <w:r>
+        <w:t xml:space="preserve">Fitur </w:t>
+      </w:r>
       <w:r>
         <w:rPr>
           <w:b/>
         </w:rPr>
-        <w:t>Lumbung Panen</w:t>
+        <w:t>Pesan Restock via WhatsApp</w:t>
       </w:r>
       <w:r>
-        <w:t>: Pencatatan tonase hasil panen gabah (GKP/GKG), tanggal panen, lokasi petak asal, dan total akumulasi komoditas tersimpan.</w:t>
+        <w:t xml:space="preserve"> ke toko mitra resmi (Ibu Ratna/KPL resmi Sukamaju): Menyusun teks pesanan otomatis ke WhatsApp dan menandai stiker status pesanan berjalan, serta tombol </w:t>
+      </w:r>
+      <w:r>
+        <w:rPr>
+          <w:i/>
+        </w:rPr>
+        <w:t>Konfirmasi Barang Sampai</w:t>
+      </w:r>
+      <w:r>
+        <w:t xml:space="preserve"> yang otomatis menambahkan kuantitas ke stok gudang.</w:t>
       </w:r>
     </w:p>
     <w:p>
@@ -1387,7 +2019,50 @@
         <w:ind w:left="720"/>
       </w:pPr>
       <w:r>
-        <w:t>Pantauan tren harga pasar komoditas daerah terkini (GKP, GKG, Beras Medium IR-64, Jagung Pipil) untuk membantu petani menentukan waktu jual terbaik.</w:t>
+        <w:rPr>
+          <w:b/>
+        </w:rPr>
+        <w:t>Lumbung Hasil Panen:</w:t>
+      </w:r>
+    </w:p>
+    <w:p>
+      <w:pPr>
+        <w:pStyle w:val="ListBullet"/>
+        <w:spacing w:before="20" w:after="40" w:line="276" w:lineRule="auto"/>
+        <w:ind w:left="1080"/>
+      </w:pPr>
+      <w:r>
+        <w:t>Ringkasan akumulasi total tonase gabah tersimpan di lumbung (dalam satuan Ton dan Kg).</w:t>
+      </w:r>
+    </w:p>
+    <w:p>
+      <w:pPr>
+        <w:pStyle w:val="ListBullet"/>
+        <w:spacing w:before="20" w:after="40" w:line="276" w:lineRule="auto"/>
+        <w:ind w:left="1080"/>
+      </w:pPr>
+      <w:r>
+        <w:t>Catatan panen sawah: komoditas, total berat kg, tanggal panen, status (TERSIMPAN / TERJUAL_SEBAGIAN / TERJUAL_SEMUA), dan catatan lokasi penyimpanan.</w:t>
+      </w:r>
+    </w:p>
+    <w:p>
+      <w:pPr>
+        <w:pStyle w:val="ListBullet"/>
+        <w:spacing w:before="20" w:after="40" w:line="276" w:lineRule="auto"/>
+        <w:ind w:left="1080"/>
+      </w:pPr>
+      <w:r>
+        <w:t>Formulir pencatatan panen baru.</w:t>
+      </w:r>
+    </w:p>
+    <w:p>
+      <w:pPr>
+        <w:pStyle w:val="ListBullet"/>
+        <w:spacing w:before="20" w:after="40" w:line="276" w:lineRule="auto"/>
+        <w:ind w:left="1080"/>
+      </w:pPr>
+      <w:r>
+        <w:t>Pantauan tren harga pasar komoditas daerah harian (Gabah Kering Panen GKP, Gabah Kering Giling GKG, Beras Medium IR-64, Jagung Pipil) untuk membantu petani menentukan waktu jual terbaik.</w:t>
       </w:r>
     </w:p>
     <w:p>
@@ -1402,7 +2077,7 @@
           <w:color w:val="2E7D32"/>
           <w:sz w:val="25"/>
         </w:rPr>
-        <w:t>FR-05: Direktori Layanan &amp; Kemitraan Ekosistem (WhatsApp Direct)</w:t>
+        <w:t>FR-05: Direktori Layanan &amp; Ekosistem Usahatani (`/layanan`)</w:t>
       </w:r>
     </w:p>
     <w:p>
@@ -1417,7 +2092,7 @@
         <w:t>Deskripsi:</w:t>
       </w:r>
       <w:r>
-        <w:t xml:space="preserve"> Direktori kontak penyedia jasa mekanisasi pertanian dan saprotan desa.</w:t>
+        <w:t xml:space="preserve"> Direktori kontak penyedia jasa mekanisasi pertanian, tenaga kerja, dan saprotan desa.</w:t>
       </w:r>
     </w:p>
     <w:p>
@@ -1468,7 +2143,7 @@
         <w:t>"Hubungi via WhatsApp"</w:t>
       </w:r>
       <w:r>
-        <w:t xml:space="preserve"> pada setiap kartu layanan yang secara otomatis membuka aplikasi WhatsApp dengan pesan terformat rapi (nama pemesan, jenis layanan, dan pertanyaan ketersediaan jadwal/stok).</w:t>
+        <w:t xml:space="preserve"> pada setiap kartu layanan yang membuka aplikasi WhatsApp dengan pesan terformat rapi.</w:t>
       </w:r>
     </w:p>
     <w:p>
@@ -1478,7 +2153,100 @@
         <w:ind w:left="720"/>
       </w:pPr>
       <w:r>
-        <w:t>Formulir mandiri bagi pengguna yang ingin mendaftarkan jasa usahataninya ke dalam direktori.</w:t>
+        <w:t>Formulir mandiri bagi pengguna untuk mendaftarkan jasa usahataninya ke dalam direktori.</w:t>
+      </w:r>
+    </w:p>
+    <w:p>
+      <w:pPr>
+        <w:keepNext/>
+        <w:spacing w:before="200" w:after="60"/>
+      </w:pPr>
+      <w:r>
+        <w:rPr>
+          <w:rFonts w:ascii="Calibri" w:hAnsi="Calibri"/>
+          <w:b/>
+          <w:color w:val="2E7D32"/>
+          <w:sz w:val="25"/>
+        </w:rPr>
+        <w:t>FR-06: Manajemen Akun &amp; Personalisasi (`/profil` &amp; `/login`)</w:t>
+      </w:r>
+    </w:p>
+    <w:p>
+      <w:pPr>
+        <w:pStyle w:val="ListBullet"/>
+        <w:spacing w:before="20" w:after="40" w:line="276" w:lineRule="auto"/>
+      </w:pPr>
+      <w:r>
+        <w:rPr>
+          <w:b/>
+        </w:rPr>
+        <w:t>Deskripsi:</w:t>
+      </w:r>
+      <w:r>
+        <w:t xml:space="preserve"> Pengelolaan identitas pengguna, keamanan akun, dan preferensi AI.</w:t>
+      </w:r>
+    </w:p>
+    <w:p>
+      <w:pPr>
+        <w:pStyle w:val="ListBullet"/>
+        <w:spacing w:before="20" w:after="40" w:line="276" w:lineRule="auto"/>
+      </w:pPr>
+      <w:r>
+        <w:rPr>
+          <w:b/>
+        </w:rPr>
+        <w:t>Fitur Utama:</w:t>
+      </w:r>
+    </w:p>
+    <w:p>
+      <w:pPr>
+        <w:pStyle w:val="ListBullet"/>
+        <w:spacing w:before="20" w:after="40" w:line="276" w:lineRule="auto"/>
+        <w:ind w:left="720"/>
+      </w:pPr>
+      <w:r>
+        <w:t>Masuk cepat berbasis 6 Persona Usahatani atau login menggunakan Nomor Telepon/WhatsApp &amp; PIN.</w:t>
+      </w:r>
+    </w:p>
+    <w:p>
+      <w:pPr>
+        <w:pStyle w:val="ListBullet"/>
+        <w:spacing w:before="20" w:after="40" w:line="276" w:lineRule="auto"/>
+        <w:ind w:left="720"/>
+      </w:pPr>
+      <w:r>
+        <w:t>Pendaftaran akun baru dengan username unik (</w:t>
+      </w:r>
+      <w:r>
+        <w:rPr>
+          <w:rFonts w:ascii="Consolas" w:hAnsi="Consolas"/>
+          <w:color w:val="C7254E"/>
+          <w:sz w:val="19"/>
+        </w:rPr>
+        <w:t>@username</w:t>
+      </w:r>
+      <w:r>
+        <w:t>), validasi ketersediaan, nomor telepon, peran, dan PIN.</w:t>
+      </w:r>
+    </w:p>
+    <w:p>
+      <w:pPr>
+        <w:pStyle w:val="ListBullet"/>
+        <w:spacing w:before="20" w:after="40" w:line="276" w:lineRule="auto"/>
+        <w:ind w:left="720"/>
+      </w:pPr>
+      <w:r>
+        <w:t>Personalisasi avatar kustom (unggah foto/kamera) dan perubahan username unik.</w:t>
+      </w:r>
+    </w:p>
+    <w:p>
+      <w:pPr>
+        <w:pStyle w:val="ListBullet"/>
+        <w:spacing w:before="20" w:after="40" w:line="276" w:lineRule="auto"/>
+        <w:ind w:left="720"/>
+      </w:pPr>
+      <w:r>
+        <w:t>Pengaturan Google Gemini API Key pribadi (BYOK) per akun pengguna.</w:t>
       </w:r>
     </w:p>
     <w:p>
@@ -1507,13 +2275,8 @@
         </w:rPr>
         <w:t>NFR-01: Kinerja &amp; Waktu Respon:</w:t>
       </w:r>
-    </w:p>
-    <w:p>
-      <w:pPr>
-        <w:spacing w:before="20" w:after="80" w:line="276" w:lineRule="auto"/>
-      </w:pPr>
       <w:r>
-        <w:t>Waktu muat awal halaman di bawah 2 detik. Inferensi diagnosa daun AI via Google Gemini API selesai dalam waktu kurang dari 3 detik pada koneksi internet standar.</w:t>
+        <w:t xml:space="preserve"> Waktu muat awal halaman di bawah 2 detik. Inferensi diagnosa daun AI via Google Gemini API selesai dalam waktu kurang dari 3 detik pada koneksi internet standar.</w:t>
       </w:r>
     </w:p>
     <w:p>
@@ -1542,17 +2305,7 @@
         <w:t>):</w:t>
       </w:r>
       <w:r>
-        <w:rPr>
-          <w:i/>
-        </w:rPr>
-      </w:r>
-    </w:p>
-    <w:p>
-      <w:pPr>
-        <w:spacing w:before="20" w:after="80" w:line="276" w:lineRule="auto"/>
-      </w:pPr>
-      <w:r>
-        <w:t>Sistem AI dilengkapi mesin fallback lokal berbasis aturan fitopatologi Kementan/IRRI sehingga sistem tetap dapat mendemonstrasikan diagnosa daun meskipun koneksi internet terputus di ruang sidang.</w:t>
+        <w:t>* Sistem AI dilengkapi mesin fallback lokal berbasis aturan fitopatologi Kementan/IRRI sehingga sistem tetap dapat mendemonstrasikan diagnosa daun meskipun koneksi internet terputus di ruang sidang.</w:t>
       </w:r>
     </w:p>
     <w:p>
@@ -1564,33 +2317,59 @@
         <w:rPr>
           <w:b/>
         </w:rPr>
-        <w:t>NFR-03: Kompatibilitas Antarmuka:</w:t>
+        <w:t>NFR-03: Desain UI/UX &amp; Kompatibilitas Antarmuka:</w:t>
       </w:r>
-    </w:p>
-    <w:p>
-      <w:pPr>
-        <w:spacing w:before="20" w:after="80" w:line="276" w:lineRule="auto"/>
-      </w:pPr>
       <w:r>
-        <w:t>Aplikasi 100% responsif pada layar laptop/desktop (resolusi 1366x768 s/d 1920x1080) dengan navigasi bilah samping (</w:t>
+        <w:t xml:space="preserve"> Antarmuka responsif 100% pada semua ukuran layar (Mobile, Tablet, Desktop). Semua dialog konfirmasi menggunakan modal interaktif modern (SweetAlert2) untuk menghindari popup native browser yang kaku. Konten panduan cepat dirancang ergonomis </w:t>
       </w:r>
       <w:r>
         <w:rPr>
           <w:i/>
         </w:rPr>
-        <w:t>Sidebar</w:t>
+        <w:t>above the fold</w:t>
       </w:r>
       <w:r>
-        <w:t>), serta ramah sentuhan pada layar ponsel pintar dengan navigasi bawah (</w:t>
+        <w:t xml:space="preserve"> tanpa terpotong overflow.</w:t>
+      </w:r>
+    </w:p>
+    <w:p>
+      <w:pPr>
+        <w:pStyle w:val="ListBullet"/>
+        <w:spacing w:before="20" w:after="40" w:line="276" w:lineRule="auto"/>
+      </w:pPr>
+      <w:r>
+        <w:rPr>
+          <w:i/>
+        </w:rPr>
       </w:r>
       <w:r>
         <w:rPr>
           <w:i/>
         </w:rPr>
-        <w:t>Bottom Navigation</w:t>
+        <w:t>NFR-04: Keamanan &amp; Isolasi Data (</w:t>
       </w:r>
       <w:r>
-        <w:t>).</w:t>
+        <w:t>Data Privacy</w:t>
+      </w:r>
+      <w:r>
+        <w:rPr>
+          <w:i/>
+        </w:rPr>
+        <w:t>):</w:t>
+      </w:r>
+      <w:r>
+        <w:t>* Basis data inventaris dan lumbung panen diisolasi ketat berdasarkan ID akun terautentikasi (</w:t>
+      </w:r>
+      <w:r>
+        <w:rPr>
+          <w:rFonts w:ascii="Consolas" w:hAnsi="Consolas"/>
+          <w:color w:val="C7254E"/>
+          <w:sz w:val="19"/>
+        </w:rPr>
+        <w:t>user_id</w:t>
+      </w:r>
+      <w:r>
+        <w:t>). Tidak ada kebocoran data silang antar-pengguna. Kunci API Gemini disimpan secara privat per akun pengguna.</w:t>
       </w:r>
     </w:p>
     <w:p>
@@ -1602,26 +2381,10 @@
         <w:rPr>
           <w:b/>
         </w:rPr>
-        <w:t>NFR-04: Portabilitas Data:</w:t>
-      </w:r>
-    </w:p>
-    <w:p>
-      <w:pPr>
-        <w:spacing w:before="20" w:after="80" w:line="276" w:lineRule="auto"/>
-      </w:pPr>
-      <w:r>
-        <w:t>Penyimpanan data lokal berbasis JSON (</w:t>
+        <w:t>NFR-05: Portabilitas &amp; Ketahanan Data (Dual Persistence):</w:t>
       </w:r>
       <w:r>
-        <w:rPr>
-          <w:rFonts w:ascii="Consolas" w:hAnsi="Consolas"/>
-          <w:color w:val="C7254E"/>
-          <w:sz w:val="19"/>
-        </w:rPr>
-        <w:t>local_db.json</w:t>
-      </w:r>
-      <w:r>
-        <w:t>) memungkinkan aplikasi dijalankan secara portabel tanpa memerlukan instalasi RDBMS server terpisah.</w:t>
+        <w:t xml:space="preserve"> Mendukung persistensi ganda (PostgreSQL untuk deployment production di cloud dan JSON Engine lokal untuk pengujian luring/sidang).</w:t>
       </w:r>
     </w:p>
     <w:p>
@@ -1834,7 +2597,7 @@
               <w:rPr>
                 <w:sz w:val="19"/>
               </w:rPr>
-              <w:t>Autentikasi</w:t>
+              <w:t>Autentikasi &amp; Multi-Persona</w:t>
             </w:r>
           </w:p>
         </w:tc>
@@ -1863,7 +2626,7 @@
               <w:rPr>
                 <w:sz w:val="19"/>
               </w:rPr>
-              <w:t>Login dengan nomor telepon petani</w:t>
+              <w:t>Login dengan Persona Mas Bambang atau Akun Baru</w:t>
             </w:r>
           </w:p>
         </w:tc>
@@ -1892,7 +2655,7 @@
               <w:rPr>
                 <w:sz w:val="19"/>
               </w:rPr>
-              <w:t>Dashboard monitoring sawah terbuka langsung</w:t>
+              <w:t>Profil berganti sesuai peran, avatar dan username terisolasi</w:t>
             </w:r>
           </w:p>
         </w:tc>
@@ -1953,7 +2716,7 @@
               <w:rPr>
                 <w:sz w:val="19"/>
               </w:rPr>
-              <w:t>Cuaca &amp; Irigasi</w:t>
+              <w:t>Cuaca &amp; Irigasi GPS</w:t>
             </w:r>
           </w:p>
         </w:tc>
@@ -1982,7 +2745,7 @@
               <w:rPr>
                 <w:sz w:val="19"/>
               </w:rPr>
-              <w:t>Deteksi GPS lokasi sawah</w:t>
+              <w:t>Deteksi GPS lokasi sawah di Beranda</w:t>
             </w:r>
           </w:p>
         </w:tc>
@@ -2011,7 +2774,7 @@
               <w:rPr>
                 <w:sz w:val="19"/>
               </w:rPr>
-              <w:t>Data suhu, kelembaban, dan rekomendasi irigasi terupdate</w:t>
+              <w:t>Data suhu, kelembaban, dan rekomendasi irigasi terupdate otomatis</w:t>
             </w:r>
           </w:p>
         </w:tc>
@@ -2130,7 +2893,7 @@
               <w:rPr>
                 <w:sz w:val="19"/>
               </w:rPr>
-              <w:t>RAB 12 item, jadwal 5 fase HST, dan kalkulasi laba/ROI tampil presisi</w:t>
+              <w:t>RAB 12 item, linimasa 5 fase HST, dan proyeksi ROI tampil presisi</w:t>
             </w:r>
           </w:p>
         </w:tc>
@@ -2163,6 +2926,244 @@
                 <w:sz w:val="19"/>
               </w:rPr>
               <w:t>TC-04</w:t>
+            </w:r>
+          </w:p>
+        </w:tc>
+        <w:tc>
+          <w:tcPr>
+            <w:tcW w:type="dxa" w:w="2340"/>
+            <w:tcMar>
+              <w:top w:w="90" w:type="dxa"/>
+              <w:bottom w:w="90" w:type="dxa"/>
+              <w:left w:w="120" w:type="dxa"/>
+              <w:right w:w="120" w:type="dxa"/>
+            </w:tcMar>
+            <w:tcBorders>
+              <w:top w:val="single" w:sz="4" w:space="0" w:color="CBD5E1"/>
+              <w:left w:val="single" w:sz="4" w:space="0" w:color="CBD5E1"/>
+              <w:bottom w:val="single" w:sz="4" w:space="0" w:color="CBD5E1"/>
+              <w:right w:val="single" w:sz="4" w:space="0" w:color="CBD5E1"/>
+            </w:tcBorders>
+            <w:shd w:fill="FFFFFF"/>
+          </w:tcPr>
+          <w:p>
+            <w:pPr>
+              <w:spacing w:before="40" w:after="40" w:line="264" w:lineRule="auto"/>
+            </w:pPr>
+            <w:r>
+              <w:rPr>
+                <w:sz w:val="19"/>
+              </w:rPr>
+              <w:t>Aturan 0 Lahan &amp; Hapus Lahan</w:t>
+            </w:r>
+          </w:p>
+        </w:tc>
+        <w:tc>
+          <w:tcPr>
+            <w:tcW w:type="dxa" w:w="2340"/>
+            <w:tcMar>
+              <w:top w:w="90" w:type="dxa"/>
+              <w:bottom w:w="90" w:type="dxa"/>
+              <w:left w:w="120" w:type="dxa"/>
+              <w:right w:w="120" w:type="dxa"/>
+            </w:tcMar>
+            <w:tcBorders>
+              <w:top w:val="single" w:sz="4" w:space="0" w:color="CBD5E1"/>
+              <w:left w:val="single" w:sz="4" w:space="0" w:color="CBD5E1"/>
+              <w:bottom w:val="single" w:sz="4" w:space="0" w:color="CBD5E1"/>
+              <w:right w:val="single" w:sz="4" w:space="0" w:color="CBD5E1"/>
+            </w:tcBorders>
+            <w:shd w:fill="FFFFFF"/>
+          </w:tcPr>
+          <w:p>
+            <w:pPr>
+              <w:spacing w:before="40" w:after="40" w:line="264" w:lineRule="auto"/>
+            </w:pPr>
+            <w:r>
+              <w:rPr>
+                <w:sz w:val="19"/>
+              </w:rPr>
+              <w:t>Buka akun baru tanpa lahan atau hapus lahan aktif satu-satunya</w:t>
+            </w:r>
+          </w:p>
+        </w:tc>
+        <w:tc>
+          <w:tcPr>
+            <w:tcW w:type="dxa" w:w="2340"/>
+            <w:tcMar>
+              <w:top w:w="90" w:type="dxa"/>
+              <w:bottom w:w="90" w:type="dxa"/>
+              <w:left w:w="120" w:type="dxa"/>
+              <w:right w:w="120" w:type="dxa"/>
+            </w:tcMar>
+            <w:tcBorders>
+              <w:top w:val="single" w:sz="4" w:space="0" w:color="CBD5E1"/>
+              <w:left w:val="single" w:sz="4" w:space="0" w:color="CBD5E1"/>
+              <w:bottom w:val="single" w:sz="4" w:space="0" w:color="CBD5E1"/>
+              <w:right w:val="single" w:sz="4" w:space="0" w:color="CBD5E1"/>
+            </w:tcBorders>
+            <w:shd w:fill="FFFFFF"/>
+          </w:tcPr>
+          <w:p>
+            <w:pPr>
+              <w:spacing w:before="40" w:after="40" w:line="264" w:lineRule="auto"/>
+            </w:pPr>
+            <w:r>
+              <w:rPr>
+                <w:sz w:val="19"/>
+              </w:rPr>
+              <w:t>Menampilkan Empty State ("Kamu belum membuat lahan") tanpa membuat lahan otomatis</w:t>
+            </w:r>
+          </w:p>
+        </w:tc>
+      </w:tr>
+      <w:tr>
+        <w:tc>
+          <w:tcPr>
+            <w:tcW w:type="dxa" w:w="2340"/>
+            <w:tcMar>
+              <w:top w:w="90" w:type="dxa"/>
+              <w:bottom w:w="90" w:type="dxa"/>
+              <w:left w:w="120" w:type="dxa"/>
+              <w:right w:w="120" w:type="dxa"/>
+            </w:tcMar>
+            <w:tcBorders>
+              <w:top w:val="single" w:sz="4" w:space="0" w:color="CBD5E1"/>
+              <w:left w:val="single" w:sz="4" w:space="0" w:color="CBD5E1"/>
+              <w:bottom w:val="single" w:sz="4" w:space="0" w:color="CBD5E1"/>
+              <w:right w:val="single" w:sz="4" w:space="0" w:color="CBD5E1"/>
+            </w:tcBorders>
+            <w:shd w:fill="F8FAFC"/>
+          </w:tcPr>
+          <w:p>
+            <w:pPr>
+              <w:spacing w:before="40" w:after="40" w:line="264" w:lineRule="auto"/>
+            </w:pPr>
+            <w:r>
+              <w:rPr>
+                <w:b/>
+                <w:sz w:val="19"/>
+              </w:rPr>
+              <w:t>TC-05</w:t>
+            </w:r>
+          </w:p>
+        </w:tc>
+        <w:tc>
+          <w:tcPr>
+            <w:tcW w:type="dxa" w:w="2340"/>
+            <w:tcMar>
+              <w:top w:w="90" w:type="dxa"/>
+              <w:bottom w:w="90" w:type="dxa"/>
+              <w:left w:w="120" w:type="dxa"/>
+              <w:right w:w="120" w:type="dxa"/>
+            </w:tcMar>
+            <w:tcBorders>
+              <w:top w:val="single" w:sz="4" w:space="0" w:color="CBD5E1"/>
+              <w:left w:val="single" w:sz="4" w:space="0" w:color="CBD5E1"/>
+              <w:bottom w:val="single" w:sz="4" w:space="0" w:color="CBD5E1"/>
+              <w:right w:val="single" w:sz="4" w:space="0" w:color="CBD5E1"/>
+            </w:tcBorders>
+            <w:shd w:fill="F8FAFC"/>
+          </w:tcPr>
+          <w:p>
+            <w:pPr>
+              <w:spacing w:before="40" w:after="40" w:line="264" w:lineRule="auto"/>
+            </w:pPr>
+            <w:r>
+              <w:rPr>
+                <w:sz w:val="19"/>
+              </w:rPr>
+              <w:t>Set Fase Lapangan (Fast-Track)</w:t>
+            </w:r>
+          </w:p>
+        </w:tc>
+        <w:tc>
+          <w:tcPr>
+            <w:tcW w:type="dxa" w:w="2340"/>
+            <w:tcMar>
+              <w:top w:w="90" w:type="dxa"/>
+              <w:bottom w:w="90" w:type="dxa"/>
+              <w:left w:w="120" w:type="dxa"/>
+              <w:right w:w="120" w:type="dxa"/>
+            </w:tcMar>
+            <w:tcBorders>
+              <w:top w:val="single" w:sz="4" w:space="0" w:color="CBD5E1"/>
+              <w:left w:val="single" w:sz="4" w:space="0" w:color="CBD5E1"/>
+              <w:bottom w:val="single" w:sz="4" w:space="0" w:color="CBD5E1"/>
+              <w:right w:val="single" w:sz="4" w:space="0" w:color="CBD5E1"/>
+            </w:tcBorders>
+            <w:shd w:fill="F8FAFC"/>
+          </w:tcPr>
+          <w:p>
+            <w:pPr>
+              <w:spacing w:before="40" w:after="40" w:line="264" w:lineRule="auto"/>
+            </w:pPr>
+            <w:r>
+              <w:rPr>
+                <w:sz w:val="19"/>
+              </w:rPr>
+              <w:t>Pilih Fase 3 (Pemupukan) pada lahan konvensional</w:t>
+            </w:r>
+          </w:p>
+        </w:tc>
+        <w:tc>
+          <w:tcPr>
+            <w:tcW w:type="dxa" w:w="2340"/>
+            <w:tcMar>
+              <w:top w:w="90" w:type="dxa"/>
+              <w:bottom w:w="90" w:type="dxa"/>
+              <w:left w:w="120" w:type="dxa"/>
+              <w:right w:w="120" w:type="dxa"/>
+            </w:tcMar>
+            <w:tcBorders>
+              <w:top w:val="single" w:sz="4" w:space="0" w:color="CBD5E1"/>
+              <w:left w:val="single" w:sz="4" w:space="0" w:color="CBD5E1"/>
+              <w:bottom w:val="single" w:sz="4" w:space="0" w:color="CBD5E1"/>
+              <w:right w:val="single" w:sz="4" w:space="0" w:color="CBD5E1"/>
+            </w:tcBorders>
+            <w:shd w:fill="F8FAFC"/>
+          </w:tcPr>
+          <w:p>
+            <w:pPr>
+              <w:spacing w:before="40" w:after="40" w:line="264" w:lineRule="auto"/>
+            </w:pPr>
+            <w:r>
+              <w:rPr>
+                <w:sz w:val="19"/>
+              </w:rPr>
+              <w:t>Lahan langsung melompat ke Fase 3, fase 1 &amp; 2 berstatus SELESAI</w:t>
+            </w:r>
+          </w:p>
+        </w:tc>
+      </w:tr>
+      <w:tr>
+        <w:tc>
+          <w:tcPr>
+            <w:tcW w:type="dxa" w:w="2340"/>
+            <w:tcMar>
+              <w:top w:w="90" w:type="dxa"/>
+              <w:bottom w:w="90" w:type="dxa"/>
+              <w:left w:w="120" w:type="dxa"/>
+              <w:right w:w="120" w:type="dxa"/>
+            </w:tcMar>
+            <w:tcBorders>
+              <w:top w:val="single" w:sz="4" w:space="0" w:color="CBD5E1"/>
+              <w:left w:val="single" w:sz="4" w:space="0" w:color="CBD5E1"/>
+              <w:bottom w:val="single" w:sz="4" w:space="0" w:color="CBD5E1"/>
+              <w:right w:val="single" w:sz="4" w:space="0" w:color="CBD5E1"/>
+            </w:tcBorders>
+            <w:shd w:fill="FFFFFF"/>
+          </w:tcPr>
+          <w:p>
+            <w:pPr>
+              <w:spacing w:before="40" w:after="40" w:line="264" w:lineRule="auto"/>
+            </w:pPr>
+            <w:r>
+              <w:rPr>
+                <w:b/>
+                <w:sz w:val="19"/>
+              </w:rPr>
+              <w:t>TC-06</w:t>
             </w:r>
           </w:p>
         </w:tc>
@@ -2249,252 +3250,7 @@
               <w:rPr>
                 <w:sz w:val="19"/>
               </w:rPr>
-              <w:t>Google Gemini API mengembalikan diagnosa Hawar Daun Bakteri beserta rekomendasi bakterisida tembaga</w:t>
-            </w:r>
-          </w:p>
-        </w:tc>
-      </w:tr>
-      <w:tr>
-        <w:tc>
-          <w:tcPr>
-            <w:tcW w:type="dxa" w:w="2340"/>
-            <w:tcMar>
-              <w:top w:w="90" w:type="dxa"/>
-              <w:bottom w:w="90" w:type="dxa"/>
-              <w:left w:w="120" w:type="dxa"/>
-              <w:right w:w="120" w:type="dxa"/>
-            </w:tcMar>
-            <w:tcBorders>
-              <w:top w:val="single" w:sz="4" w:space="0" w:color="CBD5E1"/>
-              <w:left w:val="single" w:sz="4" w:space="0" w:color="CBD5E1"/>
-              <w:bottom w:val="single" w:sz="4" w:space="0" w:color="CBD5E1"/>
-              <w:right w:val="single" w:sz="4" w:space="0" w:color="CBD5E1"/>
-            </w:tcBorders>
-            <w:shd w:fill="F8FAFC"/>
-          </w:tcPr>
-          <w:p>
-            <w:pPr>
-              <w:spacing w:before="40" w:after="40" w:line="264" w:lineRule="auto"/>
-            </w:pPr>
-            <w:r>
-              <w:rPr>
-                <w:b/>
-                <w:sz w:val="19"/>
-              </w:rPr>
-              <w:t>TC-05</w:t>
-            </w:r>
-          </w:p>
-        </w:tc>
-        <w:tc>
-          <w:tcPr>
-            <w:tcW w:type="dxa" w:w="2340"/>
-            <w:tcMar>
-              <w:top w:w="90" w:type="dxa"/>
-              <w:bottom w:w="90" w:type="dxa"/>
-              <w:left w:w="120" w:type="dxa"/>
-              <w:right w:w="120" w:type="dxa"/>
-            </w:tcMar>
-            <w:tcBorders>
-              <w:top w:val="single" w:sz="4" w:space="0" w:color="CBD5E1"/>
-              <w:left w:val="single" w:sz="4" w:space="0" w:color="CBD5E1"/>
-              <w:bottom w:val="single" w:sz="4" w:space="0" w:color="CBD5E1"/>
-              <w:right w:val="single" w:sz="4" w:space="0" w:color="CBD5E1"/>
-            </w:tcBorders>
-            <w:shd w:fill="F8FAFC"/>
-          </w:tcPr>
-          <w:p>
-            <w:pPr>
-              <w:spacing w:before="40" w:after="40" w:line="264" w:lineRule="auto"/>
-            </w:pPr>
-            <w:r>
-              <w:rPr>
-                <w:sz w:val="19"/>
-              </w:rPr>
-              <w:t>Fallback Dokter Tani</w:t>
-            </w:r>
-          </w:p>
-        </w:tc>
-        <w:tc>
-          <w:tcPr>
-            <w:tcW w:type="dxa" w:w="2340"/>
-            <w:tcMar>
-              <w:top w:w="90" w:type="dxa"/>
-              <w:bottom w:w="90" w:type="dxa"/>
-              <w:left w:w="120" w:type="dxa"/>
-              <w:right w:w="120" w:type="dxa"/>
-            </w:tcMar>
-            <w:tcBorders>
-              <w:top w:val="single" w:sz="4" w:space="0" w:color="CBD5E1"/>
-              <w:left w:val="single" w:sz="4" w:space="0" w:color="CBD5E1"/>
-              <w:bottom w:val="single" w:sz="4" w:space="0" w:color="CBD5E1"/>
-              <w:right w:val="single" w:sz="4" w:space="0" w:color="CBD5E1"/>
-            </w:tcBorders>
-            <w:shd w:fill="F8FAFC"/>
-          </w:tcPr>
-          <w:p>
-            <w:pPr>
-              <w:spacing w:before="40" w:after="40" w:line="264" w:lineRule="auto"/>
-            </w:pPr>
-            <w:r>
-              <w:rPr>
-                <w:sz w:val="19"/>
-              </w:rPr>
-              <w:t>Matikan koneksi internet &amp; pilih sampel daun</w:t>
-            </w:r>
-          </w:p>
-        </w:tc>
-        <w:tc>
-          <w:tcPr>
-            <w:tcW w:type="dxa" w:w="2340"/>
-            <w:tcMar>
-              <w:top w:w="90" w:type="dxa"/>
-              <w:bottom w:w="90" w:type="dxa"/>
-              <w:left w:w="120" w:type="dxa"/>
-              <w:right w:w="120" w:type="dxa"/>
-            </w:tcMar>
-            <w:tcBorders>
-              <w:top w:val="single" w:sz="4" w:space="0" w:color="CBD5E1"/>
-              <w:left w:val="single" w:sz="4" w:space="0" w:color="CBD5E1"/>
-              <w:bottom w:val="single" w:sz="4" w:space="0" w:color="CBD5E1"/>
-              <w:right w:val="single" w:sz="4" w:space="0" w:color="CBD5E1"/>
-            </w:tcBorders>
-            <w:shd w:fill="F8FAFC"/>
-          </w:tcPr>
-          <w:p>
-            <w:pPr>
-              <w:spacing w:before="40" w:after="40" w:line="264" w:lineRule="auto"/>
-            </w:pPr>
-            <w:r>
-              <w:rPr>
-                <w:sz w:val="19"/>
-              </w:rPr>
-              <w:t xml:space="preserve">Sistem lokal menampilkan diagnosa akurat tanpa menimbulkan </w:t>
-            </w:r>
-            <w:r>
-              <w:rPr>
-                <w:i/>
-                <w:sz w:val="19"/>
-              </w:rPr>
-              <w:t>crash</w:t>
-            </w:r>
-          </w:p>
-        </w:tc>
-      </w:tr>
-      <w:tr>
-        <w:tc>
-          <w:tcPr>
-            <w:tcW w:type="dxa" w:w="2340"/>
-            <w:tcMar>
-              <w:top w:w="90" w:type="dxa"/>
-              <w:bottom w:w="90" w:type="dxa"/>
-              <w:left w:w="120" w:type="dxa"/>
-              <w:right w:w="120" w:type="dxa"/>
-            </w:tcMar>
-            <w:tcBorders>
-              <w:top w:val="single" w:sz="4" w:space="0" w:color="CBD5E1"/>
-              <w:left w:val="single" w:sz="4" w:space="0" w:color="CBD5E1"/>
-              <w:bottom w:val="single" w:sz="4" w:space="0" w:color="CBD5E1"/>
-              <w:right w:val="single" w:sz="4" w:space="0" w:color="CBD5E1"/>
-            </w:tcBorders>
-            <w:shd w:fill="FFFFFF"/>
-          </w:tcPr>
-          <w:p>
-            <w:pPr>
-              <w:spacing w:before="40" w:after="40" w:line="264" w:lineRule="auto"/>
-            </w:pPr>
-            <w:r>
-              <w:rPr>
-                <w:b/>
-                <w:sz w:val="19"/>
-              </w:rPr>
-              <w:t>TC-06</w:t>
-            </w:r>
-          </w:p>
-        </w:tc>
-        <w:tc>
-          <w:tcPr>
-            <w:tcW w:type="dxa" w:w="2340"/>
-            <w:tcMar>
-              <w:top w:w="90" w:type="dxa"/>
-              <w:bottom w:w="90" w:type="dxa"/>
-              <w:left w:w="120" w:type="dxa"/>
-              <w:right w:w="120" w:type="dxa"/>
-            </w:tcMar>
-            <w:tcBorders>
-              <w:top w:val="single" w:sz="4" w:space="0" w:color="CBD5E1"/>
-              <w:left w:val="single" w:sz="4" w:space="0" w:color="CBD5E1"/>
-              <w:bottom w:val="single" w:sz="4" w:space="0" w:color="CBD5E1"/>
-              <w:right w:val="single" w:sz="4" w:space="0" w:color="CBD5E1"/>
-            </w:tcBorders>
-            <w:shd w:fill="FFFFFF"/>
-          </w:tcPr>
-          <w:p>
-            <w:pPr>
-              <w:spacing w:before="40" w:after="40" w:line="264" w:lineRule="auto"/>
-            </w:pPr>
-            <w:r>
-              <w:rPr>
-                <w:sz w:val="19"/>
-              </w:rPr>
-              <w:t>Buku Tani</w:t>
-            </w:r>
-          </w:p>
-        </w:tc>
-        <w:tc>
-          <w:tcPr>
-            <w:tcW w:type="dxa" w:w="2340"/>
-            <w:tcMar>
-              <w:top w:w="90" w:type="dxa"/>
-              <w:bottom w:w="90" w:type="dxa"/>
-              <w:left w:w="120" w:type="dxa"/>
-              <w:right w:w="120" w:type="dxa"/>
-            </w:tcMar>
-            <w:tcBorders>
-              <w:top w:val="single" w:sz="4" w:space="0" w:color="CBD5E1"/>
-              <w:left w:val="single" w:sz="4" w:space="0" w:color="CBD5E1"/>
-              <w:bottom w:val="single" w:sz="4" w:space="0" w:color="CBD5E1"/>
-              <w:right w:val="single" w:sz="4" w:space="0" w:color="CBD5E1"/>
-            </w:tcBorders>
-            <w:shd w:fill="FFFFFF"/>
-          </w:tcPr>
-          <w:p>
-            <w:pPr>
-              <w:spacing w:before="40" w:after="40" w:line="264" w:lineRule="auto"/>
-            </w:pPr>
-            <w:r>
-              <w:rPr>
-                <w:sz w:val="19"/>
-              </w:rPr>
-              <w:t>Atur stok pupuk dengan tombol (-) hingga di bawah batas</w:t>
-            </w:r>
-          </w:p>
-        </w:tc>
-        <w:tc>
-          <w:tcPr>
-            <w:tcW w:type="dxa" w:w="2340"/>
-            <w:tcMar>
-              <w:top w:w="90" w:type="dxa"/>
-              <w:bottom w:w="90" w:type="dxa"/>
-              <w:left w:w="120" w:type="dxa"/>
-              <w:right w:w="120" w:type="dxa"/>
-            </w:tcMar>
-            <w:tcBorders>
-              <w:top w:val="single" w:sz="4" w:space="0" w:color="CBD5E1"/>
-              <w:left w:val="single" w:sz="4" w:space="0" w:color="CBD5E1"/>
-              <w:bottom w:val="single" w:sz="4" w:space="0" w:color="CBD5E1"/>
-              <w:right w:val="single" w:sz="4" w:space="0" w:color="CBD5E1"/>
-            </w:tcBorders>
-            <w:shd w:fill="FFFFFF"/>
-          </w:tcPr>
-          <w:p>
-            <w:pPr>
-              <w:spacing w:before="40" w:after="40" w:line="264" w:lineRule="auto"/>
-            </w:pPr>
-            <w:r>
-              <w:rPr>
-                <w:sz w:val="19"/>
-              </w:rPr>
-              <w:t>Indikator kuning "Menipis" muncul otomatis</w:t>
+              <w:t>Google Gemini API mengembalikan diagnosa Hawar Daun Bakteri beserta rekomendasi penanganan</w:t>
             </w:r>
           </w:p>
         </w:tc>
@@ -2527,6 +3283,482 @@
                 <w:sz w:val="19"/>
               </w:rPr>
               <w:t>TC-07</w:t>
+            </w:r>
+          </w:p>
+        </w:tc>
+        <w:tc>
+          <w:tcPr>
+            <w:tcW w:type="dxa" w:w="2340"/>
+            <w:tcMar>
+              <w:top w:w="90" w:type="dxa"/>
+              <w:bottom w:w="90" w:type="dxa"/>
+              <w:left w:w="120" w:type="dxa"/>
+              <w:right w:w="120" w:type="dxa"/>
+            </w:tcMar>
+            <w:tcBorders>
+              <w:top w:val="single" w:sz="4" w:space="0" w:color="CBD5E1"/>
+              <w:left w:val="single" w:sz="4" w:space="0" w:color="CBD5E1"/>
+              <w:bottom w:val="single" w:sz="4" w:space="0" w:color="CBD5E1"/>
+              <w:right w:val="single" w:sz="4" w:space="0" w:color="CBD5E1"/>
+            </w:tcBorders>
+            <w:shd w:fill="F8FAFC"/>
+          </w:tcPr>
+          <w:p>
+            <w:pPr>
+              <w:spacing w:before="40" w:after="40" w:line="264" w:lineRule="auto"/>
+            </w:pPr>
+            <w:r>
+              <w:rPr>
+                <w:sz w:val="19"/>
+              </w:rPr>
+              <w:t>Panduan Cepat API Key</w:t>
+            </w:r>
+          </w:p>
+        </w:tc>
+        <w:tc>
+          <w:tcPr>
+            <w:tcW w:type="dxa" w:w="2340"/>
+            <w:tcMar>
+              <w:top w:w="90" w:type="dxa"/>
+              <w:bottom w:w="90" w:type="dxa"/>
+              <w:left w:w="120" w:type="dxa"/>
+              <w:right w:w="120" w:type="dxa"/>
+            </w:tcMar>
+            <w:tcBorders>
+              <w:top w:val="single" w:sz="4" w:space="0" w:color="CBD5E1"/>
+              <w:left w:val="single" w:sz="4" w:space="0" w:color="CBD5E1"/>
+              <w:bottom w:val="single" w:sz="4" w:space="0" w:color="CBD5E1"/>
+              <w:right w:val="single" w:sz="4" w:space="0" w:color="CBD5E1"/>
+            </w:tcBorders>
+            <w:shd w:fill="F8FAFC"/>
+          </w:tcPr>
+          <w:p>
+            <w:pPr>
+              <w:spacing w:before="40" w:after="40" w:line="264" w:lineRule="auto"/>
+            </w:pPr>
+            <w:r>
+              <w:rPr>
+                <w:sz w:val="19"/>
+              </w:rPr>
+              <w:t>Buka modul Dokter Tani pada layar HP</w:t>
+            </w:r>
+          </w:p>
+        </w:tc>
+        <w:tc>
+          <w:tcPr>
+            <w:tcW w:type="dxa" w:w="2340"/>
+            <w:tcMar>
+              <w:top w:w="90" w:type="dxa"/>
+              <w:bottom w:w="90" w:type="dxa"/>
+              <w:left w:w="120" w:type="dxa"/>
+              <w:right w:w="120" w:type="dxa"/>
+            </w:tcMar>
+            <w:tcBorders>
+              <w:top w:val="single" w:sz="4" w:space="0" w:color="CBD5E1"/>
+              <w:left w:val="single" w:sz="4" w:space="0" w:color="CBD5E1"/>
+              <w:bottom w:val="single" w:sz="4" w:space="0" w:color="CBD5E1"/>
+              <w:right w:val="single" w:sz="4" w:space="0" w:color="CBD5E1"/>
+            </w:tcBorders>
+            <w:shd w:fill="F8FAFC"/>
+          </w:tcPr>
+          <w:p>
+            <w:pPr>
+              <w:spacing w:before="40" w:after="40" w:line="264" w:lineRule="auto"/>
+            </w:pPr>
+            <w:r>
+              <w:rPr>
+                <w:sz w:val="19"/>
+              </w:rPr>
+              <w:t>Panduan cepat 3 langkah langsung terlihat utuh tanpa terpotong scroll</w:t>
+            </w:r>
+          </w:p>
+        </w:tc>
+      </w:tr>
+      <w:tr>
+        <w:tc>
+          <w:tcPr>
+            <w:tcW w:type="dxa" w:w="2340"/>
+            <w:tcMar>
+              <w:top w:w="90" w:type="dxa"/>
+              <w:bottom w:w="90" w:type="dxa"/>
+              <w:left w:w="120" w:type="dxa"/>
+              <w:right w:w="120" w:type="dxa"/>
+            </w:tcMar>
+            <w:tcBorders>
+              <w:top w:val="single" w:sz="4" w:space="0" w:color="CBD5E1"/>
+              <w:left w:val="single" w:sz="4" w:space="0" w:color="CBD5E1"/>
+              <w:bottom w:val="single" w:sz="4" w:space="0" w:color="CBD5E1"/>
+              <w:right w:val="single" w:sz="4" w:space="0" w:color="CBD5E1"/>
+            </w:tcBorders>
+            <w:shd w:fill="FFFFFF"/>
+          </w:tcPr>
+          <w:p>
+            <w:pPr>
+              <w:spacing w:before="40" w:after="40" w:line="264" w:lineRule="auto"/>
+            </w:pPr>
+            <w:r>
+              <w:rPr>
+                <w:b/>
+                <w:sz w:val="19"/>
+              </w:rPr>
+              <w:t>TC-08</w:t>
+            </w:r>
+          </w:p>
+        </w:tc>
+        <w:tc>
+          <w:tcPr>
+            <w:tcW w:type="dxa" w:w="2340"/>
+            <w:tcMar>
+              <w:top w:w="90" w:type="dxa"/>
+              <w:bottom w:w="90" w:type="dxa"/>
+              <w:left w:w="120" w:type="dxa"/>
+              <w:right w:w="120" w:type="dxa"/>
+            </w:tcMar>
+            <w:tcBorders>
+              <w:top w:val="single" w:sz="4" w:space="0" w:color="CBD5E1"/>
+              <w:left w:val="single" w:sz="4" w:space="0" w:color="CBD5E1"/>
+              <w:bottom w:val="single" w:sz="4" w:space="0" w:color="CBD5E1"/>
+              <w:right w:val="single" w:sz="4" w:space="0" w:color="CBD5E1"/>
+            </w:tcBorders>
+            <w:shd w:fill="FFFFFF"/>
+          </w:tcPr>
+          <w:p>
+            <w:pPr>
+              <w:spacing w:before="40" w:after="40" w:line="264" w:lineRule="auto"/>
+            </w:pPr>
+            <w:r>
+              <w:rPr>
+                <w:sz w:val="19"/>
+              </w:rPr>
+              <w:t>Isolasi Buku Tani</w:t>
+            </w:r>
+          </w:p>
+        </w:tc>
+        <w:tc>
+          <w:tcPr>
+            <w:tcW w:type="dxa" w:w="2340"/>
+            <w:tcMar>
+              <w:top w:w="90" w:type="dxa"/>
+              <w:bottom w:w="90" w:type="dxa"/>
+              <w:left w:w="120" w:type="dxa"/>
+              <w:right w:w="120" w:type="dxa"/>
+            </w:tcMar>
+            <w:tcBorders>
+              <w:top w:val="single" w:sz="4" w:space="0" w:color="CBD5E1"/>
+              <w:left w:val="single" w:sz="4" w:space="0" w:color="CBD5E1"/>
+              <w:bottom w:val="single" w:sz="4" w:space="0" w:color="CBD5E1"/>
+              <w:right w:val="single" w:sz="4" w:space="0" w:color="CBD5E1"/>
+            </w:tcBorders>
+            <w:shd w:fill="FFFFFF"/>
+          </w:tcPr>
+          <w:p>
+            <w:pPr>
+              <w:spacing w:before="40" w:after="40" w:line="264" w:lineRule="auto"/>
+            </w:pPr>
+            <w:r>
+              <w:rPr>
+                <w:sz w:val="19"/>
+              </w:rPr>
+              <w:t>Login akun Mas Bambang setelah akun Pak Joko</w:t>
+            </w:r>
+          </w:p>
+        </w:tc>
+        <w:tc>
+          <w:tcPr>
+            <w:tcW w:type="dxa" w:w="2340"/>
+            <w:tcMar>
+              <w:top w:w="90" w:type="dxa"/>
+              <w:bottom w:w="90" w:type="dxa"/>
+              <w:left w:w="120" w:type="dxa"/>
+              <w:right w:w="120" w:type="dxa"/>
+            </w:tcMar>
+            <w:tcBorders>
+              <w:top w:val="single" w:sz="4" w:space="0" w:color="CBD5E1"/>
+              <w:left w:val="single" w:sz="4" w:space="0" w:color="CBD5E1"/>
+              <w:bottom w:val="single" w:sz="4" w:space="0" w:color="CBD5E1"/>
+              <w:right w:val="single" w:sz="4" w:space="0" w:color="CBD5E1"/>
+            </w:tcBorders>
+            <w:shd w:fill="FFFFFF"/>
+          </w:tcPr>
+          <w:p>
+            <w:pPr>
+              <w:spacing w:before="40" w:after="40" w:line="264" w:lineRule="auto"/>
+            </w:pPr>
+            <w:r>
+              <w:rPr>
+                <w:sz w:val="19"/>
+              </w:rPr>
+              <w:t>Gudang Mas Bambang tampil kosong (tidak melihat stok milik Pak Joko)</w:t>
+            </w:r>
+          </w:p>
+        </w:tc>
+      </w:tr>
+      <w:tr>
+        <w:tc>
+          <w:tcPr>
+            <w:tcW w:type="dxa" w:w="2340"/>
+            <w:tcMar>
+              <w:top w:w="90" w:type="dxa"/>
+              <w:bottom w:w="90" w:type="dxa"/>
+              <w:left w:w="120" w:type="dxa"/>
+              <w:right w:w="120" w:type="dxa"/>
+            </w:tcMar>
+            <w:tcBorders>
+              <w:top w:val="single" w:sz="4" w:space="0" w:color="CBD5E1"/>
+              <w:left w:val="single" w:sz="4" w:space="0" w:color="CBD5E1"/>
+              <w:bottom w:val="single" w:sz="4" w:space="0" w:color="CBD5E1"/>
+              <w:right w:val="single" w:sz="4" w:space="0" w:color="CBD5E1"/>
+            </w:tcBorders>
+            <w:shd w:fill="F8FAFC"/>
+          </w:tcPr>
+          <w:p>
+            <w:pPr>
+              <w:spacing w:before="40" w:after="40" w:line="264" w:lineRule="auto"/>
+            </w:pPr>
+            <w:r>
+              <w:rPr>
+                <w:b/>
+                <w:sz w:val="19"/>
+              </w:rPr>
+              <w:t>TC-09</w:t>
+            </w:r>
+          </w:p>
+        </w:tc>
+        <w:tc>
+          <w:tcPr>
+            <w:tcW w:type="dxa" w:w="2340"/>
+            <w:tcMar>
+              <w:top w:w="90" w:type="dxa"/>
+              <w:bottom w:w="90" w:type="dxa"/>
+              <w:left w:w="120" w:type="dxa"/>
+              <w:right w:w="120" w:type="dxa"/>
+            </w:tcMar>
+            <w:tcBorders>
+              <w:top w:val="single" w:sz="4" w:space="0" w:color="CBD5E1"/>
+              <w:left w:val="single" w:sz="4" w:space="0" w:color="CBD5E1"/>
+              <w:bottom w:val="single" w:sz="4" w:space="0" w:color="CBD5E1"/>
+              <w:right w:val="single" w:sz="4" w:space="0" w:color="CBD5E1"/>
+            </w:tcBorders>
+            <w:shd w:fill="F8FAFC"/>
+          </w:tcPr>
+          <w:p>
+            <w:pPr>
+              <w:spacing w:before="40" w:after="40" w:line="264" w:lineRule="auto"/>
+            </w:pPr>
+            <w:r>
+              <w:rPr>
+                <w:sz w:val="19"/>
+              </w:rPr>
+              <w:t>Restock WhatsApp Saprotan</w:t>
+            </w:r>
+          </w:p>
+        </w:tc>
+        <w:tc>
+          <w:tcPr>
+            <w:tcW w:type="dxa" w:w="2340"/>
+            <w:tcMar>
+              <w:top w:w="90" w:type="dxa"/>
+              <w:bottom w:w="90" w:type="dxa"/>
+              <w:left w:w="120" w:type="dxa"/>
+              <w:right w:w="120" w:type="dxa"/>
+            </w:tcMar>
+            <w:tcBorders>
+              <w:top w:val="single" w:sz="4" w:space="0" w:color="CBD5E1"/>
+              <w:left w:val="single" w:sz="4" w:space="0" w:color="CBD5E1"/>
+              <w:bottom w:val="single" w:sz="4" w:space="0" w:color="CBD5E1"/>
+              <w:right w:val="single" w:sz="4" w:space="0" w:color="CBD5E1"/>
+            </w:tcBorders>
+            <w:shd w:fill="F8FAFC"/>
+          </w:tcPr>
+          <w:p>
+            <w:pPr>
+              <w:spacing w:before="40" w:after="40" w:line="264" w:lineRule="auto"/>
+            </w:pPr>
+            <w:r>
+              <w:rPr>
+                <w:sz w:val="19"/>
+              </w:rPr>
+              <w:t>Klik pesan restock pupuk ke Kios Ibu Ratna</w:t>
+            </w:r>
+          </w:p>
+        </w:tc>
+        <w:tc>
+          <w:tcPr>
+            <w:tcW w:type="dxa" w:w="2340"/>
+            <w:tcMar>
+              <w:top w:w="90" w:type="dxa"/>
+              <w:bottom w:w="90" w:type="dxa"/>
+              <w:left w:w="120" w:type="dxa"/>
+              <w:right w:w="120" w:type="dxa"/>
+            </w:tcMar>
+            <w:tcBorders>
+              <w:top w:val="single" w:sz="4" w:space="0" w:color="CBD5E1"/>
+              <w:left w:val="single" w:sz="4" w:space="0" w:color="CBD5E1"/>
+              <w:bottom w:val="single" w:sz="4" w:space="0" w:color="CBD5E1"/>
+              <w:right w:val="single" w:sz="4" w:space="0" w:color="CBD5E1"/>
+            </w:tcBorders>
+            <w:shd w:fill="F8FAFC"/>
+          </w:tcPr>
+          <w:p>
+            <w:pPr>
+              <w:spacing w:before="40" w:after="40" w:line="264" w:lineRule="auto"/>
+            </w:pPr>
+            <w:r>
+              <w:rPr>
+                <w:sz w:val="19"/>
+              </w:rPr>
+              <w:t>Tautan WhatsApp terbuka dengan format pesanan dan stiker aktif terpasang</w:t>
+            </w:r>
+          </w:p>
+        </w:tc>
+      </w:tr>
+      <w:tr>
+        <w:tc>
+          <w:tcPr>
+            <w:tcW w:type="dxa" w:w="2340"/>
+            <w:tcMar>
+              <w:top w:w="90" w:type="dxa"/>
+              <w:bottom w:w="90" w:type="dxa"/>
+              <w:left w:w="120" w:type="dxa"/>
+              <w:right w:w="120" w:type="dxa"/>
+            </w:tcMar>
+            <w:tcBorders>
+              <w:top w:val="single" w:sz="4" w:space="0" w:color="CBD5E1"/>
+              <w:left w:val="single" w:sz="4" w:space="0" w:color="CBD5E1"/>
+              <w:bottom w:val="single" w:sz="4" w:space="0" w:color="CBD5E1"/>
+              <w:right w:val="single" w:sz="4" w:space="0" w:color="CBD5E1"/>
+            </w:tcBorders>
+            <w:shd w:fill="FFFFFF"/>
+          </w:tcPr>
+          <w:p>
+            <w:pPr>
+              <w:spacing w:before="40" w:after="40" w:line="264" w:lineRule="auto"/>
+            </w:pPr>
+            <w:r>
+              <w:rPr>
+                <w:b/>
+                <w:sz w:val="19"/>
+              </w:rPr>
+              <w:t>TC-10</w:t>
+            </w:r>
+          </w:p>
+        </w:tc>
+        <w:tc>
+          <w:tcPr>
+            <w:tcW w:type="dxa" w:w="2340"/>
+            <w:tcMar>
+              <w:top w:w="90" w:type="dxa"/>
+              <w:bottom w:w="90" w:type="dxa"/>
+              <w:left w:w="120" w:type="dxa"/>
+              <w:right w:w="120" w:type="dxa"/>
+            </w:tcMar>
+            <w:tcBorders>
+              <w:top w:val="single" w:sz="4" w:space="0" w:color="CBD5E1"/>
+              <w:left w:val="single" w:sz="4" w:space="0" w:color="CBD5E1"/>
+              <w:bottom w:val="single" w:sz="4" w:space="0" w:color="CBD5E1"/>
+              <w:right w:val="single" w:sz="4" w:space="0" w:color="CBD5E1"/>
+            </w:tcBorders>
+            <w:shd w:fill="FFFFFF"/>
+          </w:tcPr>
+          <w:p>
+            <w:pPr>
+              <w:spacing w:before="40" w:after="40" w:line="264" w:lineRule="auto"/>
+            </w:pPr>
+            <w:r>
+              <w:rPr>
+                <w:sz w:val="19"/>
+              </w:rPr>
+              <w:t>Konfirmasi Barang Tiba</w:t>
+            </w:r>
+          </w:p>
+        </w:tc>
+        <w:tc>
+          <w:tcPr>
+            <w:tcW w:type="dxa" w:w="2340"/>
+            <w:tcMar>
+              <w:top w:w="90" w:type="dxa"/>
+              <w:bottom w:w="90" w:type="dxa"/>
+              <w:left w:w="120" w:type="dxa"/>
+              <w:right w:w="120" w:type="dxa"/>
+            </w:tcMar>
+            <w:tcBorders>
+              <w:top w:val="single" w:sz="4" w:space="0" w:color="CBD5E1"/>
+              <w:left w:val="single" w:sz="4" w:space="0" w:color="CBD5E1"/>
+              <w:bottom w:val="single" w:sz="4" w:space="0" w:color="CBD5E1"/>
+              <w:right w:val="single" w:sz="4" w:space="0" w:color="CBD5E1"/>
+            </w:tcBorders>
+            <w:shd w:fill="FFFFFF"/>
+          </w:tcPr>
+          <w:p>
+            <w:pPr>
+              <w:spacing w:before="40" w:after="40" w:line="264" w:lineRule="auto"/>
+            </w:pPr>
+            <w:r>
+              <w:rPr>
+                <w:sz w:val="19"/>
+              </w:rPr>
+              <w:t>Klik konfirmasi pesanan pupuk telah sampai</w:t>
+            </w:r>
+          </w:p>
+        </w:tc>
+        <w:tc>
+          <w:tcPr>
+            <w:tcW w:type="dxa" w:w="2340"/>
+            <w:tcMar>
+              <w:top w:w="90" w:type="dxa"/>
+              <w:bottom w:w="90" w:type="dxa"/>
+              <w:left w:w="120" w:type="dxa"/>
+              <w:right w:w="120" w:type="dxa"/>
+            </w:tcMar>
+            <w:tcBorders>
+              <w:top w:val="single" w:sz="4" w:space="0" w:color="CBD5E1"/>
+              <w:left w:val="single" w:sz="4" w:space="0" w:color="CBD5E1"/>
+              <w:bottom w:val="single" w:sz="4" w:space="0" w:color="CBD5E1"/>
+              <w:right w:val="single" w:sz="4" w:space="0" w:color="CBD5E1"/>
+            </w:tcBorders>
+            <w:shd w:fill="FFFFFF"/>
+          </w:tcPr>
+          <w:p>
+            <w:pPr>
+              <w:spacing w:before="40" w:after="40" w:line="264" w:lineRule="auto"/>
+            </w:pPr>
+            <w:r>
+              <w:rPr>
+                <w:sz w:val="19"/>
+              </w:rPr>
+              <w:t>Stok pupuk otomatis bertambah sesuai jumlah yang dipesan</w:t>
+            </w:r>
+          </w:p>
+        </w:tc>
+      </w:tr>
+      <w:tr>
+        <w:tc>
+          <w:tcPr>
+            <w:tcW w:type="dxa" w:w="2340"/>
+            <w:tcMar>
+              <w:top w:w="90" w:type="dxa"/>
+              <w:bottom w:w="90" w:type="dxa"/>
+              <w:left w:w="120" w:type="dxa"/>
+              <w:right w:w="120" w:type="dxa"/>
+            </w:tcMar>
+            <w:tcBorders>
+              <w:top w:val="single" w:sz="4" w:space="0" w:color="CBD5E1"/>
+              <w:left w:val="single" w:sz="4" w:space="0" w:color="CBD5E1"/>
+              <w:bottom w:val="single" w:sz="4" w:space="0" w:color="CBD5E1"/>
+              <w:right w:val="single" w:sz="4" w:space="0" w:color="CBD5E1"/>
+            </w:tcBorders>
+            <w:shd w:fill="F8FAFC"/>
+          </w:tcPr>
+          <w:p>
+            <w:pPr>
+              <w:spacing w:before="40" w:after="40" w:line="264" w:lineRule="auto"/>
+            </w:pPr>
+            <w:r>
+              <w:rPr>
+                <w:b/>
+                <w:sz w:val="19"/>
+              </w:rPr>
+              <w:t>TC-11</w:t>
             </w:r>
           </w:p>
         </w:tc>

</xml_diff>

<commit_message>
fix(dokter): default to fresh new chat on initial load and route navigation
</commit_message>
<xml_diff>
--- a/PRD_AgriBuddy_Capstone.docx
+++ b/PRD_AgriBuddy_Capstone.docx
@@ -433,7 +433,7 @@
         <w:spacing w:before="20" w:after="80" w:line="276" w:lineRule="auto"/>
       </w:pPr>
       <w:r>
-        <w:t xml:space="preserve">Aplikasi difokuskan murni pada keunggulan ilmiah </w:t>
+        <w:t xml:space="preserve">Aplikasi difokuskan pada keunggulan fungsional </w:t>
       </w:r>
       <w:r>
         <w:rPr>
@@ -451,7 +451,7 @@
         <w:t>Artificial Intelligence (AI)</w:t>
       </w:r>
       <w:r>
-        <w:t xml:space="preserve"> dalam membantu pengambilan keputusan budidaya padi oleh petani, menghilangkan fitur sekunder yang redundan demi menjaga ketajaman ruang lingkup penelitian dan keandalan sistem saat sidang pengujian.</w:t>
+        <w:t xml:space="preserve"> terpadu dalam membantu pengambilan keputusan agronomi dan manajemen usahatani budidaya padi secara presisi, terukur, dan berbasis data ilmiah.</w:t>
       </w:r>
     </w:p>
     <w:p>

</xml_diff>